<commit_message>
docs: aplica formato oficial universidad a la memoria (plantilla portada, APA)
Co-Authored-By: Claude Fable 5 <noreply@anthropic.com>
</commit_message>
<xml_diff>
--- a/informes/TFM_Raul_Hernando_Viadero.docx
+++ b/informes/TFM_Raul_Hernando_Viadero.docx
@@ -4,32 +4,96 @@
   <w:body>
     <w:p>
       <w:pPr>
-        <w:spacing w:after="480" w:before="0"/>
+        <w:spacing w:after="120" w:before="0"/>
+      </w:pPr>
+      <w:r>
+        <w:rPr>
+          <w:rFonts w:ascii="Calibri" w:cs="Calibri" w:eastAsia="Calibri" w:hAnsi="Calibri"/>
+          <w:color w:val="404040"/>
+          <w:sz w:val="22"/>
+          <w:szCs w:val="22"/>
+        </w:rPr>
+        <w:t xml:space="preserve"/>
+      </w:r>
+    </w:p>
+    <w:p>
+      <w:pPr>
+        <w:spacing w:after="120" w:before="0"/>
+      </w:pPr>
+      <w:r>
+        <w:rPr>
+          <w:rFonts w:ascii="Calibri" w:cs="Calibri" w:eastAsia="Calibri" w:hAnsi="Calibri"/>
+          <w:color w:val="404040"/>
+          <w:sz w:val="22"/>
+          <w:szCs w:val="22"/>
+        </w:rPr>
+        <w:t xml:space="preserve"/>
+      </w:r>
+    </w:p>
+    <w:p>
+      <w:pPr>
+        <w:spacing w:after="720" w:before="0"/>
         <w:jc w:val="center"/>
       </w:pPr>
       <w:r>
         <w:rPr>
-          <w:rFonts w:ascii="Calibri" w:cs="Calibri" w:eastAsia="Calibri" w:hAnsi="Calibri"/>
-          <w:b/>
-          <w:bCs/>
-          <w:caps/>
-          <w:color w:val="1F3864"/>
-          <w:sz w:val="24"/>
-          <w:szCs w:val="24"/>
+          <w:rFonts w:ascii="Roboto" w:cs="Roboto" w:eastAsia="Roboto" w:hAnsi="Roboto"/>
+          <w:color w:val="404040"/>
+          <w:sz w:val="36"/>
+          <w:szCs w:val="36"/>
         </w:rPr>
         <w:t xml:space="preserve">MÁSTER EN INTELIGENCIA ARTIFICIAL</w:t>
       </w:r>
     </w:p>
     <w:p>
       <w:pPr>
-        <w:pBdr>
-          <w:bottom w:val="single" w:color="1F3864" w:sz="6" w:space="1"/>
-        </w:pBdr>
-        <w:spacing w:after="960" w:before="0"/>
+        <w:spacing w:after="120" w:before="0"/>
+      </w:pPr>
+      <w:r>
+        <w:rPr>
+          <w:rFonts w:ascii="Calibri" w:cs="Calibri" w:eastAsia="Calibri" w:hAnsi="Calibri"/>
+          <w:color w:val="404040"/>
+          <w:sz w:val="22"/>
+          <w:szCs w:val="22"/>
+        </w:rPr>
+        <w:t xml:space="preserve"/>
+      </w:r>
+    </w:p>
+    <w:p>
+      <w:pPr>
+        <w:spacing w:after="120" w:before="0"/>
+      </w:pPr>
+      <w:r>
+        <w:rPr>
+          <w:rFonts w:ascii="Calibri" w:cs="Calibri" w:eastAsia="Calibri" w:hAnsi="Calibri"/>
+          <w:color w:val="404040"/>
+          <w:sz w:val="22"/>
+          <w:szCs w:val="22"/>
+        </w:rPr>
+        <w:t xml:space="preserve"/>
+      </w:r>
+    </w:p>
+    <w:p>
+      <w:pPr>
+        <w:spacing w:after="720" w:before="0"/>
         <w:jc w:val="center"/>
       </w:pPr>
       <w:r>
         <w:rPr>
+          <w:rFonts w:ascii="Roboto" w:cs="Roboto" w:eastAsia="Roboto" w:hAnsi="Roboto"/>
+          <w:color w:val="BA0C2F"/>
+          <w:sz w:val="56"/>
+          <w:szCs w:val="56"/>
+        </w:rPr>
+        <w:t xml:space="preserve">VERIFICACIÓN DOCUMENTAL DE IDENTIDAD Y SOLICITUDES DE PRÉSTAMO MEDIANTE VISIÓN ARTIFICIAL Y DEEP LEARNING</w:t>
+      </w:r>
+    </w:p>
+    <w:p>
+      <w:pPr>
+        <w:spacing w:after="120" w:before="0"/>
+      </w:pPr>
+      <w:r>
+        <w:rPr>
           <w:rFonts w:ascii="Calibri" w:cs="Calibri" w:eastAsia="Calibri" w:hAnsi="Calibri"/>
           <w:color w:val="404040"/>
           <w:sz w:val="22"/>
@@ -40,23 +104,6 @@
     </w:p>
     <w:p>
       <w:pPr>
-        <w:spacing w:after="480" w:before="0"/>
-        <w:jc w:val="center"/>
-      </w:pPr>
-      <w:r>
-        <w:rPr>
-          <w:rFonts w:ascii="Calibri" w:cs="Calibri" w:eastAsia="Calibri" w:hAnsi="Calibri"/>
-          <w:b/>
-          <w:bCs/>
-          <w:color w:val="1F3864"/>
-          <w:sz w:val="40"/>
-          <w:szCs w:val="40"/>
-        </w:rPr>
-        <w:t xml:space="preserve">Verificación Documental de Identidad y Solicitudes de Préstamo mediante Visión Artificial y Deep Learning</w:t>
-      </w:r>
-    </w:p>
-    <w:p>
-      <w:pPr>
         <w:spacing w:after="120" w:before="0"/>
       </w:pPr>
       <w:r>
@@ -71,24 +118,37 @@
     </w:p>
     <w:p>
       <w:pPr>
-        <w:spacing w:after="960" w:before="0"/>
-        <w:jc w:val="center"/>
-      </w:pPr>
-      <w:r>
-        <w:rPr>
-          <w:rFonts w:ascii="Calibri" w:cs="Calibri" w:eastAsia="Calibri" w:hAnsi="Calibri"/>
-          <w:i/>
-          <w:iCs/>
-          <w:color w:val="404040"/>
-          <w:sz w:val="28"/>
-          <w:szCs w:val="28"/>
-        </w:rPr>
-        <w:t xml:space="preserve">Trabajo Fin de Máster</w:t>
-      </w:r>
-    </w:p>
-    <w:p>
-      <w:pPr>
         <w:spacing w:after="120" w:before="0"/>
+        <w:jc w:val="both"/>
+      </w:pPr>
+      <w:r>
+        <w:rPr>
+          <w:rFonts w:ascii="Roboto Light" w:cs="Roboto Light" w:eastAsia="Roboto Light" w:hAnsi="Roboto Light"/>
+          <w:color w:val="404040"/>
+          <w:sz w:val="32"/>
+          <w:szCs w:val="32"/>
+        </w:rPr>
+        <w:t xml:space="preserve">TFM elaborado por: Raúl Hernando Viadero</w:t>
+      </w:r>
+    </w:p>
+    <w:p>
+      <w:pPr>
+        <w:spacing w:after="720" w:before="0"/>
+        <w:jc w:val="both"/>
+      </w:pPr>
+      <w:r>
+        <w:rPr>
+          <w:rFonts w:ascii="Roboto Light" w:cs="Roboto Light" w:eastAsia="Roboto Light" w:hAnsi="Roboto Light"/>
+          <w:color w:val="404040"/>
+          <w:sz w:val="32"/>
+          <w:szCs w:val="32"/>
+        </w:rPr>
+        <w:t xml:space="preserve">Tutor/a de TFM: [Nombre del tutor/a]</w:t>
+      </w:r>
+    </w:p>
+    <w:p>
+      <w:pPr>
+        <w:spacing w:after="120" w:before="0"/>
       </w:pPr>
       <w:r>
         <w:rPr>
@@ -98,98 +158,6 @@
           <w:szCs w:val="22"/>
         </w:rPr>
         <w:t xml:space="preserve"/>
-      </w:r>
-    </w:p>
-    <w:p>
-      <w:pPr>
-        <w:spacing w:after="120" w:before="0"/>
-      </w:pPr>
-      <w:r>
-        <w:rPr>
-          <w:rFonts w:ascii="Calibri" w:cs="Calibri" w:eastAsia="Calibri" w:hAnsi="Calibri"/>
-          <w:color w:val="404040"/>
-          <w:sz w:val="22"/>
-          <w:szCs w:val="22"/>
-        </w:rPr>
-        <w:t xml:space="preserve"/>
-      </w:r>
-    </w:p>
-    <w:p>
-      <w:pPr>
-        <w:spacing w:after="120" w:before="0"/>
-      </w:pPr>
-      <w:r>
-        <w:rPr>
-          <w:rFonts w:ascii="Calibri" w:cs="Calibri" w:eastAsia="Calibri" w:hAnsi="Calibri"/>
-          <w:color w:val="404040"/>
-          <w:sz w:val="22"/>
-          <w:szCs w:val="22"/>
-        </w:rPr>
-        <w:t xml:space="preserve"/>
-      </w:r>
-    </w:p>
-    <w:p>
-      <w:pPr>
-        <w:spacing w:after="200" w:before="0"/>
-        <w:jc w:val="center"/>
-      </w:pPr>
-      <w:r>
-        <w:rPr>
-          <w:rFonts w:ascii="Calibri" w:cs="Calibri" w:eastAsia="Calibri" w:hAnsi="Calibri"/>
-          <w:color w:val="666666"/>
-          <w:sz w:val="22"/>
-          <w:szCs w:val="22"/>
-        </w:rPr>
-        <w:t xml:space="preserve">TFM elaborado por:</w:t>
-      </w:r>
-    </w:p>
-    <w:p>
-      <w:pPr>
-        <w:spacing w:after="480" w:before="0"/>
-        <w:jc w:val="center"/>
-      </w:pPr>
-      <w:r>
-        <w:rPr>
-          <w:rFonts w:ascii="Calibri" w:cs="Calibri" w:eastAsia="Calibri" w:hAnsi="Calibri"/>
-          <w:b/>
-          <w:bCs/>
-          <w:color w:val="404040"/>
-          <w:sz w:val="28"/>
-          <w:szCs w:val="28"/>
-        </w:rPr>
-        <w:t xml:space="preserve">Raúl Hernando Viadero</w:t>
-      </w:r>
-    </w:p>
-    <w:p>
-      <w:pPr>
-        <w:spacing w:after="200" w:before="0"/>
-        <w:jc w:val="center"/>
-      </w:pPr>
-      <w:r>
-        <w:rPr>
-          <w:rFonts w:ascii="Calibri" w:cs="Calibri" w:eastAsia="Calibri" w:hAnsi="Calibri"/>
-          <w:color w:val="666666"/>
-          <w:sz w:val="22"/>
-          <w:szCs w:val="22"/>
-        </w:rPr>
-        <w:t xml:space="preserve">Tutor/a de TFM:</w:t>
-      </w:r>
-    </w:p>
-    <w:p>
-      <w:pPr>
-        <w:spacing w:after="960" w:before="0"/>
-        <w:jc w:val="center"/>
-      </w:pPr>
-      <w:r>
-        <w:rPr>
-          <w:rFonts w:ascii="Calibri" w:cs="Calibri" w:eastAsia="Calibri" w:hAnsi="Calibri"/>
-          <w:i/>
-          <w:iCs/>
-          <w:color w:val="999999"/>
-          <w:sz w:val="24"/>
-          <w:szCs w:val="24"/>
-        </w:rPr>
-        <w:t xml:space="preserve">[Nombre del tutor/a]</w:t>
       </w:r>
     </w:p>
     <w:p>
@@ -227,12 +195,28 @@
       </w:pPr>
       <w:r>
         <w:rPr>
-          <w:rFonts w:ascii="Calibri" w:cs="Calibri" w:eastAsia="Calibri" w:hAnsi="Calibri"/>
-          <w:color w:val="666666"/>
-          <w:sz w:val="22"/>
-          <w:szCs w:val="22"/>
-        </w:rPr>
-        <w:t xml:space="preserve">Madrid, junio de 2026</w:t>
+          <w:rFonts w:ascii="Roboto Light" w:cs="Roboto Light" w:eastAsia="Roboto Light" w:hAnsi="Roboto Light"/>
+          <w:color w:val="404040"/>
+          <w:sz w:val="32"/>
+          <w:szCs w:val="32"/>
+        </w:rPr>
+        <w:t xml:space="preserve">- Madrid, junio de 2026 -</w:t>
+      </w:r>
+    </w:p>
+    <w:p>
+      <w:r>
+        <w:br w:type="page"/>
+      </w:r>
+    </w:p>
+    <w:p>
+      <w:r>
+        <w:rPr>
+          <w:rFonts w:ascii="Calibri" w:cs="Calibri" w:eastAsia="Calibri" w:hAnsi="Calibri"/>
+          <w:color w:val="404040"/>
+          <w:sz w:val="22"/>
+          <w:szCs w:val="22"/>
+        </w:rPr>
+        <w:t xml:space="preserve"/>
       </w:r>
     </w:p>
     <w:p>
@@ -240,18 +224,12 @@
         <w:sectPr>
           <w:pgSz w:w="11906" w:h="16838" w:orient="portrait"/>
           <w:pgMar w:top="1701" w:right="1701" w:bottom="1701" w:left="1701" w:header="708" w:footer="708" w:gutter="0"/>
-          <w:pgNumType w:start="1" w:fmt="lowerRoman"/>
-          <w:titlePg/>
+          <w:pgNumType/>
           <w:docGrid w:linePitch="360"/>
         </w:sectPr>
       </w:pPr>
     </w:p>
     <w:p>
-      <w:r>
-        <w:br w:type="page"/>
-      </w:r>
-    </w:p>
-    <w:p>
       <w:pPr>
         <w:pStyle w:val="Heading1"/>
         <w:spacing w:after="180" w:before="240"/>
@@ -261,7 +239,7 @@
           <w:rFonts w:ascii="Calibri" w:cs="Calibri" w:eastAsia="Calibri" w:hAnsi="Calibri"/>
           <w:b/>
           <w:bCs/>
-          <w:color w:val="1F3864"/>
+          <w:color w:val="BA0C2F"/>
           <w:sz w:val="36"/>
           <w:szCs w:val="36"/>
         </w:rPr>
@@ -377,7 +355,7 @@
           <w:rFonts w:ascii="Calibri" w:cs="Calibri" w:eastAsia="Calibri" w:hAnsi="Calibri"/>
           <w:b/>
           <w:bCs/>
-          <w:color w:val="1F3864"/>
+          <w:color w:val="BA0C2F"/>
           <w:sz w:val="36"/>
           <w:szCs w:val="36"/>
         </w:rPr>
@@ -478,7 +456,7 @@
           <w:rFonts w:ascii="Calibri" w:cs="Calibri" w:eastAsia="Calibri" w:hAnsi="Calibri"/>
           <w:b/>
           <w:bCs/>
-          <w:color w:val="1F3864"/>
+          <w:color w:val="BA0C2F"/>
           <w:sz w:val="36"/>
           <w:szCs w:val="36"/>
         </w:rPr>
@@ -515,7 +493,7 @@
           <w:footerReference w:type="default" r:id="rId7"/>
           <w:pgSz w:w="11906" w:h="16838" w:orient="portrait"/>
           <w:pgMar w:top="1701" w:right="1701" w:bottom="1701" w:left="1701" w:header="708" w:footer="708" w:gutter="0"/>
-          <w:pgNumType w:start="2" w:fmt="lowerRoman"/>
+          <w:pgNumType w:start="3" w:fmt="lowerRoman"/>
           <w:docGrid w:linePitch="360"/>
         </w:sectPr>
       </w:pPr>
@@ -531,7 +509,7 @@
           <w:rFonts w:ascii="Calibri" w:cs="Calibri" w:eastAsia="Calibri" w:hAnsi="Calibri"/>
           <w:b/>
           <w:bCs/>
-          <w:color w:val="1F3864"/>
+          <w:color w:val="BA0C2F"/>
           <w:sz w:val="36"/>
           <w:szCs w:val="36"/>
         </w:rPr>
@@ -548,7 +526,7 @@
           <w:rFonts w:ascii="Calibri" w:cs="Calibri" w:eastAsia="Calibri" w:hAnsi="Calibri"/>
           <w:b/>
           <w:bCs/>
-          <w:color w:val="1F3864"/>
+          <w:color w:val="404040"/>
           <w:sz w:val="32"/>
           <w:szCs w:val="32"/>
         </w:rPr>
@@ -610,7 +588,7 @@
           <w:rFonts w:ascii="Calibri" w:cs="Calibri" w:eastAsia="Calibri" w:hAnsi="Calibri"/>
           <w:b/>
           <w:bCs/>
-          <w:color w:val="1F3864"/>
+          <w:color w:val="404040"/>
           <w:sz w:val="32"/>
           <w:szCs w:val="32"/>
         </w:rPr>
@@ -627,7 +605,7 @@
           <w:rFonts w:ascii="Calibri" w:cs="Calibri" w:eastAsia="Calibri" w:hAnsi="Calibri"/>
           <w:b/>
           <w:bCs/>
-          <w:color w:val="2E74B5"/>
+          <w:color w:val="404040"/>
           <w:sz w:val="28"/>
           <w:szCs w:val="28"/>
         </w:rPr>
@@ -674,7 +652,7 @@
           <w:rFonts w:ascii="Calibri" w:cs="Calibri" w:eastAsia="Calibri" w:hAnsi="Calibri"/>
           <w:b/>
           <w:bCs/>
-          <w:color w:val="2E74B5"/>
+          <w:color w:val="404040"/>
           <w:sz w:val="28"/>
           <w:szCs w:val="28"/>
         </w:rPr>
@@ -693,7 +671,7 @@
           <w:sz w:val="22"/>
           <w:szCs w:val="22"/>
         </w:rPr>
-        <w:t xml:space="preserve">El reconocimiento óptico de caracteres (OCR) transforma imágenes de texto en cadenas de caracteres procesables. Los motores OCR modernos combinan una etapa de detección de texto (localizar dónde hay texto en la imagen) con una etapa de reconocimiento (transcribir cada región detectada). EasyOCR (Jaided AI, 2020) es un motor de código abierto que utiliza la red CRAFT para la detección y una arquitectura CRNN (red convolucional + LSTM bidireccional + decodificación CTC) para el reconocimiento, con soporte para más de 80 idiomas, incluido el español.</w:t>
+        <w:t xml:space="preserve">El reconocimiento óptico de caracteres (OCR) transforma imágenes de texto en cadenas de caracteres procesables. Los motores OCR modernos combinan una etapa de detección de texto (localizar dónde hay texto en la imagen) con una etapa de reconocimiento (transcribir cada región detectada). EasyOCR (Jaided AI, 2020) es un motor de código abierto que utiliza la red CRAFT (Baek et al., 2019) para la detección y una arquitectura CRNN —red convolucional + LSTM bidireccional + decodificación CTC— (Shi et al., 2017) para el reconocimiento, con soporte para más de 80 idiomas, incluido el español.</w:t>
       </w:r>
     </w:p>
     <w:p>
@@ -721,7 +699,7 @@
           <w:rFonts w:ascii="Calibri" w:cs="Calibri" w:eastAsia="Calibri" w:hAnsi="Calibri"/>
           <w:b/>
           <w:bCs/>
-          <w:color w:val="2E74B5"/>
+          <w:color w:val="404040"/>
           <w:sz w:val="28"/>
           <w:szCs w:val="28"/>
         </w:rPr>
@@ -768,7 +746,7 @@
           <w:rFonts w:ascii="Calibri" w:cs="Calibri" w:eastAsia="Calibri" w:hAnsi="Calibri"/>
           <w:b/>
           <w:bCs/>
-          <w:color w:val="2E74B5"/>
+          <w:color w:val="404040"/>
           <w:sz w:val="28"/>
           <w:szCs w:val="28"/>
         </w:rPr>
@@ -815,7 +793,7 @@
           <w:rFonts w:ascii="Calibri" w:cs="Calibri" w:eastAsia="Calibri" w:hAnsi="Calibri"/>
           <w:b/>
           <w:bCs/>
-          <w:color w:val="1F3864"/>
+          <w:color w:val="404040"/>
           <w:sz w:val="32"/>
           <w:szCs w:val="32"/>
         </w:rPr>
@@ -938,7 +916,7 @@
           <w:rFonts w:ascii="Calibri" w:cs="Calibri" w:eastAsia="Calibri" w:hAnsi="Calibri"/>
           <w:b/>
           <w:bCs/>
-          <w:color w:val="1F3864"/>
+          <w:color w:val="404040"/>
           <w:sz w:val="32"/>
           <w:szCs w:val="32"/>
         </w:rPr>
@@ -971,7 +949,7 @@
           <w:rFonts w:ascii="Calibri" w:cs="Calibri" w:eastAsia="Calibri" w:hAnsi="Calibri"/>
           <w:b/>
           <w:bCs/>
-          <w:color w:val="1F3864"/>
+          <w:color w:val="BA0C2F"/>
           <w:sz w:val="36"/>
           <w:szCs w:val="36"/>
         </w:rPr>
@@ -988,7 +966,7 @@
           <w:rFonts w:ascii="Calibri" w:cs="Calibri" w:eastAsia="Calibri" w:hAnsi="Calibri"/>
           <w:b/>
           <w:bCs/>
-          <w:color w:val="1F3864"/>
+          <w:color w:val="404040"/>
           <w:sz w:val="32"/>
           <w:szCs w:val="32"/>
         </w:rPr>
@@ -1020,7 +998,7 @@
           <w:rFonts w:ascii="Calibri" w:cs="Calibri" w:eastAsia="Calibri" w:hAnsi="Calibri"/>
           <w:b/>
           <w:bCs/>
-          <w:color w:val="1F3864"/>
+          <w:color w:val="404040"/>
           <w:sz w:val="32"/>
           <w:szCs w:val="32"/>
         </w:rPr>
@@ -1218,7 +1196,7 @@
           <w:rFonts w:ascii="Calibri" w:cs="Calibri" w:eastAsia="Calibri" w:hAnsi="Calibri"/>
           <w:b/>
           <w:bCs/>
-          <w:color w:val="1F3864"/>
+          <w:color w:val="BA0C2F"/>
           <w:sz w:val="36"/>
           <w:szCs w:val="36"/>
         </w:rPr>
@@ -1235,7 +1213,7 @@
           <w:rFonts w:ascii="Calibri" w:cs="Calibri" w:eastAsia="Calibri" w:hAnsi="Calibri"/>
           <w:b/>
           <w:bCs/>
-          <w:color w:val="1F3864"/>
+          <w:color w:val="404040"/>
           <w:sz w:val="32"/>
           <w:szCs w:val="32"/>
         </w:rPr>
@@ -1282,7 +1260,7 @@
           <w:rFonts w:ascii="Calibri" w:cs="Calibri" w:eastAsia="Calibri" w:hAnsi="Calibri"/>
           <w:b/>
           <w:bCs/>
-          <w:color w:val="1F3864"/>
+          <w:color w:val="404040"/>
           <w:sz w:val="32"/>
           <w:szCs w:val="32"/>
         </w:rPr>
@@ -1345,7 +1323,7 @@
               <w:bottom w:val="single" w:color="CCCCCC" w:sz="1"/>
               <w:right w:val="single" w:color="CCCCCC" w:sz="1"/>
             </w:tcBorders>
-            <w:shd w:fill="1F3864" w:val="clear"/>
+            <w:shd w:fill="BA0C2F" w:val="clear"/>
             <w:tcMar>
               <w:top w:type="dxa" w:w="80"/>
               <w:left w:type="dxa" w:w="120"/>
@@ -1381,7 +1359,7 @@
               <w:bottom w:val="single" w:color="CCCCCC" w:sz="1"/>
               <w:right w:val="single" w:color="CCCCCC" w:sz="1"/>
             </w:tcBorders>
-            <w:shd w:fill="1F3864" w:val="clear"/>
+            <w:shd w:fill="BA0C2F" w:val="clear"/>
             <w:tcMar>
               <w:top w:type="dxa" w:w="80"/>
               <w:left w:type="dxa" w:w="120"/>
@@ -1417,7 +1395,7 @@
               <w:bottom w:val="single" w:color="CCCCCC" w:sz="1"/>
               <w:right w:val="single" w:color="CCCCCC" w:sz="1"/>
             </w:tcBorders>
-            <w:shd w:fill="1F3864" w:val="clear"/>
+            <w:shd w:fill="BA0C2F" w:val="clear"/>
             <w:tcMar>
               <w:top w:type="dxa" w:w="80"/>
               <w:left w:type="dxa" w:w="120"/>
@@ -2587,7 +2565,7 @@
           <w:rFonts w:ascii="Calibri" w:cs="Calibri" w:eastAsia="Calibri" w:hAnsi="Calibri"/>
           <w:b/>
           <w:bCs/>
-          <w:color w:val="1F3864"/>
+          <w:color w:val="404040"/>
           <w:sz w:val="32"/>
           <w:szCs w:val="32"/>
         </w:rPr>
@@ -2604,7 +2582,7 @@
           <w:rFonts w:ascii="Calibri" w:cs="Calibri" w:eastAsia="Calibri" w:hAnsi="Calibri"/>
           <w:b/>
           <w:bCs/>
-          <w:color w:val="2E74B5"/>
+          <w:color w:val="404040"/>
           <w:sz w:val="28"/>
           <w:szCs w:val="28"/>
         </w:rPr>
@@ -3011,7 +2989,7 @@
           <w:rFonts w:ascii="Calibri" w:cs="Calibri" w:eastAsia="Calibri" w:hAnsi="Calibri"/>
           <w:b/>
           <w:bCs/>
-          <w:color w:val="2E74B5"/>
+          <w:color w:val="404040"/>
           <w:sz w:val="28"/>
           <w:szCs w:val="28"/>
         </w:rPr>
@@ -3058,7 +3036,7 @@
           <w:rFonts w:ascii="Calibri" w:cs="Calibri" w:eastAsia="Calibri" w:hAnsi="Calibri"/>
           <w:b/>
           <w:bCs/>
-          <w:color w:val="2E74B5"/>
+          <w:color w:val="404040"/>
           <w:sz w:val="28"/>
           <w:szCs w:val="28"/>
         </w:rPr>
@@ -3105,7 +3083,7 @@
           <w:rFonts w:ascii="Calibri" w:cs="Calibri" w:eastAsia="Calibri" w:hAnsi="Calibri"/>
           <w:b/>
           <w:bCs/>
-          <w:color w:val="2E74B5"/>
+          <w:color w:val="404040"/>
           <w:sz w:val="28"/>
           <w:szCs w:val="28"/>
         </w:rPr>
@@ -3169,7 +3147,7 @@
               <w:bottom w:val="single" w:color="CCCCCC" w:sz="1"/>
               <w:right w:val="single" w:color="CCCCCC" w:sz="1"/>
             </w:tcBorders>
-            <w:shd w:fill="1F3864" w:val="clear"/>
+            <w:shd w:fill="BA0C2F" w:val="clear"/>
             <w:tcMar>
               <w:top w:type="dxa" w:w="80"/>
               <w:left w:type="dxa" w:w="120"/>
@@ -3205,7 +3183,7 @@
               <w:bottom w:val="single" w:color="CCCCCC" w:sz="1"/>
               <w:right w:val="single" w:color="CCCCCC" w:sz="1"/>
             </w:tcBorders>
-            <w:shd w:fill="1F3864" w:val="clear"/>
+            <w:shd w:fill="BA0C2F" w:val="clear"/>
             <w:tcMar>
               <w:top w:type="dxa" w:w="80"/>
               <w:left w:type="dxa" w:w="120"/>
@@ -3241,7 +3219,7 @@
               <w:bottom w:val="single" w:color="CCCCCC" w:sz="1"/>
               <w:right w:val="single" w:color="CCCCCC" w:sz="1"/>
             </w:tcBorders>
-            <w:shd w:fill="1F3864" w:val="clear"/>
+            <w:shd w:fill="BA0C2F" w:val="clear"/>
             <w:tcMar>
               <w:top w:type="dxa" w:w="80"/>
               <w:left w:type="dxa" w:w="120"/>
@@ -3277,7 +3255,7 @@
               <w:bottom w:val="single" w:color="CCCCCC" w:sz="1"/>
               <w:right w:val="single" w:color="CCCCCC" w:sz="1"/>
             </w:tcBorders>
-            <w:shd w:fill="1F3864" w:val="clear"/>
+            <w:shd w:fill="BA0C2F" w:val="clear"/>
             <w:tcMar>
               <w:top w:type="dxa" w:w="80"/>
               <w:left w:type="dxa" w:w="120"/>
@@ -3785,7 +3763,7 @@
           <w:rFonts w:ascii="Calibri" w:cs="Calibri" w:eastAsia="Calibri" w:hAnsi="Calibri"/>
           <w:b/>
           <w:bCs/>
-          <w:color w:val="1F3864"/>
+          <w:color w:val="404040"/>
           <w:sz w:val="32"/>
           <w:szCs w:val="32"/>
         </w:rPr>
@@ -3802,7 +3780,7 @@
           <w:rFonts w:ascii="Calibri" w:cs="Calibri" w:eastAsia="Calibri" w:hAnsi="Calibri"/>
           <w:b/>
           <w:bCs/>
-          <w:color w:val="2E74B5"/>
+          <w:color w:val="404040"/>
           <w:sz w:val="28"/>
           <w:szCs w:val="28"/>
         </w:rPr>
@@ -3849,7 +3827,7 @@
           <w:rFonts w:ascii="Calibri" w:cs="Calibri" w:eastAsia="Calibri" w:hAnsi="Calibri"/>
           <w:b/>
           <w:bCs/>
-          <w:color w:val="2E74B5"/>
+          <w:color w:val="404040"/>
           <w:sz w:val="28"/>
           <w:szCs w:val="28"/>
         </w:rPr>
@@ -3896,7 +3874,7 @@
           <w:rFonts w:ascii="Calibri" w:cs="Calibri" w:eastAsia="Calibri" w:hAnsi="Calibri"/>
           <w:b/>
           <w:bCs/>
-          <w:color w:val="2E74B5"/>
+          <w:color w:val="404040"/>
           <w:sz w:val="28"/>
           <w:szCs w:val="28"/>
         </w:rPr>
@@ -3960,7 +3938,7 @@
               <w:bottom w:val="single" w:color="CCCCCC" w:sz="1"/>
               <w:right w:val="single" w:color="CCCCCC" w:sz="1"/>
             </w:tcBorders>
-            <w:shd w:fill="1F3864" w:val="clear"/>
+            <w:shd w:fill="BA0C2F" w:val="clear"/>
             <w:tcMar>
               <w:top w:type="dxa" w:w="80"/>
               <w:left w:type="dxa" w:w="120"/>
@@ -3996,7 +3974,7 @@
               <w:bottom w:val="single" w:color="CCCCCC" w:sz="1"/>
               <w:right w:val="single" w:color="CCCCCC" w:sz="1"/>
             </w:tcBorders>
-            <w:shd w:fill="1F3864" w:val="clear"/>
+            <w:shd w:fill="BA0C2F" w:val="clear"/>
             <w:tcMar>
               <w:top w:type="dxa" w:w="80"/>
               <w:left w:type="dxa" w:w="120"/>
@@ -4032,7 +4010,7 @@
               <w:bottom w:val="single" w:color="CCCCCC" w:sz="1"/>
               <w:right w:val="single" w:color="CCCCCC" w:sz="1"/>
             </w:tcBorders>
-            <w:shd w:fill="1F3864" w:val="clear"/>
+            <w:shd w:fill="BA0C2F" w:val="clear"/>
             <w:tcMar>
               <w:top w:type="dxa" w:w="80"/>
               <w:left w:type="dxa" w:w="120"/>
@@ -4068,7 +4046,7 @@
               <w:bottom w:val="single" w:color="CCCCCC" w:sz="1"/>
               <w:right w:val="single" w:color="CCCCCC" w:sz="1"/>
             </w:tcBorders>
-            <w:shd w:fill="1F3864" w:val="clear"/>
+            <w:shd w:fill="BA0C2F" w:val="clear"/>
             <w:tcMar>
               <w:top w:type="dxa" w:w="80"/>
               <w:left w:type="dxa" w:w="120"/>
@@ -5029,7 +5007,7 @@
           <w:rFonts w:ascii="Calibri" w:cs="Calibri" w:eastAsia="Calibri" w:hAnsi="Calibri"/>
           <w:b/>
           <w:bCs/>
-          <w:color w:val="1F3864"/>
+          <w:color w:val="404040"/>
           <w:sz w:val="32"/>
           <w:szCs w:val="32"/>
         </w:rPr>
@@ -5225,7 +5203,7 @@
           <w:rFonts w:ascii="Calibri" w:cs="Calibri" w:eastAsia="Calibri" w:hAnsi="Calibri"/>
           <w:b/>
           <w:bCs/>
-          <w:color w:val="1F3864"/>
+          <w:color w:val="404040"/>
           <w:sz w:val="32"/>
           <w:szCs w:val="32"/>
         </w:rPr>
@@ -5406,7 +5384,7 @@
           <w:rFonts w:ascii="Calibri" w:cs="Calibri" w:eastAsia="Calibri" w:hAnsi="Calibri"/>
           <w:b/>
           <w:bCs/>
-          <w:color w:val="1F3864"/>
+          <w:color w:val="404040"/>
           <w:sz w:val="32"/>
           <w:szCs w:val="32"/>
         </w:rPr>
@@ -5799,7 +5777,7 @@
           <w:rFonts w:ascii="Calibri" w:cs="Calibri" w:eastAsia="Calibri" w:hAnsi="Calibri"/>
           <w:b/>
           <w:bCs/>
-          <w:color w:val="1F3864"/>
+          <w:color w:val="404040"/>
           <w:sz w:val="32"/>
           <w:szCs w:val="32"/>
         </w:rPr>
@@ -5832,7 +5810,7 @@
           <w:rFonts w:ascii="Calibri" w:cs="Calibri" w:eastAsia="Calibri" w:hAnsi="Calibri"/>
           <w:b/>
           <w:bCs/>
-          <w:color w:val="1F3864"/>
+          <w:color w:val="BA0C2F"/>
           <w:sz w:val="36"/>
           <w:szCs w:val="36"/>
         </w:rPr>
@@ -5849,7 +5827,7 @@
           <w:rFonts w:ascii="Calibri" w:cs="Calibri" w:eastAsia="Calibri" w:hAnsi="Calibri"/>
           <w:b/>
           <w:bCs/>
-          <w:color w:val="1F3864"/>
+          <w:color w:val="404040"/>
           <w:sz w:val="32"/>
           <w:szCs w:val="32"/>
         </w:rPr>
@@ -5881,7 +5859,7 @@
           <w:rFonts w:ascii="Calibri" w:cs="Calibri" w:eastAsia="Calibri" w:hAnsi="Calibri"/>
           <w:b/>
           <w:bCs/>
-          <w:color w:val="1F3864"/>
+          <w:color w:val="404040"/>
           <w:sz w:val="32"/>
           <w:szCs w:val="32"/>
         </w:rPr>
@@ -5913,7 +5891,7 @@
           <w:rFonts w:ascii="Calibri" w:cs="Calibri" w:eastAsia="Calibri" w:hAnsi="Calibri"/>
           <w:b/>
           <w:bCs/>
-          <w:color w:val="1F3864"/>
+          <w:color w:val="404040"/>
           <w:sz w:val="32"/>
           <w:szCs w:val="32"/>
         </w:rPr>
@@ -5978,7 +5956,7 @@
               <w:bottom w:val="single" w:color="CCCCCC" w:sz="1"/>
               <w:right w:val="single" w:color="CCCCCC" w:sz="1"/>
             </w:tcBorders>
-            <w:shd w:fill="1F3864" w:val="clear"/>
+            <w:shd w:fill="BA0C2F" w:val="clear"/>
             <w:tcMar>
               <w:top w:type="dxa" w:w="80"/>
               <w:left w:type="dxa" w:w="120"/>
@@ -6014,7 +5992,7 @@
               <w:bottom w:val="single" w:color="CCCCCC" w:sz="1"/>
               <w:right w:val="single" w:color="CCCCCC" w:sz="1"/>
             </w:tcBorders>
-            <w:shd w:fill="1F3864" w:val="clear"/>
+            <w:shd w:fill="BA0C2F" w:val="clear"/>
             <w:tcMar>
               <w:top w:type="dxa" w:w="80"/>
               <w:left w:type="dxa" w:w="120"/>
@@ -6050,7 +6028,7 @@
               <w:bottom w:val="single" w:color="CCCCCC" w:sz="1"/>
               <w:right w:val="single" w:color="CCCCCC" w:sz="1"/>
             </w:tcBorders>
-            <w:shd w:fill="1F3864" w:val="clear"/>
+            <w:shd w:fill="BA0C2F" w:val="clear"/>
             <w:tcMar>
               <w:top w:type="dxa" w:w="80"/>
               <w:left w:type="dxa" w:w="120"/>
@@ -6086,7 +6064,7 @@
               <w:bottom w:val="single" w:color="CCCCCC" w:sz="1"/>
               <w:right w:val="single" w:color="CCCCCC" w:sz="1"/>
             </w:tcBorders>
-            <w:shd w:fill="1F3864" w:val="clear"/>
+            <w:shd w:fill="BA0C2F" w:val="clear"/>
             <w:tcMar>
               <w:top w:type="dxa" w:w="80"/>
               <w:left w:type="dxa" w:w="120"/>
@@ -6122,7 +6100,7 @@
               <w:bottom w:val="single" w:color="CCCCCC" w:sz="1"/>
               <w:right w:val="single" w:color="CCCCCC" w:sz="1"/>
             </w:tcBorders>
-            <w:shd w:fill="1F3864" w:val="clear"/>
+            <w:shd w:fill="BA0C2F" w:val="clear"/>
             <w:tcMar>
               <w:top w:type="dxa" w:w="80"/>
               <w:left w:type="dxa" w:w="120"/>
@@ -6586,7 +6564,7 @@
           <w:rFonts w:ascii="Calibri" w:cs="Calibri" w:eastAsia="Calibri" w:hAnsi="Calibri"/>
           <w:b/>
           <w:bCs/>
-          <w:color w:val="1F3864"/>
+          <w:color w:val="404040"/>
           <w:sz w:val="32"/>
           <w:szCs w:val="32"/>
         </w:rPr>
@@ -6634,7 +6612,7 @@
               <w:bottom w:val="single" w:color="CCCCCC" w:sz="1"/>
               <w:right w:val="single" w:color="CCCCCC" w:sz="1"/>
             </w:tcBorders>
-            <w:shd w:fill="1F3864" w:val="clear"/>
+            <w:shd w:fill="BA0C2F" w:val="clear"/>
             <w:tcMar>
               <w:top w:type="dxa" w:w="80"/>
               <w:left w:type="dxa" w:w="120"/>
@@ -6670,7 +6648,7 @@
               <w:bottom w:val="single" w:color="CCCCCC" w:sz="1"/>
               <w:right w:val="single" w:color="CCCCCC" w:sz="1"/>
             </w:tcBorders>
-            <w:shd w:fill="1F3864" w:val="clear"/>
+            <w:shd w:fill="BA0C2F" w:val="clear"/>
             <w:tcMar>
               <w:top w:type="dxa" w:w="80"/>
               <w:left w:type="dxa" w:w="120"/>
@@ -6706,7 +6684,7 @@
               <w:bottom w:val="single" w:color="CCCCCC" w:sz="1"/>
               <w:right w:val="single" w:color="CCCCCC" w:sz="1"/>
             </w:tcBorders>
-            <w:shd w:fill="1F3864" w:val="clear"/>
+            <w:shd w:fill="BA0C2F" w:val="clear"/>
             <w:tcMar>
               <w:top w:type="dxa" w:w="80"/>
               <w:left w:type="dxa" w:w="120"/>
@@ -7356,7 +7334,7 @@
           <w:rFonts w:ascii="Calibri" w:cs="Calibri" w:eastAsia="Calibri" w:hAnsi="Calibri"/>
           <w:b/>
           <w:bCs/>
-          <w:color w:val="1F3864"/>
+          <w:color w:val="404040"/>
           <w:sz w:val="32"/>
           <w:szCs w:val="32"/>
         </w:rPr>
@@ -7419,7 +7397,7 @@
               <w:bottom w:val="single" w:color="CCCCCC" w:sz="1"/>
               <w:right w:val="single" w:color="CCCCCC" w:sz="1"/>
             </w:tcBorders>
-            <w:shd w:fill="1F3864" w:val="clear"/>
+            <w:shd w:fill="BA0C2F" w:val="clear"/>
             <w:tcMar>
               <w:top w:type="dxa" w:w="80"/>
               <w:left w:type="dxa" w:w="120"/>
@@ -7455,7 +7433,7 @@
               <w:bottom w:val="single" w:color="CCCCCC" w:sz="1"/>
               <w:right w:val="single" w:color="CCCCCC" w:sz="1"/>
             </w:tcBorders>
-            <w:shd w:fill="1F3864" w:val="clear"/>
+            <w:shd w:fill="BA0C2F" w:val="clear"/>
             <w:tcMar>
               <w:top w:type="dxa" w:w="80"/>
               <w:left w:type="dxa" w:w="120"/>
@@ -7491,7 +7469,7 @@
               <w:bottom w:val="single" w:color="CCCCCC" w:sz="1"/>
               <w:right w:val="single" w:color="CCCCCC" w:sz="1"/>
             </w:tcBorders>
-            <w:shd w:fill="1F3864" w:val="clear"/>
+            <w:shd w:fill="BA0C2F" w:val="clear"/>
             <w:tcMar>
               <w:top w:type="dxa" w:w="80"/>
               <w:left w:type="dxa" w:w="120"/>
@@ -8581,7 +8559,7 @@
           <w:rFonts w:ascii="Calibri" w:cs="Calibri" w:eastAsia="Calibri" w:hAnsi="Calibri"/>
           <w:b/>
           <w:bCs/>
-          <w:color w:val="1F3864"/>
+          <w:color w:val="404040"/>
           <w:sz w:val="32"/>
           <w:szCs w:val="32"/>
         </w:rPr>
@@ -8643,7 +8621,7 @@
               <w:bottom w:val="single" w:color="CCCCCC" w:sz="1"/>
               <w:right w:val="single" w:color="CCCCCC" w:sz="1"/>
             </w:tcBorders>
-            <w:shd w:fill="1F3864" w:val="clear"/>
+            <w:shd w:fill="BA0C2F" w:val="clear"/>
             <w:tcMar>
               <w:top w:type="dxa" w:w="80"/>
               <w:left w:type="dxa" w:w="120"/>
@@ -8679,7 +8657,7 @@
               <w:bottom w:val="single" w:color="CCCCCC" w:sz="1"/>
               <w:right w:val="single" w:color="CCCCCC" w:sz="1"/>
             </w:tcBorders>
-            <w:shd w:fill="1F3864" w:val="clear"/>
+            <w:shd w:fill="BA0C2F" w:val="clear"/>
             <w:tcMar>
               <w:top w:type="dxa" w:w="80"/>
               <w:left w:type="dxa" w:w="120"/>
@@ -9223,7 +9201,7 @@
           <w:rFonts w:ascii="Calibri" w:cs="Calibri" w:eastAsia="Calibri" w:hAnsi="Calibri"/>
           <w:b/>
           <w:bCs/>
-          <w:color w:val="1F3864"/>
+          <w:color w:val="404040"/>
           <w:sz w:val="32"/>
           <w:szCs w:val="32"/>
         </w:rPr>
@@ -9405,7 +9383,7 @@
           <w:rFonts w:ascii="Calibri" w:cs="Calibri" w:eastAsia="Calibri" w:hAnsi="Calibri"/>
           <w:b/>
           <w:bCs/>
-          <w:color w:val="1F3864"/>
+          <w:color w:val="BA0C2F"/>
           <w:sz w:val="36"/>
           <w:szCs w:val="36"/>
         </w:rPr>
@@ -9422,7 +9400,7 @@
           <w:rFonts w:ascii="Calibri" w:cs="Calibri" w:eastAsia="Calibri" w:hAnsi="Calibri"/>
           <w:b/>
           <w:bCs/>
-          <w:color w:val="1F3864"/>
+          <w:color w:val="404040"/>
           <w:sz w:val="32"/>
           <w:szCs w:val="32"/>
         </w:rPr>
@@ -9602,7 +9580,7 @@
           <w:rFonts w:ascii="Calibri" w:cs="Calibri" w:eastAsia="Calibri" w:hAnsi="Calibri"/>
           <w:b/>
           <w:bCs/>
-          <w:color w:val="1F3864"/>
+          <w:color w:val="404040"/>
           <w:sz w:val="32"/>
           <w:szCs w:val="32"/>
         </w:rPr>
@@ -9788,7 +9766,7 @@
           <w:rFonts w:ascii="Calibri" w:cs="Calibri" w:eastAsia="Calibri" w:hAnsi="Calibri"/>
           <w:b/>
           <w:bCs/>
-          <w:color w:val="1F3864"/>
+          <w:color w:val="404040"/>
           <w:sz w:val="32"/>
           <w:szCs w:val="32"/>
         </w:rPr>
@@ -9920,7 +9898,7 @@
           <w:rFonts w:ascii="Calibri" w:cs="Calibri" w:eastAsia="Calibri" w:hAnsi="Calibri"/>
           <w:b/>
           <w:bCs/>
-          <w:color w:val="1F3864"/>
+          <w:color w:val="BA0C2F"/>
           <w:sz w:val="36"/>
           <w:szCs w:val="36"/>
         </w:rPr>
@@ -9929,249 +9907,326 @@
     </w:p>
     <w:p>
       <w:pPr>
-        <w:spacing w:after="120" w:before="0" w:line="360" w:lineRule="auto"/>
-        <w:jc w:val="both"/>
-      </w:pPr>
-      <w:r>
-        <w:rPr>
-          <w:rFonts w:ascii="Calibri" w:cs="Calibri" w:eastAsia="Calibri" w:hAnsi="Calibri"/>
-          <w:color w:val="404040"/>
-          <w:sz w:val="22"/>
-          <w:szCs w:val="22"/>
-        </w:rPr>
-        <w:t xml:space="preserve">Baek, Y., Lee, B., Han, D., Yun, S., y Lee, H. (2019). Character region awareness for text detection. En Proceedings of the IEEE/CVF Conference on Computer Vision and Pattern Recognition (pp. 9365–9374). IEEE. https://doi.org/10.1109/CVPR.2019.00959</w:t>
-      </w:r>
-    </w:p>
-    <w:p>
-      <w:pPr>
-        <w:spacing w:after="120" w:before="0"/>
-      </w:pPr>
-      <w:r>
-        <w:rPr>
-          <w:rFonts w:ascii="Calibri" w:cs="Calibri" w:eastAsia="Calibri" w:hAnsi="Calibri"/>
-          <w:color w:val="404040"/>
-          <w:sz w:val="22"/>
-          <w:szCs w:val="22"/>
-        </w:rPr>
-        <w:t xml:space="preserve"/>
-      </w:r>
-    </w:p>
-    <w:p>
-      <w:pPr>
-        <w:spacing w:after="120" w:before="0" w:line="360" w:lineRule="auto"/>
-        <w:jc w:val="both"/>
-      </w:pPr>
-      <w:r>
-        <w:rPr>
-          <w:rFonts w:ascii="Calibri" w:cs="Calibri" w:eastAsia="Calibri" w:hAnsi="Calibri"/>
-          <w:color w:val="404040"/>
-          <w:sz w:val="22"/>
-          <w:szCs w:val="22"/>
-        </w:rPr>
-        <w:t xml:space="preserve">He, K., Zhang, X., Ren, S., y Sun, J. (2016). Deep residual learning for image recognition. En Proceedings of the IEEE Conference on Computer Vision and Pattern Recognition (pp. 770–778). IEEE. https://doi.org/10.1109/CVPR.2016.90</w:t>
-      </w:r>
-    </w:p>
-    <w:p>
-      <w:pPr>
-        <w:spacing w:after="120" w:before="0"/>
-      </w:pPr>
-      <w:r>
-        <w:rPr>
-          <w:rFonts w:ascii="Calibri" w:cs="Calibri" w:eastAsia="Calibri" w:hAnsi="Calibri"/>
-          <w:color w:val="404040"/>
-          <w:sz w:val="22"/>
-          <w:szCs w:val="22"/>
-        </w:rPr>
-        <w:t xml:space="preserve"/>
-      </w:r>
-    </w:p>
-    <w:p>
-      <w:pPr>
-        <w:spacing w:after="120" w:before="0" w:line="360" w:lineRule="auto"/>
-        <w:jc w:val="both"/>
-      </w:pPr>
-      <w:r>
-        <w:rPr>
-          <w:rFonts w:ascii="Calibri" w:cs="Calibri" w:eastAsia="Calibri" w:hAnsi="Calibri"/>
-          <w:color w:val="404040"/>
-          <w:sz w:val="22"/>
-          <w:szCs w:val="22"/>
-        </w:rPr>
-        <w:t xml:space="preserve">International Civil Aviation Organization. (2021). Doc 9303: Machine readable travel documents (8.ª ed.). ICAO. https://www.icao.int/publications/pages/publication.aspx?docnum=9303</w:t>
-      </w:r>
-    </w:p>
-    <w:p>
-      <w:pPr>
-        <w:spacing w:after="120" w:before="0"/>
-      </w:pPr>
-      <w:r>
-        <w:rPr>
-          <w:rFonts w:ascii="Calibri" w:cs="Calibri" w:eastAsia="Calibri" w:hAnsi="Calibri"/>
-          <w:color w:val="404040"/>
-          <w:sz w:val="22"/>
-          <w:szCs w:val="22"/>
-        </w:rPr>
-        <w:t xml:space="preserve"/>
-      </w:r>
-    </w:p>
-    <w:p>
-      <w:pPr>
-        <w:spacing w:after="120" w:before="0" w:line="360" w:lineRule="auto"/>
-        <w:jc w:val="both"/>
-      </w:pPr>
-      <w:r>
-        <w:rPr>
-          <w:rFonts w:ascii="Calibri" w:cs="Calibri" w:eastAsia="Calibri" w:hAnsi="Calibri"/>
-          <w:color w:val="404040"/>
-          <w:sz w:val="22"/>
-          <w:szCs w:val="22"/>
-        </w:rPr>
-        <w:t xml:space="preserve">Jaided AI. (2020). EasyOCR: Ready-to-use OCR with 80+ supported languages [Software]. https://github.com/JaidedAI/EasyOCR</w:t>
-      </w:r>
-    </w:p>
-    <w:p>
-      <w:pPr>
-        <w:spacing w:after="120" w:before="0"/>
-      </w:pPr>
-      <w:r>
-        <w:rPr>
-          <w:rFonts w:ascii="Calibri" w:cs="Calibri" w:eastAsia="Calibri" w:hAnsi="Calibri"/>
-          <w:color w:val="404040"/>
-          <w:sz w:val="22"/>
-          <w:szCs w:val="22"/>
-        </w:rPr>
-        <w:t xml:space="preserve"/>
-      </w:r>
-    </w:p>
-    <w:p>
-      <w:pPr>
-        <w:spacing w:after="120" w:before="0" w:line="360" w:lineRule="auto"/>
-        <w:jc w:val="both"/>
-      </w:pPr>
-      <w:r>
-        <w:rPr>
-          <w:rFonts w:ascii="Calibri" w:cs="Calibri" w:eastAsia="Calibri" w:hAnsi="Calibri"/>
-          <w:color w:val="404040"/>
-          <w:sz w:val="22"/>
-          <w:szCs w:val="22"/>
-        </w:rPr>
-        <w:t xml:space="preserve">Kaissis, G. A., Makowski, M. R., Rückert, D., y Braren, R. F. (2020). Secure, privacy-preserving and federated machine learning in medical imaging. Nature Machine Intelligence, 2(6), 305–311. https://doi.org/10.1038/s42256-020-0186-1</w:t>
-      </w:r>
-    </w:p>
-    <w:p>
-      <w:pPr>
-        <w:spacing w:after="120" w:before="0"/>
-      </w:pPr>
-      <w:r>
-        <w:rPr>
-          <w:rFonts w:ascii="Calibri" w:cs="Calibri" w:eastAsia="Calibri" w:hAnsi="Calibri"/>
-          <w:color w:val="404040"/>
-          <w:sz w:val="22"/>
-          <w:szCs w:val="22"/>
-        </w:rPr>
-        <w:t xml:space="preserve"/>
-      </w:r>
-    </w:p>
-    <w:p>
-      <w:pPr>
-        <w:spacing w:after="120" w:before="0" w:line="360" w:lineRule="auto"/>
-        <w:jc w:val="both"/>
-      </w:pPr>
-      <w:r>
-        <w:rPr>
-          <w:rFonts w:ascii="Calibri" w:cs="Calibri" w:eastAsia="Calibri" w:hAnsi="Calibri"/>
-          <w:color w:val="404040"/>
-          <w:sz w:val="22"/>
-          <w:szCs w:val="22"/>
-        </w:rPr>
-        <w:t xml:space="preserve">Redmon, J., Divvala, S., Girshick, R., y Farhadi, A. (2016). You only look once: Unified, real-time object detection. En Proceedings of the IEEE Conference on Computer Vision and Pattern Recognition (pp. 779–788). IEEE. https://doi.org/10.1109/CVPR.2016.91</w:t>
-      </w:r>
-    </w:p>
-    <w:p>
-      <w:pPr>
-        <w:spacing w:after="120" w:before="0"/>
-      </w:pPr>
-      <w:r>
-        <w:rPr>
-          <w:rFonts w:ascii="Calibri" w:cs="Calibri" w:eastAsia="Calibri" w:hAnsi="Calibri"/>
-          <w:color w:val="404040"/>
-          <w:sz w:val="22"/>
-          <w:szCs w:val="22"/>
-        </w:rPr>
-        <w:t xml:space="preserve"/>
-      </w:r>
-    </w:p>
-    <w:p>
-      <w:pPr>
-        <w:spacing w:after="120" w:before="0" w:line="360" w:lineRule="auto"/>
-        <w:jc w:val="both"/>
-      </w:pPr>
-      <w:r>
-        <w:rPr>
-          <w:rFonts w:ascii="Calibri" w:cs="Calibri" w:eastAsia="Calibri" w:hAnsi="Calibri"/>
-          <w:color w:val="404040"/>
-          <w:sz w:val="22"/>
-          <w:szCs w:val="22"/>
-        </w:rPr>
-        <w:t xml:space="preserve">Reglamento (UE) 2016/679 del Parlamento Europeo y del Consejo de 27 de abril de 2016 relativo a la protección de las personas físicas en lo que respecta al tratamiento de datos personales y a la libre circulación de estos datos (RGPD). Diario Oficial de la Unión Europea, L 119, 1–88.</w:t>
-      </w:r>
-    </w:p>
-    <w:p>
-      <w:pPr>
-        <w:spacing w:after="120" w:before="0"/>
-      </w:pPr>
-      <w:r>
-        <w:rPr>
-          <w:rFonts w:ascii="Calibri" w:cs="Calibri" w:eastAsia="Calibri" w:hAnsi="Calibri"/>
-          <w:color w:val="404040"/>
-          <w:sz w:val="22"/>
-          <w:szCs w:val="22"/>
-        </w:rPr>
-        <w:t xml:space="preserve"/>
-      </w:r>
-    </w:p>
-    <w:p>
-      <w:pPr>
-        <w:spacing w:after="120" w:before="0" w:line="360" w:lineRule="auto"/>
-        <w:jc w:val="both"/>
-      </w:pPr>
-      <w:r>
-        <w:rPr>
-          <w:rFonts w:ascii="Calibri" w:cs="Calibri" w:eastAsia="Calibri" w:hAnsi="Calibri"/>
-          <w:color w:val="404040"/>
-          <w:sz w:val="22"/>
-          <w:szCs w:val="22"/>
-        </w:rPr>
-        <w:t xml:space="preserve">Shi, B., Bai, X., y Yao, C. (2017). An end-to-end trainable neural network for image-based sequence recognition and its application to scene text recognition. IEEE Transactions on Pattern Analysis and Machine Intelligence, 39(11), 2298–2304. https://doi.org/10.1109/TPAMI.2016.2646371</w:t>
-      </w:r>
-    </w:p>
-    <w:p>
-      <w:pPr>
-        <w:spacing w:after="120" w:before="0"/>
-      </w:pPr>
-      <w:r>
-        <w:rPr>
-          <w:rFonts w:ascii="Calibri" w:cs="Calibri" w:eastAsia="Calibri" w:hAnsi="Calibri"/>
-          <w:color w:val="404040"/>
-          <w:sz w:val="22"/>
-          <w:szCs w:val="22"/>
-        </w:rPr>
-        <w:t xml:space="preserve"/>
-      </w:r>
-    </w:p>
-    <w:p>
-      <w:pPr>
-        <w:spacing w:after="120" w:before="0" w:line="360" w:lineRule="auto"/>
-        <w:jc w:val="both"/>
-      </w:pPr>
-      <w:r>
-        <w:rPr>
-          <w:rFonts w:ascii="Calibri" w:cs="Calibri" w:eastAsia="Calibri" w:hAnsi="Calibri"/>
-          <w:color w:val="404040"/>
-          <w:sz w:val="22"/>
-          <w:szCs w:val="22"/>
-        </w:rPr>
-        <w:t xml:space="preserve">Ultralytics. (2023). YOLOv8: A state-of-the-art real-time object detection and image segmentation model [Software]. Ultralytics Inc. https://github.com/ultralytics/ultralytics</w:t>
+        <w:spacing w:after="200" w:before="0" w:line="360" w:lineRule="auto"/>
+        <w:ind w:left="720" w:hanging="720"/>
+        <w:jc w:val="both"/>
+      </w:pPr>
+      <w:r>
+        <w:rPr>
+          <w:rFonts w:ascii="Calibri" w:cs="Calibri" w:eastAsia="Calibri" w:hAnsi="Calibri"/>
+          <w:color w:val="404040"/>
+          <w:sz w:val="22"/>
+          <w:szCs w:val="22"/>
+        </w:rPr>
+        <w:t xml:space="preserve">Baek, Y., Lee, B., Han, D., Yun, S., y Lee, H. (2019). Character region awareness for text detection. En </w:t>
+      </w:r>
+      <w:r>
+        <w:rPr>
+          <w:rFonts w:ascii="Calibri" w:cs="Calibri" w:eastAsia="Calibri" w:hAnsi="Calibri"/>
+          <w:i/>
+          <w:iCs/>
+          <w:color w:val="404040"/>
+          <w:sz w:val="22"/>
+          <w:szCs w:val="22"/>
+        </w:rPr>
+        <w:t xml:space="preserve">Proceedings of the IEEE/CVF Conference on Computer Vision and Pattern Recognition</w:t>
+      </w:r>
+      <w:r>
+        <w:rPr>
+          <w:rFonts w:ascii="Calibri" w:cs="Calibri" w:eastAsia="Calibri" w:hAnsi="Calibri"/>
+          <w:color w:val="404040"/>
+          <w:sz w:val="22"/>
+          <w:szCs w:val="22"/>
+        </w:rPr>
+        <w:t xml:space="preserve"> (pp. 9365–9374). IEEE. https://doi.org/10.1109/CVPR.2019.00959</w:t>
+      </w:r>
+    </w:p>
+    <w:p>
+      <w:pPr>
+        <w:spacing w:after="200" w:before="0" w:line="360" w:lineRule="auto"/>
+        <w:ind w:left="720" w:hanging="720"/>
+        <w:jc w:val="both"/>
+      </w:pPr>
+      <w:r>
+        <w:rPr>
+          <w:rFonts w:ascii="Calibri" w:cs="Calibri" w:eastAsia="Calibri" w:hAnsi="Calibri"/>
+          <w:color w:val="404040"/>
+          <w:sz w:val="22"/>
+          <w:szCs w:val="22"/>
+        </w:rPr>
+        <w:t xml:space="preserve">He, K., Zhang, X., Ren, S., y Sun, J. (2016). Deep residual learning for image recognition. En </w:t>
+      </w:r>
+      <w:r>
+        <w:rPr>
+          <w:rFonts w:ascii="Calibri" w:cs="Calibri" w:eastAsia="Calibri" w:hAnsi="Calibri"/>
+          <w:i/>
+          <w:iCs/>
+          <w:color w:val="404040"/>
+          <w:sz w:val="22"/>
+          <w:szCs w:val="22"/>
+        </w:rPr>
+        <w:t xml:space="preserve">Proceedings of the IEEE Conference on Computer Vision and Pattern Recognition</w:t>
+      </w:r>
+      <w:r>
+        <w:rPr>
+          <w:rFonts w:ascii="Calibri" w:cs="Calibri" w:eastAsia="Calibri" w:hAnsi="Calibri"/>
+          <w:color w:val="404040"/>
+          <w:sz w:val="22"/>
+          <w:szCs w:val="22"/>
+        </w:rPr>
+        <w:t xml:space="preserve"> (pp. 770–778). IEEE. https://doi.org/10.1109/CVPR.2016.90</w:t>
+      </w:r>
+    </w:p>
+    <w:p>
+      <w:pPr>
+        <w:spacing w:after="200" w:before="0" w:line="360" w:lineRule="auto"/>
+        <w:ind w:left="720" w:hanging="720"/>
+        <w:jc w:val="both"/>
+      </w:pPr>
+      <w:r>
+        <w:rPr>
+          <w:rFonts w:ascii="Calibri" w:cs="Calibri" w:eastAsia="Calibri" w:hAnsi="Calibri"/>
+          <w:color w:val="404040"/>
+          <w:sz w:val="22"/>
+          <w:szCs w:val="22"/>
+        </w:rPr>
+        <w:t xml:space="preserve">International Civil Aviation Organization. (2021). </w:t>
+      </w:r>
+      <w:r>
+        <w:rPr>
+          <w:rFonts w:ascii="Calibri" w:cs="Calibri" w:eastAsia="Calibri" w:hAnsi="Calibri"/>
+          <w:i/>
+          <w:iCs/>
+          <w:color w:val="404040"/>
+          <w:sz w:val="22"/>
+          <w:szCs w:val="22"/>
+        </w:rPr>
+        <w:t xml:space="preserve">Doc 9303: Machine readable travel documents</w:t>
+      </w:r>
+      <w:r>
+        <w:rPr>
+          <w:rFonts w:ascii="Calibri" w:cs="Calibri" w:eastAsia="Calibri" w:hAnsi="Calibri"/>
+          <w:color w:val="404040"/>
+          <w:sz w:val="22"/>
+          <w:szCs w:val="22"/>
+        </w:rPr>
+        <w:t xml:space="preserve"> (8.ª ed.). ICAO. https://www.icao.int/publications/pages/publication.aspx?docnum=9303</w:t>
+      </w:r>
+    </w:p>
+    <w:p>
+      <w:pPr>
+        <w:spacing w:after="200" w:before="0" w:line="360" w:lineRule="auto"/>
+        <w:ind w:left="720" w:hanging="720"/>
+        <w:jc w:val="both"/>
+      </w:pPr>
+      <w:r>
+        <w:rPr>
+          <w:rFonts w:ascii="Calibri" w:cs="Calibri" w:eastAsia="Calibri" w:hAnsi="Calibri"/>
+          <w:color w:val="404040"/>
+          <w:sz w:val="22"/>
+          <w:szCs w:val="22"/>
+        </w:rPr>
+        <w:t xml:space="preserve">Jaided AI. (2020). </w:t>
+      </w:r>
+      <w:r>
+        <w:rPr>
+          <w:rFonts w:ascii="Calibri" w:cs="Calibri" w:eastAsia="Calibri" w:hAnsi="Calibri"/>
+          <w:i/>
+          <w:iCs/>
+          <w:color w:val="404040"/>
+          <w:sz w:val="22"/>
+          <w:szCs w:val="22"/>
+        </w:rPr>
+        <w:t xml:space="preserve">EasyOCR: Ready-to-use OCR with 80+ supported languages</w:t>
+      </w:r>
+      <w:r>
+        <w:rPr>
+          <w:rFonts w:ascii="Calibri" w:cs="Calibri" w:eastAsia="Calibri" w:hAnsi="Calibri"/>
+          <w:color w:val="404040"/>
+          <w:sz w:val="22"/>
+          <w:szCs w:val="22"/>
+        </w:rPr>
+        <w:t xml:space="preserve"> [Software]. https://github.com/JaidedAI/EasyOCR</w:t>
+      </w:r>
+    </w:p>
+    <w:p>
+      <w:pPr>
+        <w:spacing w:after="200" w:before="0" w:line="360" w:lineRule="auto"/>
+        <w:ind w:left="720" w:hanging="720"/>
+        <w:jc w:val="both"/>
+      </w:pPr>
+      <w:r>
+        <w:rPr>
+          <w:rFonts w:ascii="Calibri" w:cs="Calibri" w:eastAsia="Calibri" w:hAnsi="Calibri"/>
+          <w:color w:val="404040"/>
+          <w:sz w:val="22"/>
+          <w:szCs w:val="22"/>
+        </w:rPr>
+        <w:t xml:space="preserve">Kaissis, G. A., Makowski, M. R., Rückert, D., y Braren, R. F. (2020). Secure, privacy-preserving and federated machine learning in medical imaging. </w:t>
+      </w:r>
+      <w:r>
+        <w:rPr>
+          <w:rFonts w:ascii="Calibri" w:cs="Calibri" w:eastAsia="Calibri" w:hAnsi="Calibri"/>
+          <w:i/>
+          <w:iCs/>
+          <w:color w:val="404040"/>
+          <w:sz w:val="22"/>
+          <w:szCs w:val="22"/>
+        </w:rPr>
+        <w:t xml:space="preserve">Nature Machine Intelligence, 2</w:t>
+      </w:r>
+      <w:r>
+        <w:rPr>
+          <w:rFonts w:ascii="Calibri" w:cs="Calibri" w:eastAsia="Calibri" w:hAnsi="Calibri"/>
+          <w:color w:val="404040"/>
+          <w:sz w:val="22"/>
+          <w:szCs w:val="22"/>
+        </w:rPr>
+        <w:t xml:space="preserve">(6), 305–311. https://doi.org/10.1038/s42256-020-0186-1</w:t>
+      </w:r>
+    </w:p>
+    <w:p>
+      <w:pPr>
+        <w:spacing w:after="200" w:before="0" w:line="360" w:lineRule="auto"/>
+        <w:ind w:left="720" w:hanging="720"/>
+        <w:jc w:val="both"/>
+      </w:pPr>
+      <w:r>
+        <w:rPr>
+          <w:rFonts w:ascii="Calibri" w:cs="Calibri" w:eastAsia="Calibri" w:hAnsi="Calibri"/>
+          <w:color w:val="404040"/>
+          <w:sz w:val="22"/>
+          <w:szCs w:val="22"/>
+        </w:rPr>
+        <w:t xml:space="preserve">Redmon, J., Divvala, S., Girshick, R., y Farhadi, A. (2016). You only look once: Unified, real-time object detection. En </w:t>
+      </w:r>
+      <w:r>
+        <w:rPr>
+          <w:rFonts w:ascii="Calibri" w:cs="Calibri" w:eastAsia="Calibri" w:hAnsi="Calibri"/>
+          <w:i/>
+          <w:iCs/>
+          <w:color w:val="404040"/>
+          <w:sz w:val="22"/>
+          <w:szCs w:val="22"/>
+        </w:rPr>
+        <w:t xml:space="preserve">Proceedings of the IEEE Conference on Computer Vision and Pattern Recognition</w:t>
+      </w:r>
+      <w:r>
+        <w:rPr>
+          <w:rFonts w:ascii="Calibri" w:cs="Calibri" w:eastAsia="Calibri" w:hAnsi="Calibri"/>
+          <w:color w:val="404040"/>
+          <w:sz w:val="22"/>
+          <w:szCs w:val="22"/>
+        </w:rPr>
+        <w:t xml:space="preserve"> (pp. 779–788). IEEE. https://doi.org/10.1109/CVPR.2016.91</w:t>
+      </w:r>
+    </w:p>
+    <w:p>
+      <w:pPr>
+        <w:spacing w:after="200" w:before="0" w:line="360" w:lineRule="auto"/>
+        <w:ind w:left="720" w:hanging="720"/>
+        <w:jc w:val="both"/>
+      </w:pPr>
+      <w:r>
+        <w:rPr>
+          <w:rFonts w:ascii="Calibri" w:cs="Calibri" w:eastAsia="Calibri" w:hAnsi="Calibri"/>
+          <w:color w:val="404040"/>
+          <w:sz w:val="22"/>
+          <w:szCs w:val="22"/>
+        </w:rPr>
+        <w:t xml:space="preserve">Reglamento (UE) 2016/679 del Parlamento Europeo y del Consejo de 27 de abril de 2016 relativo a la protección de las personas físicas en lo que respecta al tratamiento de datos personales y a la libre circulación de estos datos (RGPD). </w:t>
+      </w:r>
+      <w:r>
+        <w:rPr>
+          <w:rFonts w:ascii="Calibri" w:cs="Calibri" w:eastAsia="Calibri" w:hAnsi="Calibri"/>
+          <w:i/>
+          <w:iCs/>
+          <w:color w:val="404040"/>
+          <w:sz w:val="22"/>
+          <w:szCs w:val="22"/>
+        </w:rPr>
+        <w:t xml:space="preserve">Diario Oficial de la Unión Europea, L 119</w:t>
+      </w:r>
+      <w:r>
+        <w:rPr>
+          <w:rFonts w:ascii="Calibri" w:cs="Calibri" w:eastAsia="Calibri" w:hAnsi="Calibri"/>
+          <w:color w:val="404040"/>
+          <w:sz w:val="22"/>
+          <w:szCs w:val="22"/>
+        </w:rPr>
+        <w:t xml:space="preserve">, 1–88.</w:t>
+      </w:r>
+    </w:p>
+    <w:p>
+      <w:pPr>
+        <w:spacing w:after="200" w:before="0" w:line="360" w:lineRule="auto"/>
+        <w:ind w:left="720" w:hanging="720"/>
+        <w:jc w:val="both"/>
+      </w:pPr>
+      <w:r>
+        <w:rPr>
+          <w:rFonts w:ascii="Calibri" w:cs="Calibri" w:eastAsia="Calibri" w:hAnsi="Calibri"/>
+          <w:color w:val="404040"/>
+          <w:sz w:val="22"/>
+          <w:szCs w:val="22"/>
+        </w:rPr>
+        <w:t xml:space="preserve">Shi, B., Bai, X., y Yao, C. (2017). An end-to-end trainable neural network for image-based sequence recognition and its application to scene text recognition. </w:t>
+      </w:r>
+      <w:r>
+        <w:rPr>
+          <w:rFonts w:ascii="Calibri" w:cs="Calibri" w:eastAsia="Calibri" w:hAnsi="Calibri"/>
+          <w:i/>
+          <w:iCs/>
+          <w:color w:val="404040"/>
+          <w:sz w:val="22"/>
+          <w:szCs w:val="22"/>
+        </w:rPr>
+        <w:t xml:space="preserve">IEEE Transactions on Pattern Analysis and Machine Intelligence, 39</w:t>
+      </w:r>
+      <w:r>
+        <w:rPr>
+          <w:rFonts w:ascii="Calibri" w:cs="Calibri" w:eastAsia="Calibri" w:hAnsi="Calibri"/>
+          <w:color w:val="404040"/>
+          <w:sz w:val="22"/>
+          <w:szCs w:val="22"/>
+        </w:rPr>
+        <w:t xml:space="preserve">(11), 2298–2304. https://doi.org/10.1109/TPAMI.2016.2646371</w:t>
+      </w:r>
+    </w:p>
+    <w:p>
+      <w:pPr>
+        <w:spacing w:after="200" w:before="0" w:line="360" w:lineRule="auto"/>
+        <w:ind w:left="720" w:hanging="720"/>
+        <w:jc w:val="both"/>
+      </w:pPr>
+      <w:r>
+        <w:rPr>
+          <w:rFonts w:ascii="Calibri" w:cs="Calibri" w:eastAsia="Calibri" w:hAnsi="Calibri"/>
+          <w:color w:val="404040"/>
+          <w:sz w:val="22"/>
+          <w:szCs w:val="22"/>
+        </w:rPr>
+        <w:t xml:space="preserve">Ultralytics. (2023). </w:t>
+      </w:r>
+      <w:r>
+        <w:rPr>
+          <w:rFonts w:ascii="Calibri" w:cs="Calibri" w:eastAsia="Calibri" w:hAnsi="Calibri"/>
+          <w:i/>
+          <w:iCs/>
+          <w:color w:val="404040"/>
+          <w:sz w:val="22"/>
+          <w:szCs w:val="22"/>
+        </w:rPr>
+        <w:t xml:space="preserve">YOLOv8: A state-of-the-art real-time object detection and image segmentation model</w:t>
+      </w:r>
+      <w:r>
+        <w:rPr>
+          <w:rFonts w:ascii="Calibri" w:cs="Calibri" w:eastAsia="Calibri" w:hAnsi="Calibri"/>
+          <w:color w:val="404040"/>
+          <w:sz w:val="22"/>
+          <w:szCs w:val="22"/>
+        </w:rPr>
+        <w:t xml:space="preserve"> [Software]. Ultralytics Inc. https://github.com/ultralytics/ultralytics</w:t>
       </w:r>
     </w:p>
     <w:p>
@@ -10199,7 +10254,7 @@
           <w:rFonts w:ascii="Calibri" w:cs="Calibri" w:eastAsia="Calibri" w:hAnsi="Calibri"/>
           <w:b/>
           <w:bCs/>
-          <w:color w:val="1F3864"/>
+          <w:color w:val="BA0C2F"/>
           <w:sz w:val="36"/>
           <w:szCs w:val="36"/>
         </w:rPr>
@@ -10216,7 +10271,7 @@
           <w:rFonts w:ascii="Calibri" w:cs="Calibri" w:eastAsia="Calibri" w:hAnsi="Calibri"/>
           <w:b/>
           <w:bCs/>
-          <w:color w:val="1F3864"/>
+          <w:color w:val="404040"/>
           <w:sz w:val="32"/>
           <w:szCs w:val="32"/>
         </w:rPr>
@@ -10624,7 +10679,7 @@
           <w:rFonts w:ascii="Calibri" w:cs="Calibri" w:eastAsia="Calibri" w:hAnsi="Calibri"/>
           <w:b/>
           <w:bCs/>
-          <w:color w:val="1F3864"/>
+          <w:color w:val="404040"/>
           <w:sz w:val="32"/>
           <w:szCs w:val="32"/>
         </w:rPr>
@@ -10672,7 +10727,7 @@
               <w:bottom w:val="single" w:color="CCCCCC" w:sz="1"/>
               <w:right w:val="single" w:color="CCCCCC" w:sz="1"/>
             </w:tcBorders>
-            <w:shd w:fill="1F3864" w:val="clear"/>
+            <w:shd w:fill="BA0C2F" w:val="clear"/>
             <w:tcMar>
               <w:top w:type="dxa" w:w="80"/>
               <w:left w:type="dxa" w:w="120"/>
@@ -10708,7 +10763,7 @@
               <w:bottom w:val="single" w:color="CCCCCC" w:sz="1"/>
               <w:right w:val="single" w:color="CCCCCC" w:sz="1"/>
             </w:tcBorders>
-            <w:shd w:fill="1F3864" w:val="clear"/>
+            <w:shd w:fill="BA0C2F" w:val="clear"/>
             <w:tcMar>
               <w:top w:type="dxa" w:w="80"/>
               <w:left w:type="dxa" w:w="120"/>
@@ -10744,7 +10799,7 @@
               <w:bottom w:val="single" w:color="CCCCCC" w:sz="1"/>
               <w:right w:val="single" w:color="CCCCCC" w:sz="1"/>
             </w:tcBorders>
-            <w:shd w:fill="1F3864" w:val="clear"/>
+            <w:shd w:fill="BA0C2F" w:val="clear"/>
             <w:tcMar>
               <w:top w:type="dxa" w:w="80"/>
               <w:left w:type="dxa" w:w="120"/>
@@ -11804,7 +11859,7 @@
           <w:rFonts w:ascii="Calibri" w:cs="Calibri" w:eastAsia="Calibri" w:hAnsi="Calibri"/>
           <w:b/>
           <w:bCs/>
-          <w:color w:val="1F3864"/>
+          <w:color w:val="404040"/>
           <w:sz w:val="32"/>
           <w:szCs w:val="32"/>
         </w:rPr>
@@ -11975,7 +12030,7 @@
           <w:rFonts w:ascii="Calibri" w:cs="Calibri" w:eastAsia="Calibri" w:hAnsi="Calibri"/>
           <w:b/>
           <w:bCs/>
-          <w:color w:val="1F3864"/>
+          <w:color w:val="404040"/>
           <w:sz w:val="32"/>
           <w:szCs w:val="32"/>
         </w:rPr>
@@ -12598,7 +12653,7 @@
       <w:rFonts w:ascii="Calibri" w:cs="Calibri" w:eastAsia="Calibri" w:hAnsi="Calibri"/>
       <w:b/>
       <w:bCs/>
-      <w:color w:val="1F3864"/>
+      <w:color w:val="BA0C2F"/>
       <w:sz w:val="36"/>
       <w:szCs w:val="36"/>
     </w:rPr>
@@ -12616,7 +12671,7 @@
       <w:rFonts w:ascii="Calibri" w:cs="Calibri" w:eastAsia="Calibri" w:hAnsi="Calibri"/>
       <w:b/>
       <w:bCs/>
-      <w:color w:val="1F3864"/>
+      <w:color w:val="404040"/>
       <w:sz w:val="32"/>
       <w:szCs w:val="32"/>
     </w:rPr>
@@ -12634,7 +12689,7 @@
       <w:rFonts w:ascii="Calibri" w:cs="Calibri" w:eastAsia="Calibri" w:hAnsi="Calibri"/>
       <w:b/>
       <w:bCs/>
-      <w:color w:val="2E74B5"/>
+      <w:color w:val="404040"/>
       <w:sz w:val="28"/>
       <w:szCs w:val="28"/>
     </w:rPr>

</xml_diff>

<commit_message>
fix(docs): corrige anchos de tabla, espaciados y sangrías según normas TFM
Co-Authored-By: Claude Fable 5 <noreply@anthropic.com>
</commit_message>
<xml_diff>
--- a/informes/TFM_Raul_Hernando_Viadero.docx
+++ b/informes/TFM_Raul_Hernando_Viadero.docx
@@ -822,7 +822,7 @@
           <w:ilvl w:val="0"/>
           <w:numId w:val="2"/>
         </w:numPr>
-        <w:spacing w:after="80" w:before="0" w:line="360"/>
+        <w:spacing w:after="120" w:before="0" w:line="360" w:lineRule="auto"/>
         <w:jc w:val="both"/>
       </w:pPr>
       <w:r>
@@ -853,7 +853,7 @@
           <w:ilvl w:val="0"/>
           <w:numId w:val="2"/>
         </w:numPr>
-        <w:spacing w:after="80" w:before="0" w:line="360"/>
+        <w:spacing w:after="120" w:before="0" w:line="360" w:lineRule="auto"/>
         <w:jc w:val="both"/>
       </w:pPr>
       <w:r>
@@ -1012,7 +1012,7 @@
           <w:ilvl w:val="0"/>
           <w:numId w:val="3"/>
         </w:numPr>
-        <w:spacing w:after="80" w:before="0" w:line="360"/>
+        <w:spacing w:after="120" w:before="0" w:line="360" w:lineRule="auto"/>
         <w:jc w:val="both"/>
       </w:pPr>
       <w:r>
@@ -1032,7 +1032,7 @@
           <w:ilvl w:val="0"/>
           <w:numId w:val="3"/>
         </w:numPr>
-        <w:spacing w:after="80" w:before="0" w:line="360"/>
+        <w:spacing w:after="120" w:before="0" w:line="360" w:lineRule="auto"/>
         <w:jc w:val="both"/>
       </w:pPr>
       <w:r>
@@ -1052,7 +1052,7 @@
           <w:ilvl w:val="0"/>
           <w:numId w:val="3"/>
         </w:numPr>
-        <w:spacing w:after="80" w:before="0" w:line="360"/>
+        <w:spacing w:after="120" w:before="0" w:line="360" w:lineRule="auto"/>
         <w:jc w:val="both"/>
       </w:pPr>
       <w:r>
@@ -1072,7 +1072,7 @@
           <w:ilvl w:val="0"/>
           <w:numId w:val="3"/>
         </w:numPr>
-        <w:spacing w:after="80" w:before="0" w:line="360"/>
+        <w:spacing w:after="120" w:before="0" w:line="360" w:lineRule="auto"/>
         <w:jc w:val="both"/>
       </w:pPr>
       <w:r>
@@ -1092,7 +1092,7 @@
           <w:ilvl w:val="0"/>
           <w:numId w:val="3"/>
         </w:numPr>
-        <w:spacing w:after="80" w:before="0" w:line="360"/>
+        <w:spacing w:after="120" w:before="0" w:line="360" w:lineRule="auto"/>
         <w:jc w:val="both"/>
       </w:pPr>
       <w:r>
@@ -1112,7 +1112,7 @@
           <w:ilvl w:val="0"/>
           <w:numId w:val="3"/>
         </w:numPr>
-        <w:spacing w:after="80" w:before="0" w:line="360"/>
+        <w:spacing w:after="120" w:before="0" w:line="360" w:lineRule="auto"/>
         <w:jc w:val="both"/>
       </w:pPr>
       <w:r>
@@ -1132,7 +1132,7 @@
           <w:ilvl w:val="0"/>
           <w:numId w:val="3"/>
         </w:numPr>
-        <w:spacing w:after="80" w:before="0" w:line="360"/>
+        <w:spacing w:after="120" w:before="0" w:line="360" w:lineRule="auto"/>
         <w:jc w:val="both"/>
       </w:pPr>
       <w:r>
@@ -1152,7 +1152,7 @@
           <w:ilvl w:val="0"/>
           <w:numId w:val="3"/>
         </w:numPr>
-        <w:spacing w:after="80" w:before="0" w:line="360"/>
+        <w:spacing w:after="120" w:before="0" w:line="360" w:lineRule="auto"/>
         <w:jc w:val="both"/>
       </w:pPr>
       <w:r>
@@ -1172,7 +1172,7 @@
           <w:ilvl w:val="0"/>
           <w:numId w:val="3"/>
         </w:numPr>
-        <w:spacing w:after="80" w:before="0" w:line="360"/>
+        <w:spacing w:after="120" w:before="0" w:line="360" w:lineRule="auto"/>
         <w:jc w:val="both"/>
       </w:pPr>
       <w:r>
@@ -1298,7 +1298,7 @@
     </w:p>
     <w:tbl>
       <w:tblPr>
-        <w:tblW w:type="dxa" w:w="9500"/>
+        <w:tblW w:type="dxa" w:w="8504"/>
         <w:tblBorders>
           <w:top w:val="single" w:color="auto" w:sz="4"/>
           <w:left w:val="single" w:color="auto" w:sz="4"/>
@@ -1309,14 +1309,14 @@
         </w:tblBorders>
       </w:tblPr>
       <w:tblGrid>
-        <w:gridCol w:w="3500"/>
-        <w:gridCol w:w="4000"/>
-        <w:gridCol w:w="2000"/>
+        <w:gridCol w:w="2800"/>
+        <w:gridCol w:w="3800"/>
+        <w:gridCol w:w="1904"/>
       </w:tblGrid>
       <w:tr>
         <w:tc>
           <w:tcPr>
-            <w:tcW w:type="dxa" w:w="3500"/>
+            <w:tcW w:type="dxa" w:w="2800"/>
             <w:tcBorders>
               <w:top w:val="single" w:color="CCCCCC" w:sz="1"/>
               <w:left w:val="single" w:color="CCCCCC" w:sz="1"/>
@@ -1352,7 +1352,7 @@
         </w:tc>
         <w:tc>
           <w:tcPr>
-            <w:tcW w:type="dxa" w:w="4000"/>
+            <w:tcW w:type="dxa" w:w="3800"/>
             <w:tcBorders>
               <w:top w:val="single" w:color="CCCCCC" w:sz="1"/>
               <w:left w:val="single" w:color="CCCCCC" w:sz="1"/>
@@ -1388,7 +1388,7 @@
         </w:tc>
         <w:tc>
           <w:tcPr>
-            <w:tcW w:type="dxa" w:w="2000"/>
+            <w:tcW w:type="dxa" w:w="1904"/>
             <w:tcBorders>
               <w:top w:val="single" w:color="CCCCCC" w:sz="1"/>
               <w:left w:val="single" w:color="CCCCCC" w:sz="1"/>
@@ -1426,7 +1426,7 @@
       <w:tr>
         <w:tc>
           <w:tcPr>
-            <w:tcW w:type="dxa" w:w="3500"/>
+            <w:tcW w:type="dxa" w:w="2800"/>
             <w:tcBorders>
               <w:top w:val="single" w:color="CCCCCC" w:sz="1"/>
               <w:left w:val="single" w:color="CCCCCC" w:sz="1"/>
@@ -1462,7 +1462,7 @@
         </w:tc>
         <w:tc>
           <w:tcPr>
-            <w:tcW w:type="dxa" w:w="4000"/>
+            <w:tcW w:type="dxa" w:w="3800"/>
             <w:tcBorders>
               <w:top w:val="single" w:color="CCCCCC" w:sz="1"/>
               <w:left w:val="single" w:color="CCCCCC" w:sz="1"/>
@@ -1498,7 +1498,7 @@
         </w:tc>
         <w:tc>
           <w:tcPr>
-            <w:tcW w:type="dxa" w:w="2000"/>
+            <w:tcW w:type="dxa" w:w="1904"/>
             <w:tcBorders>
               <w:top w:val="single" w:color="CCCCCC" w:sz="1"/>
               <w:left w:val="single" w:color="CCCCCC" w:sz="1"/>
@@ -1536,7 +1536,7 @@
       <w:tr>
         <w:tc>
           <w:tcPr>
-            <w:tcW w:type="dxa" w:w="3500"/>
+            <w:tcW w:type="dxa" w:w="2800"/>
             <w:tcBorders>
               <w:top w:val="single" w:color="CCCCCC" w:sz="1"/>
               <w:left w:val="single" w:color="CCCCCC" w:sz="1"/>
@@ -1572,7 +1572,7 @@
         </w:tc>
         <w:tc>
           <w:tcPr>
-            <w:tcW w:type="dxa" w:w="4000"/>
+            <w:tcW w:type="dxa" w:w="3800"/>
             <w:tcBorders>
               <w:top w:val="single" w:color="CCCCCC" w:sz="1"/>
               <w:left w:val="single" w:color="CCCCCC" w:sz="1"/>
@@ -1608,7 +1608,7 @@
         </w:tc>
         <w:tc>
           <w:tcPr>
-            <w:tcW w:type="dxa" w:w="2000"/>
+            <w:tcW w:type="dxa" w:w="1904"/>
             <w:tcBorders>
               <w:top w:val="single" w:color="CCCCCC" w:sz="1"/>
               <w:left w:val="single" w:color="CCCCCC" w:sz="1"/>
@@ -1646,7 +1646,7 @@
       <w:tr>
         <w:tc>
           <w:tcPr>
-            <w:tcW w:type="dxa" w:w="3500"/>
+            <w:tcW w:type="dxa" w:w="2800"/>
             <w:tcBorders>
               <w:top w:val="single" w:color="CCCCCC" w:sz="1"/>
               <w:left w:val="single" w:color="CCCCCC" w:sz="1"/>
@@ -1682,7 +1682,7 @@
         </w:tc>
         <w:tc>
           <w:tcPr>
-            <w:tcW w:type="dxa" w:w="4000"/>
+            <w:tcW w:type="dxa" w:w="3800"/>
             <w:tcBorders>
               <w:top w:val="single" w:color="CCCCCC" w:sz="1"/>
               <w:left w:val="single" w:color="CCCCCC" w:sz="1"/>
@@ -1718,7 +1718,7 @@
         </w:tc>
         <w:tc>
           <w:tcPr>
-            <w:tcW w:type="dxa" w:w="2000"/>
+            <w:tcW w:type="dxa" w:w="1904"/>
             <w:tcBorders>
               <w:top w:val="single" w:color="CCCCCC" w:sz="1"/>
               <w:left w:val="single" w:color="CCCCCC" w:sz="1"/>
@@ -1756,7 +1756,7 @@
       <w:tr>
         <w:tc>
           <w:tcPr>
-            <w:tcW w:type="dxa" w:w="3500"/>
+            <w:tcW w:type="dxa" w:w="2800"/>
             <w:tcBorders>
               <w:top w:val="single" w:color="CCCCCC" w:sz="1"/>
               <w:left w:val="single" w:color="CCCCCC" w:sz="1"/>
@@ -1792,7 +1792,7 @@
         </w:tc>
         <w:tc>
           <w:tcPr>
-            <w:tcW w:type="dxa" w:w="4000"/>
+            <w:tcW w:type="dxa" w:w="3800"/>
             <w:tcBorders>
               <w:top w:val="single" w:color="CCCCCC" w:sz="1"/>
               <w:left w:val="single" w:color="CCCCCC" w:sz="1"/>
@@ -1828,7 +1828,7 @@
         </w:tc>
         <w:tc>
           <w:tcPr>
-            <w:tcW w:type="dxa" w:w="2000"/>
+            <w:tcW w:type="dxa" w:w="1904"/>
             <w:tcBorders>
               <w:top w:val="single" w:color="CCCCCC" w:sz="1"/>
               <w:left w:val="single" w:color="CCCCCC" w:sz="1"/>
@@ -1866,7 +1866,7 @@
       <w:tr>
         <w:tc>
           <w:tcPr>
-            <w:tcW w:type="dxa" w:w="3500"/>
+            <w:tcW w:type="dxa" w:w="2800"/>
             <w:tcBorders>
               <w:top w:val="single" w:color="CCCCCC" w:sz="1"/>
               <w:left w:val="single" w:color="CCCCCC" w:sz="1"/>
@@ -1902,7 +1902,7 @@
         </w:tc>
         <w:tc>
           <w:tcPr>
-            <w:tcW w:type="dxa" w:w="4000"/>
+            <w:tcW w:type="dxa" w:w="3800"/>
             <w:tcBorders>
               <w:top w:val="single" w:color="CCCCCC" w:sz="1"/>
               <w:left w:val="single" w:color="CCCCCC" w:sz="1"/>
@@ -1938,7 +1938,7 @@
         </w:tc>
         <w:tc>
           <w:tcPr>
-            <w:tcW w:type="dxa" w:w="2000"/>
+            <w:tcW w:type="dxa" w:w="1904"/>
             <w:tcBorders>
               <w:top w:val="single" w:color="CCCCCC" w:sz="1"/>
               <w:left w:val="single" w:color="CCCCCC" w:sz="1"/>
@@ -1976,7 +1976,7 @@
       <w:tr>
         <w:tc>
           <w:tcPr>
-            <w:tcW w:type="dxa" w:w="3500"/>
+            <w:tcW w:type="dxa" w:w="2800"/>
             <w:tcBorders>
               <w:top w:val="single" w:color="CCCCCC" w:sz="1"/>
               <w:left w:val="single" w:color="CCCCCC" w:sz="1"/>
@@ -2012,7 +2012,7 @@
         </w:tc>
         <w:tc>
           <w:tcPr>
-            <w:tcW w:type="dxa" w:w="4000"/>
+            <w:tcW w:type="dxa" w:w="3800"/>
             <w:tcBorders>
               <w:top w:val="single" w:color="CCCCCC" w:sz="1"/>
               <w:left w:val="single" w:color="CCCCCC" w:sz="1"/>
@@ -2048,7 +2048,7 @@
         </w:tc>
         <w:tc>
           <w:tcPr>
-            <w:tcW w:type="dxa" w:w="2000"/>
+            <w:tcW w:type="dxa" w:w="1904"/>
             <w:tcBorders>
               <w:top w:val="single" w:color="CCCCCC" w:sz="1"/>
               <w:left w:val="single" w:color="CCCCCC" w:sz="1"/>
@@ -2086,7 +2086,7 @@
       <w:tr>
         <w:tc>
           <w:tcPr>
-            <w:tcW w:type="dxa" w:w="3500"/>
+            <w:tcW w:type="dxa" w:w="2800"/>
             <w:tcBorders>
               <w:top w:val="single" w:color="CCCCCC" w:sz="1"/>
               <w:left w:val="single" w:color="CCCCCC" w:sz="1"/>
@@ -2122,7 +2122,7 @@
         </w:tc>
         <w:tc>
           <w:tcPr>
-            <w:tcW w:type="dxa" w:w="4000"/>
+            <w:tcW w:type="dxa" w:w="3800"/>
             <w:tcBorders>
               <w:top w:val="single" w:color="CCCCCC" w:sz="1"/>
               <w:left w:val="single" w:color="CCCCCC" w:sz="1"/>
@@ -2158,7 +2158,7 @@
         </w:tc>
         <w:tc>
           <w:tcPr>
-            <w:tcW w:type="dxa" w:w="2000"/>
+            <w:tcW w:type="dxa" w:w="1904"/>
             <w:tcBorders>
               <w:top w:val="single" w:color="CCCCCC" w:sz="1"/>
               <w:left w:val="single" w:color="CCCCCC" w:sz="1"/>
@@ -2196,7 +2196,7 @@
       <w:tr>
         <w:tc>
           <w:tcPr>
-            <w:tcW w:type="dxa" w:w="3500"/>
+            <w:tcW w:type="dxa" w:w="2800"/>
             <w:tcBorders>
               <w:top w:val="single" w:color="CCCCCC" w:sz="1"/>
               <w:left w:val="single" w:color="CCCCCC" w:sz="1"/>
@@ -2232,7 +2232,7 @@
         </w:tc>
         <w:tc>
           <w:tcPr>
-            <w:tcW w:type="dxa" w:w="4000"/>
+            <w:tcW w:type="dxa" w:w="3800"/>
             <w:tcBorders>
               <w:top w:val="single" w:color="CCCCCC" w:sz="1"/>
               <w:left w:val="single" w:color="CCCCCC" w:sz="1"/>
@@ -2268,7 +2268,7 @@
         </w:tc>
         <w:tc>
           <w:tcPr>
-            <w:tcW w:type="dxa" w:w="2000"/>
+            <w:tcW w:type="dxa" w:w="1904"/>
             <w:tcBorders>
               <w:top w:val="single" w:color="CCCCCC" w:sz="1"/>
               <w:left w:val="single" w:color="CCCCCC" w:sz="1"/>
@@ -2306,7 +2306,7 @@
       <w:tr>
         <w:tc>
           <w:tcPr>
-            <w:tcW w:type="dxa" w:w="3500"/>
+            <w:tcW w:type="dxa" w:w="2800"/>
             <w:tcBorders>
               <w:top w:val="single" w:color="CCCCCC" w:sz="1"/>
               <w:left w:val="single" w:color="CCCCCC" w:sz="1"/>
@@ -2342,7 +2342,7 @@
         </w:tc>
         <w:tc>
           <w:tcPr>
-            <w:tcW w:type="dxa" w:w="4000"/>
+            <w:tcW w:type="dxa" w:w="3800"/>
             <w:tcBorders>
               <w:top w:val="single" w:color="CCCCCC" w:sz="1"/>
               <w:left w:val="single" w:color="CCCCCC" w:sz="1"/>
@@ -2378,7 +2378,7 @@
         </w:tc>
         <w:tc>
           <w:tcPr>
-            <w:tcW w:type="dxa" w:w="2000"/>
+            <w:tcW w:type="dxa" w:w="1904"/>
             <w:tcBorders>
               <w:top w:val="single" w:color="CCCCCC" w:sz="1"/>
               <w:left w:val="single" w:color="CCCCCC" w:sz="1"/>
@@ -2416,7 +2416,7 @@
       <w:tr>
         <w:tc>
           <w:tcPr>
-            <w:tcW w:type="dxa" w:w="3500"/>
+            <w:tcW w:type="dxa" w:w="2800"/>
             <w:tcBorders>
               <w:top w:val="single" w:color="CCCCCC" w:sz="1"/>
               <w:left w:val="single" w:color="CCCCCC" w:sz="1"/>
@@ -2452,7 +2452,7 @@
         </w:tc>
         <w:tc>
           <w:tcPr>
-            <w:tcW w:type="dxa" w:w="4000"/>
+            <w:tcW w:type="dxa" w:w="3800"/>
             <w:tcBorders>
               <w:top w:val="single" w:color="CCCCCC" w:sz="1"/>
               <w:left w:val="single" w:color="CCCCCC" w:sz="1"/>
@@ -2488,7 +2488,7 @@
         </w:tc>
         <w:tc>
           <w:tcPr>
-            <w:tcW w:type="dxa" w:w="2000"/>
+            <w:tcW w:type="dxa" w:w="1904"/>
             <w:tcBorders>
               <w:top w:val="single" w:color="CCCCCC" w:sz="1"/>
               <w:left w:val="single" w:color="CCCCCC" w:sz="1"/>
@@ -2553,6 +2553,21 @@
           <w:szCs w:val="22"/>
         </w:rPr>
         <w:t xml:space="preserve"/>
+      </w:r>
+    </w:p>
+    <w:p>
+      <w:pPr>
+        <w:spacing w:after="120" w:before="0" w:line="360" w:lineRule="auto"/>
+        <w:jc w:val="both"/>
+      </w:pPr>
+      <w:r>
+        <w:rPr>
+          <w:rFonts w:ascii="Calibri" w:cs="Calibri" w:eastAsia="Calibri" w:hAnsi="Calibri"/>
+          <w:color w:val="404040"/>
+          <w:sz w:val="22"/>
+          <w:szCs w:val="22"/>
+        </w:rPr>
+        <w:t xml:space="preserve">Merece la pena justificar brevemente las decisiones tecnológicas frente a sus alternativas más habituales. Se eligió EasyOCR frente a Tesseract porque no requiere binarización previa de la imagen y su arquitectura neuronal es notablemente más robusta ante variaciones de iluminación, ruido y pequeñas rotaciones, exactamente el tipo de degradaciones que introduce la augmentación de datos. FastAPI se prefirió frente a Flask por tres motivos: la validación automática de entradas y salidas mediante esquemas Pydantic (que elimina toda una familia de errores en los contratos de la API), la generación automática de documentación interactiva OpenAPI/Swagger y su soporte nativo de operaciones asíncronas. Streamlit se eligió frente a Dash o una aplicación web en JavaScript por la velocidad de desarrollo que ofrece para prototipos analíticos. Por último, PyTorch se utilizó como framework de deep learning por ser el sustrato común tanto de Ultralytics como de EasyOCR, lo que unifica la gestión de dependencias del proyecto.</w:t>
       </w:r>
     </w:p>
     <w:p>
@@ -3121,7 +3136,7 @@
     </w:p>
     <w:tbl>
       <w:tblPr>
-        <w:tblW w:type="dxa" w:w="10500"/>
+        <w:tblW w:type="dxa" w:w="8504"/>
         <w:tblBorders>
           <w:top w:val="single" w:color="auto" w:sz="4"/>
           <w:left w:val="single" w:color="auto" w:sz="4"/>
@@ -3132,15 +3147,15 @@
         </w:tblBorders>
       </w:tblPr>
       <w:tblGrid>
-        <w:gridCol w:w="3000"/>
-        <w:gridCol w:w="2500"/>
+        <w:gridCol w:w="2100"/>
         <w:gridCol w:w="2000"/>
-        <w:gridCol w:w="3000"/>
+        <w:gridCol w:w="1700"/>
+        <w:gridCol w:w="2704"/>
       </w:tblGrid>
       <w:tr>
         <w:tc>
           <w:tcPr>
-            <w:tcW w:type="dxa" w:w="3000"/>
+            <w:tcW w:type="dxa" w:w="2100"/>
             <w:tcBorders>
               <w:top w:val="single" w:color="CCCCCC" w:sz="1"/>
               <w:left w:val="single" w:color="CCCCCC" w:sz="1"/>
@@ -3176,7 +3191,7 @@
         </w:tc>
         <w:tc>
           <w:tcPr>
-            <w:tcW w:type="dxa" w:w="2500"/>
+            <w:tcW w:type="dxa" w:w="2000"/>
             <w:tcBorders>
               <w:top w:val="single" w:color="CCCCCC" w:sz="1"/>
               <w:left w:val="single" w:color="CCCCCC" w:sz="1"/>
@@ -3212,7 +3227,7 @@
         </w:tc>
         <w:tc>
           <w:tcPr>
-            <w:tcW w:type="dxa" w:w="2000"/>
+            <w:tcW w:type="dxa" w:w="1700"/>
             <w:tcBorders>
               <w:top w:val="single" w:color="CCCCCC" w:sz="1"/>
               <w:left w:val="single" w:color="CCCCCC" w:sz="1"/>
@@ -3248,7 +3263,7 @@
         </w:tc>
         <w:tc>
           <w:tcPr>
-            <w:tcW w:type="dxa" w:w="3000"/>
+            <w:tcW w:type="dxa" w:w="2704"/>
             <w:tcBorders>
               <w:top w:val="single" w:color="CCCCCC" w:sz="1"/>
               <w:left w:val="single" w:color="CCCCCC" w:sz="1"/>
@@ -3286,7 +3301,7 @@
       <w:tr>
         <w:tc>
           <w:tcPr>
-            <w:tcW w:type="dxa" w:w="3000"/>
+            <w:tcW w:type="dxa" w:w="2100"/>
             <w:tcBorders>
               <w:top w:val="single" w:color="CCCCCC" w:sz="1"/>
               <w:left w:val="single" w:color="CCCCCC" w:sz="1"/>
@@ -3322,7 +3337,7 @@
         </w:tc>
         <w:tc>
           <w:tcPr>
-            <w:tcW w:type="dxa" w:w="2500"/>
+            <w:tcW w:type="dxa" w:w="2000"/>
             <w:tcBorders>
               <w:top w:val="single" w:color="CCCCCC" w:sz="1"/>
               <w:left w:val="single" w:color="CCCCCC" w:sz="1"/>
@@ -3358,7 +3373,7 @@
         </w:tc>
         <w:tc>
           <w:tcPr>
-            <w:tcW w:type="dxa" w:w="2000"/>
+            <w:tcW w:type="dxa" w:w="1700"/>
             <w:tcBorders>
               <w:top w:val="single" w:color="CCCCCC" w:sz="1"/>
               <w:left w:val="single" w:color="CCCCCC" w:sz="1"/>
@@ -3394,7 +3409,7 @@
         </w:tc>
         <w:tc>
           <w:tcPr>
-            <w:tcW w:type="dxa" w:w="3000"/>
+            <w:tcW w:type="dxa" w:w="2704"/>
             <w:tcBorders>
               <w:top w:val="single" w:color="CCCCCC" w:sz="1"/>
               <w:left w:val="single" w:color="CCCCCC" w:sz="1"/>
@@ -3432,7 +3447,7 @@
       <w:tr>
         <w:tc>
           <w:tcPr>
-            <w:tcW w:type="dxa" w:w="3000"/>
+            <w:tcW w:type="dxa" w:w="2100"/>
             <w:tcBorders>
               <w:top w:val="single" w:color="CCCCCC" w:sz="1"/>
               <w:left w:val="single" w:color="CCCCCC" w:sz="1"/>
@@ -3468,7 +3483,7 @@
         </w:tc>
         <w:tc>
           <w:tcPr>
-            <w:tcW w:type="dxa" w:w="2500"/>
+            <w:tcW w:type="dxa" w:w="2000"/>
             <w:tcBorders>
               <w:top w:val="single" w:color="CCCCCC" w:sz="1"/>
               <w:left w:val="single" w:color="CCCCCC" w:sz="1"/>
@@ -3504,7 +3519,7 @@
         </w:tc>
         <w:tc>
           <w:tcPr>
-            <w:tcW w:type="dxa" w:w="2000"/>
+            <w:tcW w:type="dxa" w:w="1700"/>
             <w:tcBorders>
               <w:top w:val="single" w:color="CCCCCC" w:sz="1"/>
               <w:left w:val="single" w:color="CCCCCC" w:sz="1"/>
@@ -3540,7 +3555,7 @@
         </w:tc>
         <w:tc>
           <w:tcPr>
-            <w:tcW w:type="dxa" w:w="3000"/>
+            <w:tcW w:type="dxa" w:w="2704"/>
             <w:tcBorders>
               <w:top w:val="single" w:color="CCCCCC" w:sz="1"/>
               <w:left w:val="single" w:color="CCCCCC" w:sz="1"/>
@@ -3578,7 +3593,7 @@
       <w:tr>
         <w:tc>
           <w:tcPr>
-            <w:tcW w:type="dxa" w:w="3000"/>
+            <w:tcW w:type="dxa" w:w="2100"/>
             <w:tcBorders>
               <w:top w:val="single" w:color="CCCCCC" w:sz="1"/>
               <w:left w:val="single" w:color="CCCCCC" w:sz="1"/>
@@ -3614,7 +3629,7 @@
         </w:tc>
         <w:tc>
           <w:tcPr>
-            <w:tcW w:type="dxa" w:w="2500"/>
+            <w:tcW w:type="dxa" w:w="2000"/>
             <w:tcBorders>
               <w:top w:val="single" w:color="CCCCCC" w:sz="1"/>
               <w:left w:val="single" w:color="CCCCCC" w:sz="1"/>
@@ -3650,7 +3665,7 @@
         </w:tc>
         <w:tc>
           <w:tcPr>
-            <w:tcW w:type="dxa" w:w="2000"/>
+            <w:tcW w:type="dxa" w:w="1700"/>
             <w:tcBorders>
               <w:top w:val="single" w:color="CCCCCC" w:sz="1"/>
               <w:left w:val="single" w:color="CCCCCC" w:sz="1"/>
@@ -3686,7 +3701,7 @@
         </w:tc>
         <w:tc>
           <w:tcPr>
-            <w:tcW w:type="dxa" w:w="3000"/>
+            <w:tcW w:type="dxa" w:w="2704"/>
             <w:tcBorders>
               <w:top w:val="single" w:color="CCCCCC" w:sz="1"/>
               <w:left w:val="single" w:color="CCCCCC" w:sz="1"/>
@@ -3912,7 +3927,7 @@
     </w:p>
     <w:tbl>
       <w:tblPr>
-        <w:tblW w:type="dxa" w:w="10400"/>
+        <w:tblW w:type="dxa" w:w="8504"/>
         <w:tblBorders>
           <w:top w:val="single" w:color="auto" w:sz="4"/>
           <w:left w:val="single" w:color="auto" w:sz="4"/>
@@ -3923,15 +3938,15 @@
         </w:tblBorders>
       </w:tblPr>
       <w:tblGrid>
-        <w:gridCol w:w="2400"/>
-        <w:gridCol w:w="2700"/>
-        <w:gridCol w:w="2400"/>
-        <w:gridCol w:w="2900"/>
+        <w:gridCol w:w="1900"/>
+        <w:gridCol w:w="2300"/>
+        <w:gridCol w:w="2000"/>
+        <w:gridCol w:w="2304"/>
       </w:tblGrid>
       <w:tr>
         <w:tc>
           <w:tcPr>
-            <w:tcW w:type="dxa" w:w="2400"/>
+            <w:tcW w:type="dxa" w:w="1900"/>
             <w:tcBorders>
               <w:top w:val="single" w:color="CCCCCC" w:sz="1"/>
               <w:left w:val="single" w:color="CCCCCC" w:sz="1"/>
@@ -3967,7 +3982,7 @@
         </w:tc>
         <w:tc>
           <w:tcPr>
-            <w:tcW w:type="dxa" w:w="2700"/>
+            <w:tcW w:type="dxa" w:w="2300"/>
             <w:tcBorders>
               <w:top w:val="single" w:color="CCCCCC" w:sz="1"/>
               <w:left w:val="single" w:color="CCCCCC" w:sz="1"/>
@@ -4003,7 +4018,7 @@
         </w:tc>
         <w:tc>
           <w:tcPr>
-            <w:tcW w:type="dxa" w:w="2400"/>
+            <w:tcW w:type="dxa" w:w="2000"/>
             <w:tcBorders>
               <w:top w:val="single" w:color="CCCCCC" w:sz="1"/>
               <w:left w:val="single" w:color="CCCCCC" w:sz="1"/>
@@ -4039,7 +4054,7 @@
         </w:tc>
         <w:tc>
           <w:tcPr>
-            <w:tcW w:type="dxa" w:w="2900"/>
+            <w:tcW w:type="dxa" w:w="2304"/>
             <w:tcBorders>
               <w:top w:val="single" w:color="CCCCCC" w:sz="1"/>
               <w:left w:val="single" w:color="CCCCCC" w:sz="1"/>
@@ -4077,7 +4092,7 @@
       <w:tr>
         <w:tc>
           <w:tcPr>
-            <w:tcW w:type="dxa" w:w="2400"/>
+            <w:tcW w:type="dxa" w:w="1900"/>
             <w:tcBorders>
               <w:top w:val="single" w:color="CCCCCC" w:sz="1"/>
               <w:left w:val="single" w:color="CCCCCC" w:sz="1"/>
@@ -4113,7 +4128,7 @@
         </w:tc>
         <w:tc>
           <w:tcPr>
-            <w:tcW w:type="dxa" w:w="2700"/>
+            <w:tcW w:type="dxa" w:w="2300"/>
             <w:tcBorders>
               <w:top w:val="single" w:color="CCCCCC" w:sz="1"/>
               <w:left w:val="single" w:color="CCCCCC" w:sz="1"/>
@@ -4149,7 +4164,7 @@
         </w:tc>
         <w:tc>
           <w:tcPr>
-            <w:tcW w:type="dxa" w:w="2400"/>
+            <w:tcW w:type="dxa" w:w="2000"/>
             <w:tcBorders>
               <w:top w:val="single" w:color="CCCCCC" w:sz="1"/>
               <w:left w:val="single" w:color="CCCCCC" w:sz="1"/>
@@ -4185,7 +4200,7 @@
         </w:tc>
         <w:tc>
           <w:tcPr>
-            <w:tcW w:type="dxa" w:w="2900"/>
+            <w:tcW w:type="dxa" w:w="2304"/>
             <w:tcBorders>
               <w:top w:val="single" w:color="CCCCCC" w:sz="1"/>
               <w:left w:val="single" w:color="CCCCCC" w:sz="1"/>
@@ -4223,7 +4238,7 @@
       <w:tr>
         <w:tc>
           <w:tcPr>
-            <w:tcW w:type="dxa" w:w="2400"/>
+            <w:tcW w:type="dxa" w:w="1900"/>
             <w:tcBorders>
               <w:top w:val="single" w:color="CCCCCC" w:sz="1"/>
               <w:left w:val="single" w:color="CCCCCC" w:sz="1"/>
@@ -4259,7 +4274,7 @@
         </w:tc>
         <w:tc>
           <w:tcPr>
-            <w:tcW w:type="dxa" w:w="2700"/>
+            <w:tcW w:type="dxa" w:w="2300"/>
             <w:tcBorders>
               <w:top w:val="single" w:color="CCCCCC" w:sz="1"/>
               <w:left w:val="single" w:color="CCCCCC" w:sz="1"/>
@@ -4295,7 +4310,7 @@
         </w:tc>
         <w:tc>
           <w:tcPr>
-            <w:tcW w:type="dxa" w:w="2400"/>
+            <w:tcW w:type="dxa" w:w="2000"/>
             <w:tcBorders>
               <w:top w:val="single" w:color="CCCCCC" w:sz="1"/>
               <w:left w:val="single" w:color="CCCCCC" w:sz="1"/>
@@ -4331,7 +4346,7 @@
         </w:tc>
         <w:tc>
           <w:tcPr>
-            <w:tcW w:type="dxa" w:w="2900"/>
+            <w:tcW w:type="dxa" w:w="2304"/>
             <w:tcBorders>
               <w:top w:val="single" w:color="CCCCCC" w:sz="1"/>
               <w:left w:val="single" w:color="CCCCCC" w:sz="1"/>
@@ -4369,7 +4384,7 @@
       <w:tr>
         <w:tc>
           <w:tcPr>
-            <w:tcW w:type="dxa" w:w="2400"/>
+            <w:tcW w:type="dxa" w:w="1900"/>
             <w:tcBorders>
               <w:top w:val="single" w:color="CCCCCC" w:sz="1"/>
               <w:left w:val="single" w:color="CCCCCC" w:sz="1"/>
@@ -4405,7 +4420,7 @@
         </w:tc>
         <w:tc>
           <w:tcPr>
-            <w:tcW w:type="dxa" w:w="2700"/>
+            <w:tcW w:type="dxa" w:w="2300"/>
             <w:tcBorders>
               <w:top w:val="single" w:color="CCCCCC" w:sz="1"/>
               <w:left w:val="single" w:color="CCCCCC" w:sz="1"/>
@@ -4441,7 +4456,7 @@
         </w:tc>
         <w:tc>
           <w:tcPr>
-            <w:tcW w:type="dxa" w:w="2400"/>
+            <w:tcW w:type="dxa" w:w="2000"/>
             <w:tcBorders>
               <w:top w:val="single" w:color="CCCCCC" w:sz="1"/>
               <w:left w:val="single" w:color="CCCCCC" w:sz="1"/>
@@ -4477,7 +4492,7 @@
         </w:tc>
         <w:tc>
           <w:tcPr>
-            <w:tcW w:type="dxa" w:w="2900"/>
+            <w:tcW w:type="dxa" w:w="2304"/>
             <w:tcBorders>
               <w:top w:val="single" w:color="CCCCCC" w:sz="1"/>
               <w:left w:val="single" w:color="CCCCCC" w:sz="1"/>
@@ -4515,7 +4530,7 @@
       <w:tr>
         <w:tc>
           <w:tcPr>
-            <w:tcW w:type="dxa" w:w="2400"/>
+            <w:tcW w:type="dxa" w:w="1900"/>
             <w:tcBorders>
               <w:top w:val="single" w:color="CCCCCC" w:sz="1"/>
               <w:left w:val="single" w:color="CCCCCC" w:sz="1"/>
@@ -4551,7 +4566,7 @@
         </w:tc>
         <w:tc>
           <w:tcPr>
-            <w:tcW w:type="dxa" w:w="2700"/>
+            <w:tcW w:type="dxa" w:w="2300"/>
             <w:tcBorders>
               <w:top w:val="single" w:color="CCCCCC" w:sz="1"/>
               <w:left w:val="single" w:color="CCCCCC" w:sz="1"/>
@@ -4587,7 +4602,7 @@
         </w:tc>
         <w:tc>
           <w:tcPr>
-            <w:tcW w:type="dxa" w:w="2400"/>
+            <w:tcW w:type="dxa" w:w="2000"/>
             <w:tcBorders>
               <w:top w:val="single" w:color="CCCCCC" w:sz="1"/>
               <w:left w:val="single" w:color="CCCCCC" w:sz="1"/>
@@ -4623,7 +4638,7 @@
         </w:tc>
         <w:tc>
           <w:tcPr>
-            <w:tcW w:type="dxa" w:w="2900"/>
+            <w:tcW w:type="dxa" w:w="2304"/>
             <w:tcBorders>
               <w:top w:val="single" w:color="CCCCCC" w:sz="1"/>
               <w:left w:val="single" w:color="CCCCCC" w:sz="1"/>
@@ -4661,7 +4676,7 @@
       <w:tr>
         <w:tc>
           <w:tcPr>
-            <w:tcW w:type="dxa" w:w="2400"/>
+            <w:tcW w:type="dxa" w:w="1900"/>
             <w:tcBorders>
               <w:top w:val="single" w:color="CCCCCC" w:sz="1"/>
               <w:left w:val="single" w:color="CCCCCC" w:sz="1"/>
@@ -4697,7 +4712,7 @@
         </w:tc>
         <w:tc>
           <w:tcPr>
-            <w:tcW w:type="dxa" w:w="2700"/>
+            <w:tcW w:type="dxa" w:w="2300"/>
             <w:tcBorders>
               <w:top w:val="single" w:color="CCCCCC" w:sz="1"/>
               <w:left w:val="single" w:color="CCCCCC" w:sz="1"/>
@@ -4733,7 +4748,7 @@
         </w:tc>
         <w:tc>
           <w:tcPr>
-            <w:tcW w:type="dxa" w:w="2400"/>
+            <w:tcW w:type="dxa" w:w="2000"/>
             <w:tcBorders>
               <w:top w:val="single" w:color="CCCCCC" w:sz="1"/>
               <w:left w:val="single" w:color="CCCCCC" w:sz="1"/>
@@ -4769,7 +4784,7 @@
         </w:tc>
         <w:tc>
           <w:tcPr>
-            <w:tcW w:type="dxa" w:w="2900"/>
+            <w:tcW w:type="dxa" w:w="2304"/>
             <w:tcBorders>
               <w:top w:val="single" w:color="CCCCCC" w:sz="1"/>
               <w:left w:val="single" w:color="CCCCCC" w:sz="1"/>
@@ -4807,7 +4822,7 @@
       <w:tr>
         <w:tc>
           <w:tcPr>
-            <w:tcW w:type="dxa" w:w="2400"/>
+            <w:tcW w:type="dxa" w:w="1900"/>
             <w:tcBorders>
               <w:top w:val="single" w:color="CCCCCC" w:sz="1"/>
               <w:left w:val="single" w:color="CCCCCC" w:sz="1"/>
@@ -4843,7 +4858,7 @@
         </w:tc>
         <w:tc>
           <w:tcPr>
-            <w:tcW w:type="dxa" w:w="2700"/>
+            <w:tcW w:type="dxa" w:w="2300"/>
             <w:tcBorders>
               <w:top w:val="single" w:color="CCCCCC" w:sz="1"/>
               <w:left w:val="single" w:color="CCCCCC" w:sz="1"/>
@@ -4879,7 +4894,7 @@
         </w:tc>
         <w:tc>
           <w:tcPr>
-            <w:tcW w:type="dxa" w:w="2400"/>
+            <w:tcW w:type="dxa" w:w="2000"/>
             <w:tcBorders>
               <w:top w:val="single" w:color="CCCCCC" w:sz="1"/>
               <w:left w:val="single" w:color="CCCCCC" w:sz="1"/>
@@ -4915,7 +4930,7 @@
         </w:tc>
         <w:tc>
           <w:tcPr>
-            <w:tcW w:type="dxa" w:w="2900"/>
+            <w:tcW w:type="dxa" w:w="2304"/>
             <w:tcBorders>
               <w:top w:val="single" w:color="CCCCCC" w:sz="1"/>
               <w:left w:val="single" w:color="CCCCCC" w:sz="1"/>
@@ -5232,7 +5247,7 @@
           <w:ilvl w:val="0"/>
           <w:numId w:val="3"/>
         </w:numPr>
-        <w:spacing w:after="80" w:before="0" w:line="360"/>
+        <w:spacing w:after="120" w:before="0" w:line="360" w:lineRule="auto"/>
         <w:jc w:val="both"/>
       </w:pPr>
       <w:r>
@@ -5252,7 +5267,7 @@
           <w:ilvl w:val="0"/>
           <w:numId w:val="3"/>
         </w:numPr>
-        <w:spacing w:after="80" w:before="0" w:line="360"/>
+        <w:spacing w:after="120" w:before="0" w:line="360" w:lineRule="auto"/>
         <w:jc w:val="both"/>
       </w:pPr>
       <w:r>
@@ -5272,7 +5287,7 @@
           <w:ilvl w:val="0"/>
           <w:numId w:val="3"/>
         </w:numPr>
-        <w:spacing w:after="80" w:before="0" w:line="360"/>
+        <w:spacing w:after="120" w:before="0" w:line="360" w:lineRule="auto"/>
         <w:jc w:val="both"/>
       </w:pPr>
       <w:r>
@@ -5292,7 +5307,7 @@
           <w:ilvl w:val="0"/>
           <w:numId w:val="3"/>
         </w:numPr>
-        <w:spacing w:after="80" w:before="0" w:line="360"/>
+        <w:spacing w:after="120" w:before="0" w:line="360" w:lineRule="auto"/>
         <w:jc w:val="both"/>
       </w:pPr>
       <w:r>
@@ -5312,7 +5327,7 @@
           <w:ilvl w:val="0"/>
           <w:numId w:val="3"/>
         </w:numPr>
-        <w:spacing w:after="80" w:before="0" w:line="360"/>
+        <w:spacing w:after="120" w:before="0" w:line="360" w:lineRule="auto"/>
         <w:jc w:val="both"/>
       </w:pPr>
       <w:r>
@@ -5332,7 +5347,7 @@
           <w:ilvl w:val="0"/>
           <w:numId w:val="3"/>
         </w:numPr>
-        <w:spacing w:after="80" w:before="0" w:line="360"/>
+        <w:spacing w:after="120" w:before="0" w:line="360" w:lineRule="auto"/>
         <w:jc w:val="both"/>
       </w:pPr>
       <w:r>
@@ -5413,7 +5428,7 @@
           <w:ilvl w:val="0"/>
           <w:numId w:val="2"/>
         </w:numPr>
-        <w:spacing w:after="80" w:before="0" w:line="360"/>
+        <w:spacing w:after="120" w:before="0" w:line="360" w:lineRule="auto"/>
         <w:jc w:val="both"/>
       </w:pPr>
       <w:r>
@@ -5444,7 +5459,7 @@
           <w:ilvl w:val="0"/>
           <w:numId w:val="2"/>
         </w:numPr>
-        <w:spacing w:after="80" w:before="0" w:line="360"/>
+        <w:spacing w:after="120" w:before="0" w:line="360" w:lineRule="auto"/>
         <w:jc w:val="both"/>
       </w:pPr>
       <w:r>
@@ -5851,6 +5866,21 @@
     </w:p>
     <w:p>
       <w:pPr>
+        <w:spacing w:after="120" w:before="0" w:line="360" w:lineRule="auto"/>
+        <w:jc w:val="both"/>
+      </w:pPr>
+      <w:r>
+        <w:rPr>
+          <w:rFonts w:ascii="Calibri" w:cs="Calibri" w:eastAsia="Calibri" w:hAnsi="Calibri"/>
+          <w:color w:val="404040"/>
+          <w:sz w:val="22"/>
+          <w:szCs w:val="22"/>
+        </w:rPr>
+        <w:t xml:space="preserve">La generación completa del dataset (datos, imágenes, augmentación, anotaciones y manipulaciones para el clasificador de autenticidad) tarda aproximadamente 25 minutos en el equipo de desarrollo y es totalmente reproducible: la semilla aleatoria fija garantiza que cualquier evaluador que ejecute generate_dataset.py con los mismos parámetros obtenga exactamente los mismos 400 expedientes, con los mismos nombres, NIFs, importes e inconsistencias. Esta reproducibilidad determinista es una ventaja adicional del enfoque sintético frente a los datasets reales: los resultados experimentales de este trabajo pueden replicarse íntegramente desde cero.</w:t>
+      </w:r>
+    </w:p>
+    <w:p>
+      <w:pPr>
         <w:pStyle w:val="Heading2"/>
         <w:spacing w:after="120" w:before="200"/>
       </w:pPr>
@@ -5929,7 +5959,7 @@
     </w:p>
     <w:tbl>
       <w:tblPr>
-        <w:tblW w:type="dxa" w:w="11700"/>
+        <w:tblW w:type="dxa" w:w="8504"/>
         <w:tblBorders>
           <w:top w:val="single" w:color="auto" w:sz="4"/>
           <w:left w:val="single" w:color="auto" w:sz="4"/>
@@ -5940,16 +5970,16 @@
         </w:tblBorders>
       </w:tblPr>
       <w:tblGrid>
-        <w:gridCol w:w="3500"/>
-        <w:gridCol w:w="2000"/>
-        <w:gridCol w:w="2500"/>
-        <w:gridCol w:w="2000"/>
+        <w:gridCol w:w="2600"/>
+        <w:gridCol w:w="1400"/>
         <w:gridCol w:w="1700"/>
+        <w:gridCol w:w="1500"/>
+        <w:gridCol w:w="1304"/>
       </w:tblGrid>
       <w:tr>
         <w:tc>
           <w:tcPr>
-            <w:tcW w:type="dxa" w:w="3500"/>
+            <w:tcW w:type="dxa" w:w="2600"/>
             <w:tcBorders>
               <w:top w:val="single" w:color="CCCCCC" w:sz="1"/>
               <w:left w:val="single" w:color="CCCCCC" w:sz="1"/>
@@ -5985,7 +6015,7 @@
         </w:tc>
         <w:tc>
           <w:tcPr>
-            <w:tcW w:type="dxa" w:w="2000"/>
+            <w:tcW w:type="dxa" w:w="1400"/>
             <w:tcBorders>
               <w:top w:val="single" w:color="CCCCCC" w:sz="1"/>
               <w:left w:val="single" w:color="CCCCCC" w:sz="1"/>
@@ -6021,7 +6051,7 @@
         </w:tc>
         <w:tc>
           <w:tcPr>
-            <w:tcW w:type="dxa" w:w="2500"/>
+            <w:tcW w:type="dxa" w:w="1700"/>
             <w:tcBorders>
               <w:top w:val="single" w:color="CCCCCC" w:sz="1"/>
               <w:left w:val="single" w:color="CCCCCC" w:sz="1"/>
@@ -6057,7 +6087,7 @@
         </w:tc>
         <w:tc>
           <w:tcPr>
-            <w:tcW w:type="dxa" w:w="2000"/>
+            <w:tcW w:type="dxa" w:w="1500"/>
             <w:tcBorders>
               <w:top w:val="single" w:color="CCCCCC" w:sz="1"/>
               <w:left w:val="single" w:color="CCCCCC" w:sz="1"/>
@@ -6093,7 +6123,7 @@
         </w:tc>
         <w:tc>
           <w:tcPr>
-            <w:tcW w:type="dxa" w:w="1700"/>
+            <w:tcW w:type="dxa" w:w="1304"/>
             <w:tcBorders>
               <w:top w:val="single" w:color="CCCCCC" w:sz="1"/>
               <w:left w:val="single" w:color="CCCCCC" w:sz="1"/>
@@ -6131,7 +6161,7 @@
       <w:tr>
         <w:tc>
           <w:tcPr>
-            <w:tcW w:type="dxa" w:w="3500"/>
+            <w:tcW w:type="dxa" w:w="2600"/>
             <w:tcBorders>
               <w:top w:val="single" w:color="CCCCCC" w:sz="1"/>
               <w:left w:val="single" w:color="CCCCCC" w:sz="1"/>
@@ -6167,7 +6197,7 @@
         </w:tc>
         <w:tc>
           <w:tcPr>
-            <w:tcW w:type="dxa" w:w="2000"/>
+            <w:tcW w:type="dxa" w:w="1400"/>
             <w:tcBorders>
               <w:top w:val="single" w:color="CCCCCC" w:sz="1"/>
               <w:left w:val="single" w:color="CCCCCC" w:sz="1"/>
@@ -6203,7 +6233,7 @@
         </w:tc>
         <w:tc>
           <w:tcPr>
-            <w:tcW w:type="dxa" w:w="2500"/>
+            <w:tcW w:type="dxa" w:w="1700"/>
             <w:tcBorders>
               <w:top w:val="single" w:color="CCCCCC" w:sz="1"/>
               <w:left w:val="single" w:color="CCCCCC" w:sz="1"/>
@@ -6239,7 +6269,7 @@
         </w:tc>
         <w:tc>
           <w:tcPr>
-            <w:tcW w:type="dxa" w:w="2000"/>
+            <w:tcW w:type="dxa" w:w="1500"/>
             <w:tcBorders>
               <w:top w:val="single" w:color="CCCCCC" w:sz="1"/>
               <w:left w:val="single" w:color="CCCCCC" w:sz="1"/>
@@ -6275,7 +6305,7 @@
         </w:tc>
         <w:tc>
           <w:tcPr>
-            <w:tcW w:type="dxa" w:w="1700"/>
+            <w:tcW w:type="dxa" w:w="1304"/>
             <w:tcBorders>
               <w:top w:val="single" w:color="CCCCCC" w:sz="1"/>
               <w:left w:val="single" w:color="CCCCCC" w:sz="1"/>
@@ -6313,7 +6343,7 @@
       <w:tr>
         <w:tc>
           <w:tcPr>
-            <w:tcW w:type="dxa" w:w="3500"/>
+            <w:tcW w:type="dxa" w:w="2600"/>
             <w:tcBorders>
               <w:top w:val="single" w:color="CCCCCC" w:sz="1"/>
               <w:left w:val="single" w:color="CCCCCC" w:sz="1"/>
@@ -6349,7 +6379,7 @@
         </w:tc>
         <w:tc>
           <w:tcPr>
-            <w:tcW w:type="dxa" w:w="2000"/>
+            <w:tcW w:type="dxa" w:w="1400"/>
             <w:tcBorders>
               <w:top w:val="single" w:color="CCCCCC" w:sz="1"/>
               <w:left w:val="single" w:color="CCCCCC" w:sz="1"/>
@@ -6385,7 +6415,7 @@
         </w:tc>
         <w:tc>
           <w:tcPr>
-            <w:tcW w:type="dxa" w:w="2500"/>
+            <w:tcW w:type="dxa" w:w="1700"/>
             <w:tcBorders>
               <w:top w:val="single" w:color="CCCCCC" w:sz="1"/>
               <w:left w:val="single" w:color="CCCCCC" w:sz="1"/>
@@ -6421,7 +6451,7 @@
         </w:tc>
         <w:tc>
           <w:tcPr>
-            <w:tcW w:type="dxa" w:w="2000"/>
+            <w:tcW w:type="dxa" w:w="1500"/>
             <w:tcBorders>
               <w:top w:val="single" w:color="CCCCCC" w:sz="1"/>
               <w:left w:val="single" w:color="CCCCCC" w:sz="1"/>
@@ -6457,7 +6487,7 @@
         </w:tc>
         <w:tc>
           <w:tcPr>
-            <w:tcW w:type="dxa" w:w="1700"/>
+            <w:tcW w:type="dxa" w:w="1304"/>
             <w:tcBorders>
               <w:top w:val="single" w:color="CCCCCC" w:sz="1"/>
               <w:left w:val="single" w:color="CCCCCC" w:sz="1"/>
@@ -6587,7 +6617,7 @@
     </w:p>
     <w:tbl>
       <w:tblPr>
-        <w:tblW w:type="dxa" w:w="9500"/>
+        <w:tblW w:type="dxa" w:w="8504"/>
         <w:tblBorders>
           <w:top w:val="single" w:color="auto" w:sz="4"/>
           <w:left w:val="single" w:color="auto" w:sz="4"/>
@@ -6598,14 +6628,14 @@
         </w:tblBorders>
       </w:tblPr>
       <w:tblGrid>
-        <w:gridCol w:w="4000"/>
-        <w:gridCol w:w="3000"/>
-        <w:gridCol w:w="2500"/>
+        <w:gridCol w:w="3400"/>
+        <w:gridCol w:w="2600"/>
+        <w:gridCol w:w="2504"/>
       </w:tblGrid>
       <w:tr>
         <w:tc>
           <w:tcPr>
-            <w:tcW w:type="dxa" w:w="4000"/>
+            <w:tcW w:type="dxa" w:w="3400"/>
             <w:tcBorders>
               <w:top w:val="single" w:color="CCCCCC" w:sz="1"/>
               <w:left w:val="single" w:color="CCCCCC" w:sz="1"/>
@@ -6641,7 +6671,7 @@
         </w:tc>
         <w:tc>
           <w:tcPr>
-            <w:tcW w:type="dxa" w:w="3000"/>
+            <w:tcW w:type="dxa" w:w="2600"/>
             <w:tcBorders>
               <w:top w:val="single" w:color="CCCCCC" w:sz="1"/>
               <w:left w:val="single" w:color="CCCCCC" w:sz="1"/>
@@ -6677,7 +6707,7 @@
         </w:tc>
         <w:tc>
           <w:tcPr>
-            <w:tcW w:type="dxa" w:w="2500"/>
+            <w:tcW w:type="dxa" w:w="2504"/>
             <w:tcBorders>
               <w:top w:val="single" w:color="CCCCCC" w:sz="1"/>
               <w:left w:val="single" w:color="CCCCCC" w:sz="1"/>
@@ -6715,7 +6745,7 @@
       <w:tr>
         <w:tc>
           <w:tcPr>
-            <w:tcW w:type="dxa" w:w="4000"/>
+            <w:tcW w:type="dxa" w:w="3400"/>
             <w:tcBorders>
               <w:top w:val="single" w:color="CCCCCC" w:sz="1"/>
               <w:left w:val="single" w:color="CCCCCC" w:sz="1"/>
@@ -6751,7 +6781,7 @@
         </w:tc>
         <w:tc>
           <w:tcPr>
-            <w:tcW w:type="dxa" w:w="3000"/>
+            <w:tcW w:type="dxa" w:w="2600"/>
             <w:tcBorders>
               <w:top w:val="single" w:color="CCCCCC" w:sz="1"/>
               <w:left w:val="single" w:color="CCCCCC" w:sz="1"/>
@@ -6787,7 +6817,7 @@
         </w:tc>
         <w:tc>
           <w:tcPr>
-            <w:tcW w:type="dxa" w:w="2500"/>
+            <w:tcW w:type="dxa" w:w="2504"/>
             <w:tcBorders>
               <w:top w:val="single" w:color="CCCCCC" w:sz="1"/>
               <w:left w:val="single" w:color="CCCCCC" w:sz="1"/>
@@ -6825,7 +6855,7 @@
       <w:tr>
         <w:tc>
           <w:tcPr>
-            <w:tcW w:type="dxa" w:w="4000"/>
+            <w:tcW w:type="dxa" w:w="3400"/>
             <w:tcBorders>
               <w:top w:val="single" w:color="CCCCCC" w:sz="1"/>
               <w:left w:val="single" w:color="CCCCCC" w:sz="1"/>
@@ -6861,7 +6891,7 @@
         </w:tc>
         <w:tc>
           <w:tcPr>
-            <w:tcW w:type="dxa" w:w="3000"/>
+            <w:tcW w:type="dxa" w:w="2600"/>
             <w:tcBorders>
               <w:top w:val="single" w:color="CCCCCC" w:sz="1"/>
               <w:left w:val="single" w:color="CCCCCC" w:sz="1"/>
@@ -6897,7 +6927,7 @@
         </w:tc>
         <w:tc>
           <w:tcPr>
-            <w:tcW w:type="dxa" w:w="2500"/>
+            <w:tcW w:type="dxa" w:w="2504"/>
             <w:tcBorders>
               <w:top w:val="single" w:color="CCCCCC" w:sz="1"/>
               <w:left w:val="single" w:color="CCCCCC" w:sz="1"/>
@@ -6935,7 +6965,7 @@
       <w:tr>
         <w:tc>
           <w:tcPr>
-            <w:tcW w:type="dxa" w:w="4000"/>
+            <w:tcW w:type="dxa" w:w="3400"/>
             <w:tcBorders>
               <w:top w:val="single" w:color="CCCCCC" w:sz="1"/>
               <w:left w:val="single" w:color="CCCCCC" w:sz="1"/>
@@ -6971,7 +7001,7 @@
         </w:tc>
         <w:tc>
           <w:tcPr>
-            <w:tcW w:type="dxa" w:w="3000"/>
+            <w:tcW w:type="dxa" w:w="2600"/>
             <w:tcBorders>
               <w:top w:val="single" w:color="CCCCCC" w:sz="1"/>
               <w:left w:val="single" w:color="CCCCCC" w:sz="1"/>
@@ -7007,7 +7037,7 @@
         </w:tc>
         <w:tc>
           <w:tcPr>
-            <w:tcW w:type="dxa" w:w="2500"/>
+            <w:tcW w:type="dxa" w:w="2504"/>
             <w:tcBorders>
               <w:top w:val="single" w:color="CCCCCC" w:sz="1"/>
               <w:left w:val="single" w:color="CCCCCC" w:sz="1"/>
@@ -7045,7 +7075,7 @@
       <w:tr>
         <w:tc>
           <w:tcPr>
-            <w:tcW w:type="dxa" w:w="4000"/>
+            <w:tcW w:type="dxa" w:w="3400"/>
             <w:tcBorders>
               <w:top w:val="single" w:color="CCCCCC" w:sz="1"/>
               <w:left w:val="single" w:color="CCCCCC" w:sz="1"/>
@@ -7081,7 +7111,7 @@
         </w:tc>
         <w:tc>
           <w:tcPr>
-            <w:tcW w:type="dxa" w:w="3000"/>
+            <w:tcW w:type="dxa" w:w="2600"/>
             <w:tcBorders>
               <w:top w:val="single" w:color="CCCCCC" w:sz="1"/>
               <w:left w:val="single" w:color="CCCCCC" w:sz="1"/>
@@ -7117,7 +7147,7 @@
         </w:tc>
         <w:tc>
           <w:tcPr>
-            <w:tcW w:type="dxa" w:w="2500"/>
+            <w:tcW w:type="dxa" w:w="2504"/>
             <w:tcBorders>
               <w:top w:val="single" w:color="CCCCCC" w:sz="1"/>
               <w:left w:val="single" w:color="CCCCCC" w:sz="1"/>
@@ -7155,7 +7185,7 @@
       <w:tr>
         <w:tc>
           <w:tcPr>
-            <w:tcW w:type="dxa" w:w="4000"/>
+            <w:tcW w:type="dxa" w:w="3400"/>
             <w:tcBorders>
               <w:top w:val="single" w:color="CCCCCC" w:sz="1"/>
               <w:left w:val="single" w:color="CCCCCC" w:sz="1"/>
@@ -7191,7 +7221,7 @@
         </w:tc>
         <w:tc>
           <w:tcPr>
-            <w:tcW w:type="dxa" w:w="3000"/>
+            <w:tcW w:type="dxa" w:w="2600"/>
             <w:tcBorders>
               <w:top w:val="single" w:color="CCCCCC" w:sz="1"/>
               <w:left w:val="single" w:color="CCCCCC" w:sz="1"/>
@@ -7227,7 +7257,7 @@
         </w:tc>
         <w:tc>
           <w:tcPr>
-            <w:tcW w:type="dxa" w:w="2500"/>
+            <w:tcW w:type="dxa" w:w="2504"/>
             <w:tcBorders>
               <w:top w:val="single" w:color="CCCCCC" w:sz="1"/>
               <w:left w:val="single" w:color="CCCCCC" w:sz="1"/>
@@ -7372,7 +7402,7 @@
     </w:p>
     <w:tbl>
       <w:tblPr>
-        <w:tblW w:type="dxa" w:w="10000"/>
+        <w:tblW w:type="dxa" w:w="8504"/>
         <w:tblBorders>
           <w:top w:val="single" w:color="auto" w:sz="4"/>
           <w:left w:val="single" w:color="auto" w:sz="4"/>
@@ -7383,14 +7413,14 @@
         </w:tblBorders>
       </w:tblPr>
       <w:tblGrid>
-        <w:gridCol w:w="4500"/>
-        <w:gridCol w:w="2750"/>
-        <w:gridCol w:w="2750"/>
+        <w:gridCol w:w="3800"/>
+        <w:gridCol w:w="2350"/>
+        <w:gridCol w:w="2354"/>
       </w:tblGrid>
       <w:tr>
         <w:tc>
           <w:tcPr>
-            <w:tcW w:type="dxa" w:w="4500"/>
+            <w:tcW w:type="dxa" w:w="3800"/>
             <w:tcBorders>
               <w:top w:val="single" w:color="CCCCCC" w:sz="1"/>
               <w:left w:val="single" w:color="CCCCCC" w:sz="1"/>
@@ -7426,7 +7456,7 @@
         </w:tc>
         <w:tc>
           <w:tcPr>
-            <w:tcW w:type="dxa" w:w="2750"/>
+            <w:tcW w:type="dxa" w:w="2350"/>
             <w:tcBorders>
               <w:top w:val="single" w:color="CCCCCC" w:sz="1"/>
               <w:left w:val="single" w:color="CCCCCC" w:sz="1"/>
@@ -7462,7 +7492,7 @@
         </w:tc>
         <w:tc>
           <w:tcPr>
-            <w:tcW w:type="dxa" w:w="2750"/>
+            <w:tcW w:type="dxa" w:w="2354"/>
             <w:tcBorders>
               <w:top w:val="single" w:color="CCCCCC" w:sz="1"/>
               <w:left w:val="single" w:color="CCCCCC" w:sz="1"/>
@@ -7500,7 +7530,7 @@
       <w:tr>
         <w:tc>
           <w:tcPr>
-            <w:tcW w:type="dxa" w:w="4500"/>
+            <w:tcW w:type="dxa" w:w="3800"/>
             <w:tcBorders>
               <w:top w:val="single" w:color="CCCCCC" w:sz="1"/>
               <w:left w:val="single" w:color="CCCCCC" w:sz="1"/>
@@ -7536,7 +7566,7 @@
         </w:tc>
         <w:tc>
           <w:tcPr>
-            <w:tcW w:type="dxa" w:w="2750"/>
+            <w:tcW w:type="dxa" w:w="2350"/>
             <w:tcBorders>
               <w:top w:val="single" w:color="CCCCCC" w:sz="1"/>
               <w:left w:val="single" w:color="CCCCCC" w:sz="1"/>
@@ -7572,7 +7602,7 @@
         </w:tc>
         <w:tc>
           <w:tcPr>
-            <w:tcW w:type="dxa" w:w="2750"/>
+            <w:tcW w:type="dxa" w:w="2354"/>
             <w:tcBorders>
               <w:top w:val="single" w:color="CCCCCC" w:sz="1"/>
               <w:left w:val="single" w:color="CCCCCC" w:sz="1"/>
@@ -7610,7 +7640,7 @@
       <w:tr>
         <w:tc>
           <w:tcPr>
-            <w:tcW w:type="dxa" w:w="4500"/>
+            <w:tcW w:type="dxa" w:w="3800"/>
             <w:tcBorders>
               <w:top w:val="single" w:color="CCCCCC" w:sz="1"/>
               <w:left w:val="single" w:color="CCCCCC" w:sz="1"/>
@@ -7646,7 +7676,7 @@
         </w:tc>
         <w:tc>
           <w:tcPr>
-            <w:tcW w:type="dxa" w:w="2750"/>
+            <w:tcW w:type="dxa" w:w="2350"/>
             <w:tcBorders>
               <w:top w:val="single" w:color="CCCCCC" w:sz="1"/>
               <w:left w:val="single" w:color="CCCCCC" w:sz="1"/>
@@ -7682,7 +7712,7 @@
         </w:tc>
         <w:tc>
           <w:tcPr>
-            <w:tcW w:type="dxa" w:w="2750"/>
+            <w:tcW w:type="dxa" w:w="2354"/>
             <w:tcBorders>
               <w:top w:val="single" w:color="CCCCCC" w:sz="1"/>
               <w:left w:val="single" w:color="CCCCCC" w:sz="1"/>
@@ -7720,7 +7750,7 @@
       <w:tr>
         <w:tc>
           <w:tcPr>
-            <w:tcW w:type="dxa" w:w="4500"/>
+            <w:tcW w:type="dxa" w:w="3800"/>
             <w:tcBorders>
               <w:top w:val="single" w:color="CCCCCC" w:sz="1"/>
               <w:left w:val="single" w:color="CCCCCC" w:sz="1"/>
@@ -7756,7 +7786,7 @@
         </w:tc>
         <w:tc>
           <w:tcPr>
-            <w:tcW w:type="dxa" w:w="2750"/>
+            <w:tcW w:type="dxa" w:w="2350"/>
             <w:tcBorders>
               <w:top w:val="single" w:color="CCCCCC" w:sz="1"/>
               <w:left w:val="single" w:color="CCCCCC" w:sz="1"/>
@@ -7792,7 +7822,7 @@
         </w:tc>
         <w:tc>
           <w:tcPr>
-            <w:tcW w:type="dxa" w:w="2750"/>
+            <w:tcW w:type="dxa" w:w="2354"/>
             <w:tcBorders>
               <w:top w:val="single" w:color="CCCCCC" w:sz="1"/>
               <w:left w:val="single" w:color="CCCCCC" w:sz="1"/>
@@ -7830,7 +7860,7 @@
       <w:tr>
         <w:tc>
           <w:tcPr>
-            <w:tcW w:type="dxa" w:w="4500"/>
+            <w:tcW w:type="dxa" w:w="3800"/>
             <w:tcBorders>
               <w:top w:val="single" w:color="CCCCCC" w:sz="1"/>
               <w:left w:val="single" w:color="CCCCCC" w:sz="1"/>
@@ -7866,7 +7896,7 @@
         </w:tc>
         <w:tc>
           <w:tcPr>
-            <w:tcW w:type="dxa" w:w="2750"/>
+            <w:tcW w:type="dxa" w:w="2350"/>
             <w:tcBorders>
               <w:top w:val="single" w:color="CCCCCC" w:sz="1"/>
               <w:left w:val="single" w:color="CCCCCC" w:sz="1"/>
@@ -7902,7 +7932,7 @@
         </w:tc>
         <w:tc>
           <w:tcPr>
-            <w:tcW w:type="dxa" w:w="2750"/>
+            <w:tcW w:type="dxa" w:w="2354"/>
             <w:tcBorders>
               <w:top w:val="single" w:color="CCCCCC" w:sz="1"/>
               <w:left w:val="single" w:color="CCCCCC" w:sz="1"/>
@@ -7940,7 +7970,7 @@
       <w:tr>
         <w:tc>
           <w:tcPr>
-            <w:tcW w:type="dxa" w:w="4500"/>
+            <w:tcW w:type="dxa" w:w="3800"/>
             <w:tcBorders>
               <w:top w:val="single" w:color="CCCCCC" w:sz="1"/>
               <w:left w:val="single" w:color="CCCCCC" w:sz="1"/>
@@ -7976,7 +8006,7 @@
         </w:tc>
         <w:tc>
           <w:tcPr>
-            <w:tcW w:type="dxa" w:w="2750"/>
+            <w:tcW w:type="dxa" w:w="2350"/>
             <w:tcBorders>
               <w:top w:val="single" w:color="CCCCCC" w:sz="1"/>
               <w:left w:val="single" w:color="CCCCCC" w:sz="1"/>
@@ -8012,7 +8042,7 @@
         </w:tc>
         <w:tc>
           <w:tcPr>
-            <w:tcW w:type="dxa" w:w="2750"/>
+            <w:tcW w:type="dxa" w:w="2354"/>
             <w:tcBorders>
               <w:top w:val="single" w:color="CCCCCC" w:sz="1"/>
               <w:left w:val="single" w:color="CCCCCC" w:sz="1"/>
@@ -8050,7 +8080,7 @@
       <w:tr>
         <w:tc>
           <w:tcPr>
-            <w:tcW w:type="dxa" w:w="4500"/>
+            <w:tcW w:type="dxa" w:w="3800"/>
             <w:tcBorders>
               <w:top w:val="single" w:color="CCCCCC" w:sz="1"/>
               <w:left w:val="single" w:color="CCCCCC" w:sz="1"/>
@@ -8086,7 +8116,7 @@
         </w:tc>
         <w:tc>
           <w:tcPr>
-            <w:tcW w:type="dxa" w:w="2750"/>
+            <w:tcW w:type="dxa" w:w="2350"/>
             <w:tcBorders>
               <w:top w:val="single" w:color="CCCCCC" w:sz="1"/>
               <w:left w:val="single" w:color="CCCCCC" w:sz="1"/>
@@ -8122,7 +8152,7 @@
         </w:tc>
         <w:tc>
           <w:tcPr>
-            <w:tcW w:type="dxa" w:w="2750"/>
+            <w:tcW w:type="dxa" w:w="2354"/>
             <w:tcBorders>
               <w:top w:val="single" w:color="CCCCCC" w:sz="1"/>
               <w:left w:val="single" w:color="CCCCCC" w:sz="1"/>
@@ -8160,7 +8190,7 @@
       <w:tr>
         <w:tc>
           <w:tcPr>
-            <w:tcW w:type="dxa" w:w="4500"/>
+            <w:tcW w:type="dxa" w:w="3800"/>
             <w:tcBorders>
               <w:top w:val="single" w:color="CCCCCC" w:sz="1"/>
               <w:left w:val="single" w:color="CCCCCC" w:sz="1"/>
@@ -8196,7 +8226,7 @@
         </w:tc>
         <w:tc>
           <w:tcPr>
-            <w:tcW w:type="dxa" w:w="2750"/>
+            <w:tcW w:type="dxa" w:w="2350"/>
             <w:tcBorders>
               <w:top w:val="single" w:color="CCCCCC" w:sz="1"/>
               <w:left w:val="single" w:color="CCCCCC" w:sz="1"/>
@@ -8232,7 +8262,7 @@
         </w:tc>
         <w:tc>
           <w:tcPr>
-            <w:tcW w:type="dxa" w:w="2750"/>
+            <w:tcW w:type="dxa" w:w="2354"/>
             <w:tcBorders>
               <w:top w:val="single" w:color="CCCCCC" w:sz="1"/>
               <w:left w:val="single" w:color="CCCCCC" w:sz="1"/>
@@ -8270,7 +8300,7 @@
       <w:tr>
         <w:tc>
           <w:tcPr>
-            <w:tcW w:type="dxa" w:w="4500"/>
+            <w:tcW w:type="dxa" w:w="3800"/>
             <w:tcBorders>
               <w:top w:val="single" w:color="CCCCCC" w:sz="1"/>
               <w:left w:val="single" w:color="CCCCCC" w:sz="1"/>
@@ -8306,7 +8336,7 @@
         </w:tc>
         <w:tc>
           <w:tcPr>
-            <w:tcW w:type="dxa" w:w="2750"/>
+            <w:tcW w:type="dxa" w:w="2350"/>
             <w:tcBorders>
               <w:top w:val="single" w:color="CCCCCC" w:sz="1"/>
               <w:left w:val="single" w:color="CCCCCC" w:sz="1"/>
@@ -8342,7 +8372,7 @@
         </w:tc>
         <w:tc>
           <w:tcPr>
-            <w:tcW w:type="dxa" w:w="2750"/>
+            <w:tcW w:type="dxa" w:w="2354"/>
             <w:tcBorders>
               <w:top w:val="single" w:color="CCCCCC" w:sz="1"/>
               <w:left w:val="single" w:color="CCCCCC" w:sz="1"/>
@@ -8380,7 +8410,7 @@
       <w:tr>
         <w:tc>
           <w:tcPr>
-            <w:tcW w:type="dxa" w:w="4500"/>
+            <w:tcW w:type="dxa" w:w="3800"/>
             <w:tcBorders>
               <w:top w:val="single" w:color="CCCCCC" w:sz="1"/>
               <w:left w:val="single" w:color="CCCCCC" w:sz="1"/>
@@ -8416,7 +8446,7 @@
         </w:tc>
         <w:tc>
           <w:tcPr>
-            <w:tcW w:type="dxa" w:w="2750"/>
+            <w:tcW w:type="dxa" w:w="2350"/>
             <w:tcBorders>
               <w:top w:val="single" w:color="CCCCCC" w:sz="1"/>
               <w:left w:val="single" w:color="CCCCCC" w:sz="1"/>
@@ -8452,7 +8482,7 @@
         </w:tc>
         <w:tc>
           <w:tcPr>
-            <w:tcW w:type="dxa" w:w="2750"/>
+            <w:tcW w:type="dxa" w:w="2354"/>
             <w:tcBorders>
               <w:top w:val="single" w:color="CCCCCC" w:sz="1"/>
               <w:left w:val="single" w:color="CCCCCC" w:sz="1"/>
@@ -8597,7 +8627,7 @@
     </w:p>
     <w:tbl>
       <w:tblPr>
-        <w:tblW w:type="dxa" w:w="9500"/>
+        <w:tblW w:type="dxa" w:w="8504"/>
         <w:tblBorders>
           <w:top w:val="single" w:color="auto" w:sz="4"/>
           <w:left w:val="single" w:color="auto" w:sz="4"/>
@@ -8608,13 +8638,13 @@
         </w:tblBorders>
       </w:tblPr>
       <w:tblGrid>
-        <w:gridCol w:w="6000"/>
-        <w:gridCol w:w="3500"/>
+        <w:gridCol w:w="5600"/>
+        <w:gridCol w:w="2904"/>
       </w:tblGrid>
       <w:tr>
         <w:tc>
           <w:tcPr>
-            <w:tcW w:type="dxa" w:w="6000"/>
+            <w:tcW w:type="dxa" w:w="5600"/>
             <w:tcBorders>
               <w:top w:val="single" w:color="CCCCCC" w:sz="1"/>
               <w:left w:val="single" w:color="CCCCCC" w:sz="1"/>
@@ -8650,7 +8680,7 @@
         </w:tc>
         <w:tc>
           <w:tcPr>
-            <w:tcW w:type="dxa" w:w="3500"/>
+            <w:tcW w:type="dxa" w:w="2904"/>
             <w:tcBorders>
               <w:top w:val="single" w:color="CCCCCC" w:sz="1"/>
               <w:left w:val="single" w:color="CCCCCC" w:sz="1"/>
@@ -8688,7 +8718,7 @@
       <w:tr>
         <w:tc>
           <w:tcPr>
-            <w:tcW w:type="dxa" w:w="6000"/>
+            <w:tcW w:type="dxa" w:w="5600"/>
             <w:tcBorders>
               <w:top w:val="single" w:color="CCCCCC" w:sz="1"/>
               <w:left w:val="single" w:color="CCCCCC" w:sz="1"/>
@@ -8724,7 +8754,7 @@
         </w:tc>
         <w:tc>
           <w:tcPr>
-            <w:tcW w:type="dxa" w:w="3500"/>
+            <w:tcW w:type="dxa" w:w="2904"/>
             <w:tcBorders>
               <w:top w:val="single" w:color="CCCCCC" w:sz="1"/>
               <w:left w:val="single" w:color="CCCCCC" w:sz="1"/>
@@ -8762,7 +8792,7 @@
       <w:tr>
         <w:tc>
           <w:tcPr>
-            <w:tcW w:type="dxa" w:w="6000"/>
+            <w:tcW w:type="dxa" w:w="5600"/>
             <w:tcBorders>
               <w:top w:val="single" w:color="CCCCCC" w:sz="1"/>
               <w:left w:val="single" w:color="CCCCCC" w:sz="1"/>
@@ -8798,7 +8828,7 @@
         </w:tc>
         <w:tc>
           <w:tcPr>
-            <w:tcW w:type="dxa" w:w="3500"/>
+            <w:tcW w:type="dxa" w:w="2904"/>
             <w:tcBorders>
               <w:top w:val="single" w:color="CCCCCC" w:sz="1"/>
               <w:left w:val="single" w:color="CCCCCC" w:sz="1"/>
@@ -8836,7 +8866,7 @@
       <w:tr>
         <w:tc>
           <w:tcPr>
-            <w:tcW w:type="dxa" w:w="6000"/>
+            <w:tcW w:type="dxa" w:w="5600"/>
             <w:tcBorders>
               <w:top w:val="single" w:color="CCCCCC" w:sz="1"/>
               <w:left w:val="single" w:color="CCCCCC" w:sz="1"/>
@@ -8872,7 +8902,7 @@
         </w:tc>
         <w:tc>
           <w:tcPr>
-            <w:tcW w:type="dxa" w:w="3500"/>
+            <w:tcW w:type="dxa" w:w="2904"/>
             <w:tcBorders>
               <w:top w:val="single" w:color="CCCCCC" w:sz="1"/>
               <w:left w:val="single" w:color="CCCCCC" w:sz="1"/>
@@ -8910,7 +8940,7 @@
       <w:tr>
         <w:tc>
           <w:tcPr>
-            <w:tcW w:type="dxa" w:w="6000"/>
+            <w:tcW w:type="dxa" w:w="5600"/>
             <w:tcBorders>
               <w:top w:val="single" w:color="CCCCCC" w:sz="1"/>
               <w:left w:val="single" w:color="CCCCCC" w:sz="1"/>
@@ -8946,7 +8976,7 @@
         </w:tc>
         <w:tc>
           <w:tcPr>
-            <w:tcW w:type="dxa" w:w="3500"/>
+            <w:tcW w:type="dxa" w:w="2904"/>
             <w:tcBorders>
               <w:top w:val="single" w:color="CCCCCC" w:sz="1"/>
               <w:left w:val="single" w:color="CCCCCC" w:sz="1"/>
@@ -8984,7 +9014,7 @@
       <w:tr>
         <w:tc>
           <w:tcPr>
-            <w:tcW w:type="dxa" w:w="6000"/>
+            <w:tcW w:type="dxa" w:w="5600"/>
             <w:tcBorders>
               <w:top w:val="single" w:color="CCCCCC" w:sz="1"/>
               <w:left w:val="single" w:color="CCCCCC" w:sz="1"/>
@@ -9020,7 +9050,7 @@
         </w:tc>
         <w:tc>
           <w:tcPr>
-            <w:tcW w:type="dxa" w:w="3500"/>
+            <w:tcW w:type="dxa" w:w="2904"/>
             <w:tcBorders>
               <w:top w:val="single" w:color="CCCCCC" w:sz="1"/>
               <w:left w:val="single" w:color="CCCCCC" w:sz="1"/>
@@ -9058,7 +9088,7 @@
       <w:tr>
         <w:tc>
           <w:tcPr>
-            <w:tcW w:type="dxa" w:w="6000"/>
+            <w:tcW w:type="dxa" w:w="5600"/>
             <w:tcBorders>
               <w:top w:val="single" w:color="CCCCCC" w:sz="1"/>
               <w:left w:val="single" w:color="CCCCCC" w:sz="1"/>
@@ -9094,7 +9124,7 @@
         </w:tc>
         <w:tc>
           <w:tcPr>
-            <w:tcW w:type="dxa" w:w="3500"/>
+            <w:tcW w:type="dxa" w:w="2904"/>
             <w:tcBorders>
               <w:top w:val="single" w:color="CCCCCC" w:sz="1"/>
               <w:left w:val="single" w:color="CCCCCC" w:sz="1"/>
@@ -9230,7 +9260,7 @@
           <w:ilvl w:val="0"/>
           <w:numId w:val="3"/>
         </w:numPr>
-        <w:spacing w:after="80" w:before="0" w:line="360"/>
+        <w:spacing w:after="120" w:before="0" w:line="360" w:lineRule="auto"/>
         <w:jc w:val="both"/>
       </w:pPr>
       <w:r>
@@ -9250,7 +9280,7 @@
           <w:ilvl w:val="0"/>
           <w:numId w:val="3"/>
         </w:numPr>
-        <w:spacing w:after="80" w:before="0" w:line="360"/>
+        <w:spacing w:after="120" w:before="0" w:line="360" w:lineRule="auto"/>
         <w:jc w:val="both"/>
       </w:pPr>
       <w:r>
@@ -9270,7 +9300,7 @@
           <w:ilvl w:val="0"/>
           <w:numId w:val="3"/>
         </w:numPr>
-        <w:spacing w:after="80" w:before="0" w:line="360"/>
+        <w:spacing w:after="120" w:before="0" w:line="360" w:lineRule="auto"/>
         <w:jc w:val="both"/>
       </w:pPr>
       <w:r>
@@ -9290,7 +9320,7 @@
           <w:ilvl w:val="0"/>
           <w:numId w:val="3"/>
         </w:numPr>
-        <w:spacing w:after="80" w:before="0" w:line="360"/>
+        <w:spacing w:after="120" w:before="0" w:line="360" w:lineRule="auto"/>
         <w:jc w:val="both"/>
       </w:pPr>
       <w:r>
@@ -9310,7 +9340,7 @@
           <w:ilvl w:val="0"/>
           <w:numId w:val="3"/>
         </w:numPr>
-        <w:spacing w:after="80" w:before="0" w:line="360"/>
+        <w:spacing w:after="120" w:before="0" w:line="360" w:lineRule="auto"/>
         <w:jc w:val="both"/>
       </w:pPr>
       <w:r>
@@ -9330,7 +9360,7 @@
           <w:ilvl w:val="0"/>
           <w:numId w:val="3"/>
         </w:numPr>
-        <w:spacing w:after="80" w:before="0" w:line="360"/>
+        <w:spacing w:after="120" w:before="0" w:line="360" w:lineRule="auto"/>
         <w:jc w:val="both"/>
       </w:pPr>
       <w:r>
@@ -9443,7 +9473,7 @@
           <w:ilvl w:val="0"/>
           <w:numId w:val="3"/>
         </w:numPr>
-        <w:spacing w:after="80" w:before="0" w:line="360"/>
+        <w:spacing w:after="120" w:before="0" w:line="360" w:lineRule="auto"/>
         <w:jc w:val="both"/>
       </w:pPr>
       <w:r>
@@ -9463,7 +9493,7 @@
           <w:ilvl w:val="0"/>
           <w:numId w:val="3"/>
         </w:numPr>
-        <w:spacing w:after="80" w:before="0" w:line="360"/>
+        <w:spacing w:after="120" w:before="0" w:line="360" w:lineRule="auto"/>
         <w:jc w:val="both"/>
       </w:pPr>
       <w:r>
@@ -9483,7 +9513,7 @@
           <w:ilvl w:val="0"/>
           <w:numId w:val="3"/>
         </w:numPr>
-        <w:spacing w:after="80" w:before="0" w:line="360"/>
+        <w:spacing w:after="120" w:before="0" w:line="360" w:lineRule="auto"/>
         <w:jc w:val="both"/>
       </w:pPr>
       <w:r>
@@ -9503,7 +9533,7 @@
           <w:ilvl w:val="0"/>
           <w:numId w:val="3"/>
         </w:numPr>
-        <w:spacing w:after="80" w:before="0" w:line="360"/>
+        <w:spacing w:after="120" w:before="0" w:line="360" w:lineRule="auto"/>
         <w:jc w:val="both"/>
       </w:pPr>
       <w:r>
@@ -9523,7 +9553,7 @@
           <w:ilvl w:val="0"/>
           <w:numId w:val="3"/>
         </w:numPr>
-        <w:spacing w:after="80" w:before="0" w:line="360"/>
+        <w:spacing w:after="120" w:before="0" w:line="360" w:lineRule="auto"/>
         <w:jc w:val="both"/>
       </w:pPr>
       <w:r>
@@ -9543,7 +9573,7 @@
           <w:ilvl w:val="0"/>
           <w:numId w:val="3"/>
         </w:numPr>
-        <w:spacing w:after="80" w:before="0" w:line="360"/>
+        <w:spacing w:after="120" w:before="0" w:line="360" w:lineRule="auto"/>
         <w:jc w:val="both"/>
       </w:pPr>
       <w:r>
@@ -9594,7 +9624,7 @@
           <w:ilvl w:val="0"/>
           <w:numId w:val="2"/>
         </w:numPr>
-        <w:spacing w:after="80" w:before="0" w:line="360"/>
+        <w:spacing w:after="120" w:before="0" w:line="360" w:lineRule="auto"/>
         <w:jc w:val="both"/>
       </w:pPr>
       <w:r>
@@ -9625,7 +9655,7 @@
           <w:ilvl w:val="0"/>
           <w:numId w:val="2"/>
         </w:numPr>
-        <w:spacing w:after="80" w:before="0" w:line="360"/>
+        <w:spacing w:after="120" w:before="0" w:line="360" w:lineRule="auto"/>
         <w:jc w:val="both"/>
       </w:pPr>
       <w:r>
@@ -9656,7 +9686,7 @@
           <w:ilvl w:val="0"/>
           <w:numId w:val="2"/>
         </w:numPr>
-        <w:spacing w:after="80" w:before="0" w:line="360"/>
+        <w:spacing w:after="120" w:before="0" w:line="360" w:lineRule="auto"/>
         <w:jc w:val="both"/>
       </w:pPr>
       <w:r>
@@ -9687,7 +9717,7 @@
           <w:ilvl w:val="0"/>
           <w:numId w:val="2"/>
         </w:numPr>
-        <w:spacing w:after="80" w:before="0" w:line="360"/>
+        <w:spacing w:after="120" w:before="0" w:line="360" w:lineRule="auto"/>
         <w:jc w:val="both"/>
       </w:pPr>
       <w:r>
@@ -9718,7 +9748,7 @@
           <w:ilvl w:val="0"/>
           <w:numId w:val="2"/>
         </w:numPr>
-        <w:spacing w:after="80" w:before="0" w:line="360"/>
+        <w:spacing w:after="120" w:before="0" w:line="360" w:lineRule="auto"/>
         <w:jc w:val="both"/>
       </w:pPr>
       <w:r>
@@ -9780,7 +9810,7 @@
           <w:ilvl w:val="0"/>
           <w:numId w:val="2"/>
         </w:numPr>
-        <w:spacing w:after="80" w:before="0" w:line="360"/>
+        <w:spacing w:after="120" w:before="0" w:line="360" w:lineRule="auto"/>
         <w:jc w:val="both"/>
       </w:pPr>
       <w:r>
@@ -9800,7 +9830,7 @@
           <w:ilvl w:val="0"/>
           <w:numId w:val="2"/>
         </w:numPr>
-        <w:spacing w:after="80" w:before="0" w:line="360"/>
+        <w:spacing w:after="120" w:before="0" w:line="360" w:lineRule="auto"/>
         <w:jc w:val="both"/>
       </w:pPr>
       <w:r>
@@ -9820,7 +9850,7 @@
           <w:ilvl w:val="0"/>
           <w:numId w:val="2"/>
         </w:numPr>
-        <w:spacing w:after="80" w:before="0" w:line="360"/>
+        <w:spacing w:after="120" w:before="0" w:line="360" w:lineRule="auto"/>
         <w:jc w:val="both"/>
       </w:pPr>
       <w:r>
@@ -9840,7 +9870,7 @@
           <w:ilvl w:val="0"/>
           <w:numId w:val="2"/>
         </w:numPr>
-        <w:spacing w:after="80" w:before="0" w:line="360"/>
+        <w:spacing w:after="120" w:before="0" w:line="360" w:lineRule="auto"/>
         <w:jc w:val="both"/>
       </w:pPr>
       <w:r>
@@ -9860,7 +9890,7 @@
           <w:ilvl w:val="0"/>
           <w:numId w:val="2"/>
         </w:numPr>
-        <w:spacing w:after="80" w:before="0" w:line="360"/>
+        <w:spacing w:after="120" w:before="0" w:line="360" w:lineRule="auto"/>
         <w:jc w:val="both"/>
       </w:pPr>
       <w:r>
@@ -10314,7 +10344,7 @@
           <w:ilvl w:val="0"/>
           <w:numId w:val="2"/>
         </w:numPr>
-        <w:spacing w:after="80" w:before="0" w:line="360"/>
+        <w:spacing w:after="120" w:before="0" w:line="360" w:lineRule="auto"/>
         <w:jc w:val="both"/>
       </w:pPr>
       <w:r>
@@ -10343,7 +10373,7 @@
           <w:ilvl w:val="0"/>
           <w:numId w:val="2"/>
         </w:numPr>
-        <w:spacing w:after="80" w:before="0" w:line="360"/>
+        <w:spacing w:after="120" w:before="0" w:line="360" w:lineRule="auto"/>
         <w:jc w:val="both"/>
       </w:pPr>
       <w:r>
@@ -10372,7 +10402,7 @@
           <w:ilvl w:val="0"/>
           <w:numId w:val="2"/>
         </w:numPr>
-        <w:spacing w:after="80" w:before="0" w:line="360"/>
+        <w:spacing w:after="120" w:before="0" w:line="360" w:lineRule="auto"/>
         <w:jc w:val="both"/>
       </w:pPr>
       <w:r>
@@ -10401,7 +10431,7 @@
           <w:ilvl w:val="0"/>
           <w:numId w:val="2"/>
         </w:numPr>
-        <w:spacing w:after="80" w:before="0" w:line="360"/>
+        <w:spacing w:after="120" w:before="0" w:line="360" w:lineRule="auto"/>
         <w:jc w:val="both"/>
       </w:pPr>
       <w:r>
@@ -10430,7 +10460,7 @@
           <w:ilvl w:val="0"/>
           <w:numId w:val="2"/>
         </w:numPr>
-        <w:spacing w:after="80" w:before="0" w:line="360"/>
+        <w:spacing w:after="120" w:before="0" w:line="360" w:lineRule="auto"/>
         <w:jc w:val="both"/>
       </w:pPr>
       <w:r>
@@ -10459,7 +10489,7 @@
           <w:ilvl w:val="0"/>
           <w:numId w:val="2"/>
         </w:numPr>
-        <w:spacing w:after="80" w:before="0" w:line="360"/>
+        <w:spacing w:after="120" w:before="0" w:line="360" w:lineRule="auto"/>
         <w:jc w:val="both"/>
       </w:pPr>
       <w:r>
@@ -10488,7 +10518,7 @@
           <w:ilvl w:val="0"/>
           <w:numId w:val="2"/>
         </w:numPr>
-        <w:spacing w:after="80" w:before="0" w:line="360"/>
+        <w:spacing w:after="120" w:before="0" w:line="360" w:lineRule="auto"/>
         <w:jc w:val="both"/>
       </w:pPr>
       <w:r>
@@ -10517,7 +10547,7 @@
           <w:ilvl w:val="0"/>
           <w:numId w:val="2"/>
         </w:numPr>
-        <w:spacing w:after="80" w:before="0" w:line="360"/>
+        <w:spacing w:after="120" w:before="0" w:line="360" w:lineRule="auto"/>
         <w:jc w:val="both"/>
       </w:pPr>
       <w:r>
@@ -10546,7 +10576,7 @@
           <w:ilvl w:val="0"/>
           <w:numId w:val="2"/>
         </w:numPr>
-        <w:spacing w:after="80" w:before="0" w:line="360"/>
+        <w:spacing w:after="120" w:before="0" w:line="360" w:lineRule="auto"/>
         <w:jc w:val="both"/>
       </w:pPr>
       <w:r>
@@ -10575,7 +10605,7 @@
           <w:ilvl w:val="0"/>
           <w:numId w:val="2"/>
         </w:numPr>
-        <w:spacing w:after="80" w:before="0" w:line="360"/>
+        <w:spacing w:after="120" w:before="0" w:line="360" w:lineRule="auto"/>
         <w:jc w:val="both"/>
       </w:pPr>
       <w:r>
@@ -10604,7 +10634,7 @@
           <w:ilvl w:val="0"/>
           <w:numId w:val="2"/>
         </w:numPr>
-        <w:spacing w:after="80" w:before="0" w:line="360"/>
+        <w:spacing w:after="120" w:before="0" w:line="360" w:lineRule="auto"/>
         <w:jc w:val="both"/>
       </w:pPr>
       <w:r>
@@ -10633,7 +10663,7 @@
           <w:ilvl w:val="0"/>
           <w:numId w:val="2"/>
         </w:numPr>
-        <w:spacing w:after="80" w:before="0" w:line="360"/>
+        <w:spacing w:after="120" w:before="0" w:line="360" w:lineRule="auto"/>
         <w:jc w:val="both"/>
       </w:pPr>
       <w:r>
@@ -10702,7 +10732,7 @@
     </w:p>
     <w:tbl>
       <w:tblPr>
-        <w:tblW w:type="dxa" w:w="9500"/>
+        <w:tblW w:type="dxa" w:w="8504"/>
         <w:tblBorders>
           <w:top w:val="single" w:color="auto" w:sz="4"/>
           <w:left w:val="single" w:color="auto" w:sz="4"/>
@@ -10713,14 +10743,14 @@
         </w:tblBorders>
       </w:tblPr>
       <w:tblGrid>
-        <w:gridCol w:w="1200"/>
-        <w:gridCol w:w="2800"/>
-        <w:gridCol w:w="5500"/>
+        <w:gridCol w:w="1100"/>
+        <w:gridCol w:w="2600"/>
+        <w:gridCol w:w="4804"/>
       </w:tblGrid>
       <w:tr>
         <w:tc>
           <w:tcPr>
-            <w:tcW w:type="dxa" w:w="1200"/>
+            <w:tcW w:type="dxa" w:w="1100"/>
             <w:tcBorders>
               <w:top w:val="single" w:color="CCCCCC" w:sz="1"/>
               <w:left w:val="single" w:color="CCCCCC" w:sz="1"/>
@@ -10756,7 +10786,7 @@
         </w:tc>
         <w:tc>
           <w:tcPr>
-            <w:tcW w:type="dxa" w:w="2800"/>
+            <w:tcW w:type="dxa" w:w="2600"/>
             <w:tcBorders>
               <w:top w:val="single" w:color="CCCCCC" w:sz="1"/>
               <w:left w:val="single" w:color="CCCCCC" w:sz="1"/>
@@ -10792,7 +10822,7 @@
         </w:tc>
         <w:tc>
           <w:tcPr>
-            <w:tcW w:type="dxa" w:w="5500"/>
+            <w:tcW w:type="dxa" w:w="4804"/>
             <w:tcBorders>
               <w:top w:val="single" w:color="CCCCCC" w:sz="1"/>
               <w:left w:val="single" w:color="CCCCCC" w:sz="1"/>
@@ -10830,7 +10860,7 @@
       <w:tr>
         <w:tc>
           <w:tcPr>
-            <w:tcW w:type="dxa" w:w="1200"/>
+            <w:tcW w:type="dxa" w:w="1100"/>
             <w:tcBorders>
               <w:top w:val="single" w:color="CCCCCC" w:sz="1"/>
               <w:left w:val="single" w:color="CCCCCC" w:sz="1"/>
@@ -10866,7 +10896,7 @@
         </w:tc>
         <w:tc>
           <w:tcPr>
-            <w:tcW w:type="dxa" w:w="2800"/>
+            <w:tcW w:type="dxa" w:w="2600"/>
             <w:tcBorders>
               <w:top w:val="single" w:color="CCCCCC" w:sz="1"/>
               <w:left w:val="single" w:color="CCCCCC" w:sz="1"/>
@@ -10902,7 +10932,7 @@
         </w:tc>
         <w:tc>
           <w:tcPr>
-            <w:tcW w:type="dxa" w:w="5500"/>
+            <w:tcW w:type="dxa" w:w="4804"/>
             <w:tcBorders>
               <w:top w:val="single" w:color="CCCCCC" w:sz="1"/>
               <w:left w:val="single" w:color="CCCCCC" w:sz="1"/>
@@ -10940,7 +10970,7 @@
       <w:tr>
         <w:tc>
           <w:tcPr>
-            <w:tcW w:type="dxa" w:w="1200"/>
+            <w:tcW w:type="dxa" w:w="1100"/>
             <w:tcBorders>
               <w:top w:val="single" w:color="CCCCCC" w:sz="1"/>
               <w:left w:val="single" w:color="CCCCCC" w:sz="1"/>
@@ -10976,7 +11006,7 @@
         </w:tc>
         <w:tc>
           <w:tcPr>
-            <w:tcW w:type="dxa" w:w="2800"/>
+            <w:tcW w:type="dxa" w:w="2600"/>
             <w:tcBorders>
               <w:top w:val="single" w:color="CCCCCC" w:sz="1"/>
               <w:left w:val="single" w:color="CCCCCC" w:sz="1"/>
@@ -11012,7 +11042,7 @@
         </w:tc>
         <w:tc>
           <w:tcPr>
-            <w:tcW w:type="dxa" w:w="5500"/>
+            <w:tcW w:type="dxa" w:w="4804"/>
             <w:tcBorders>
               <w:top w:val="single" w:color="CCCCCC" w:sz="1"/>
               <w:left w:val="single" w:color="CCCCCC" w:sz="1"/>
@@ -11050,7 +11080,7 @@
       <w:tr>
         <w:tc>
           <w:tcPr>
-            <w:tcW w:type="dxa" w:w="1200"/>
+            <w:tcW w:type="dxa" w:w="1100"/>
             <w:tcBorders>
               <w:top w:val="single" w:color="CCCCCC" w:sz="1"/>
               <w:left w:val="single" w:color="CCCCCC" w:sz="1"/>
@@ -11086,7 +11116,7 @@
         </w:tc>
         <w:tc>
           <w:tcPr>
-            <w:tcW w:type="dxa" w:w="2800"/>
+            <w:tcW w:type="dxa" w:w="2600"/>
             <w:tcBorders>
               <w:top w:val="single" w:color="CCCCCC" w:sz="1"/>
               <w:left w:val="single" w:color="CCCCCC" w:sz="1"/>
@@ -11122,7 +11152,7 @@
         </w:tc>
         <w:tc>
           <w:tcPr>
-            <w:tcW w:type="dxa" w:w="5500"/>
+            <w:tcW w:type="dxa" w:w="4804"/>
             <w:tcBorders>
               <w:top w:val="single" w:color="CCCCCC" w:sz="1"/>
               <w:left w:val="single" w:color="CCCCCC" w:sz="1"/>
@@ -11160,7 +11190,7 @@
       <w:tr>
         <w:tc>
           <w:tcPr>
-            <w:tcW w:type="dxa" w:w="1200"/>
+            <w:tcW w:type="dxa" w:w="1100"/>
             <w:tcBorders>
               <w:top w:val="single" w:color="CCCCCC" w:sz="1"/>
               <w:left w:val="single" w:color="CCCCCC" w:sz="1"/>
@@ -11196,7 +11226,7 @@
         </w:tc>
         <w:tc>
           <w:tcPr>
-            <w:tcW w:type="dxa" w:w="2800"/>
+            <w:tcW w:type="dxa" w:w="2600"/>
             <w:tcBorders>
               <w:top w:val="single" w:color="CCCCCC" w:sz="1"/>
               <w:left w:val="single" w:color="CCCCCC" w:sz="1"/>
@@ -11232,7 +11262,7 @@
         </w:tc>
         <w:tc>
           <w:tcPr>
-            <w:tcW w:type="dxa" w:w="5500"/>
+            <w:tcW w:type="dxa" w:w="4804"/>
             <w:tcBorders>
               <w:top w:val="single" w:color="CCCCCC" w:sz="1"/>
               <w:left w:val="single" w:color="CCCCCC" w:sz="1"/>
@@ -11270,7 +11300,7 @@
       <w:tr>
         <w:tc>
           <w:tcPr>
-            <w:tcW w:type="dxa" w:w="1200"/>
+            <w:tcW w:type="dxa" w:w="1100"/>
             <w:tcBorders>
               <w:top w:val="single" w:color="CCCCCC" w:sz="1"/>
               <w:left w:val="single" w:color="CCCCCC" w:sz="1"/>
@@ -11306,7 +11336,7 @@
         </w:tc>
         <w:tc>
           <w:tcPr>
-            <w:tcW w:type="dxa" w:w="2800"/>
+            <w:tcW w:type="dxa" w:w="2600"/>
             <w:tcBorders>
               <w:top w:val="single" w:color="CCCCCC" w:sz="1"/>
               <w:left w:val="single" w:color="CCCCCC" w:sz="1"/>
@@ -11342,7 +11372,7 @@
         </w:tc>
         <w:tc>
           <w:tcPr>
-            <w:tcW w:type="dxa" w:w="5500"/>
+            <w:tcW w:type="dxa" w:w="4804"/>
             <w:tcBorders>
               <w:top w:val="single" w:color="CCCCCC" w:sz="1"/>
               <w:left w:val="single" w:color="CCCCCC" w:sz="1"/>
@@ -11380,7 +11410,7 @@
       <w:tr>
         <w:tc>
           <w:tcPr>
-            <w:tcW w:type="dxa" w:w="1200"/>
+            <w:tcW w:type="dxa" w:w="1100"/>
             <w:tcBorders>
               <w:top w:val="single" w:color="CCCCCC" w:sz="1"/>
               <w:left w:val="single" w:color="CCCCCC" w:sz="1"/>
@@ -11416,7 +11446,7 @@
         </w:tc>
         <w:tc>
           <w:tcPr>
-            <w:tcW w:type="dxa" w:w="2800"/>
+            <w:tcW w:type="dxa" w:w="2600"/>
             <w:tcBorders>
               <w:top w:val="single" w:color="CCCCCC" w:sz="1"/>
               <w:left w:val="single" w:color="CCCCCC" w:sz="1"/>
@@ -11452,7 +11482,7 @@
         </w:tc>
         <w:tc>
           <w:tcPr>
-            <w:tcW w:type="dxa" w:w="5500"/>
+            <w:tcW w:type="dxa" w:w="4804"/>
             <w:tcBorders>
               <w:top w:val="single" w:color="CCCCCC" w:sz="1"/>
               <w:left w:val="single" w:color="CCCCCC" w:sz="1"/>
@@ -11490,7 +11520,7 @@
       <w:tr>
         <w:tc>
           <w:tcPr>
-            <w:tcW w:type="dxa" w:w="1200"/>
+            <w:tcW w:type="dxa" w:w="1100"/>
             <w:tcBorders>
               <w:top w:val="single" w:color="CCCCCC" w:sz="1"/>
               <w:left w:val="single" w:color="CCCCCC" w:sz="1"/>
@@ -11526,7 +11556,7 @@
         </w:tc>
         <w:tc>
           <w:tcPr>
-            <w:tcW w:type="dxa" w:w="2800"/>
+            <w:tcW w:type="dxa" w:w="2600"/>
             <w:tcBorders>
               <w:top w:val="single" w:color="CCCCCC" w:sz="1"/>
               <w:left w:val="single" w:color="CCCCCC" w:sz="1"/>
@@ -11562,7 +11592,7 @@
         </w:tc>
         <w:tc>
           <w:tcPr>
-            <w:tcW w:type="dxa" w:w="5500"/>
+            <w:tcW w:type="dxa" w:w="4804"/>
             <w:tcBorders>
               <w:top w:val="single" w:color="CCCCCC" w:sz="1"/>
               <w:left w:val="single" w:color="CCCCCC" w:sz="1"/>
@@ -11600,7 +11630,7 @@
       <w:tr>
         <w:tc>
           <w:tcPr>
-            <w:tcW w:type="dxa" w:w="1200"/>
+            <w:tcW w:type="dxa" w:w="1100"/>
             <w:tcBorders>
               <w:top w:val="single" w:color="CCCCCC" w:sz="1"/>
               <w:left w:val="single" w:color="CCCCCC" w:sz="1"/>
@@ -11636,7 +11666,7 @@
         </w:tc>
         <w:tc>
           <w:tcPr>
-            <w:tcW w:type="dxa" w:w="2800"/>
+            <w:tcW w:type="dxa" w:w="2600"/>
             <w:tcBorders>
               <w:top w:val="single" w:color="CCCCCC" w:sz="1"/>
               <w:left w:val="single" w:color="CCCCCC" w:sz="1"/>
@@ -11672,7 +11702,7 @@
         </w:tc>
         <w:tc>
           <w:tcPr>
-            <w:tcW w:type="dxa" w:w="5500"/>
+            <w:tcW w:type="dxa" w:w="4804"/>
             <w:tcBorders>
               <w:top w:val="single" w:color="CCCCCC" w:sz="1"/>
               <w:left w:val="single" w:color="CCCCCC" w:sz="1"/>
@@ -11710,7 +11740,7 @@
       <w:tr>
         <w:tc>
           <w:tcPr>
-            <w:tcW w:type="dxa" w:w="1200"/>
+            <w:tcW w:type="dxa" w:w="1100"/>
             <w:tcBorders>
               <w:top w:val="single" w:color="CCCCCC" w:sz="1"/>
               <w:left w:val="single" w:color="CCCCCC" w:sz="1"/>
@@ -11746,7 +11776,7 @@
         </w:tc>
         <w:tc>
           <w:tcPr>
-            <w:tcW w:type="dxa" w:w="2800"/>
+            <w:tcW w:type="dxa" w:w="2600"/>
             <w:tcBorders>
               <w:top w:val="single" w:color="CCCCCC" w:sz="1"/>
               <w:left w:val="single" w:color="CCCCCC" w:sz="1"/>
@@ -11782,7 +11812,7 @@
         </w:tc>
         <w:tc>
           <w:tcPr>
-            <w:tcW w:type="dxa" w:w="5500"/>
+            <w:tcW w:type="dxa" w:w="4804"/>
             <w:tcBorders>
               <w:top w:val="single" w:color="CCCCCC" w:sz="1"/>
               <w:left w:val="single" w:color="CCCCCC" w:sz="1"/>
@@ -11873,7 +11903,7 @@
           <w:ilvl w:val="0"/>
           <w:numId w:val="3"/>
         </w:numPr>
-        <w:spacing w:after="80" w:before="0" w:line="360"/>
+        <w:spacing w:after="120" w:before="0" w:line="360" w:lineRule="auto"/>
         <w:jc w:val="both"/>
       </w:pPr>
       <w:r>
@@ -11893,7 +11923,7 @@
           <w:ilvl w:val="0"/>
           <w:numId w:val="3"/>
         </w:numPr>
-        <w:spacing w:after="80" w:before="0" w:line="360"/>
+        <w:spacing w:after="120" w:before="0" w:line="360" w:lineRule="auto"/>
         <w:jc w:val="both"/>
       </w:pPr>
       <w:r>
@@ -11913,7 +11943,7 @@
           <w:ilvl w:val="0"/>
           <w:numId w:val="3"/>
         </w:numPr>
-        <w:spacing w:after="80" w:before="0" w:line="360"/>
+        <w:spacing w:after="120" w:before="0" w:line="360" w:lineRule="auto"/>
         <w:jc w:val="both"/>
       </w:pPr>
       <w:r>
@@ -11933,7 +11963,7 @@
           <w:ilvl w:val="0"/>
           <w:numId w:val="3"/>
         </w:numPr>
-        <w:spacing w:after="80" w:before="0" w:line="360"/>
+        <w:spacing w:after="120" w:before="0" w:line="360" w:lineRule="auto"/>
         <w:jc w:val="both"/>
       </w:pPr>
       <w:r>
@@ -11953,7 +11983,7 @@
           <w:ilvl w:val="0"/>
           <w:numId w:val="3"/>
         </w:numPr>
-        <w:spacing w:after="80" w:before="0" w:line="360"/>
+        <w:spacing w:after="120" w:before="0" w:line="360" w:lineRule="auto"/>
         <w:jc w:val="both"/>
       </w:pPr>
       <w:r>
@@ -11973,7 +12003,7 @@
           <w:ilvl w:val="0"/>
           <w:numId w:val="3"/>
         </w:numPr>
-        <w:spacing w:after="80" w:before="0" w:line="360"/>
+        <w:spacing w:after="120" w:before="0" w:line="360" w:lineRule="auto"/>
         <w:jc w:val="both"/>
       </w:pPr>
       <w:r>
@@ -11993,7 +12023,7 @@
           <w:ilvl w:val="0"/>
           <w:numId w:val="3"/>
         </w:numPr>
-        <w:spacing w:after="80" w:before="0" w:line="360"/>
+        <w:spacing w:after="120" w:before="0" w:line="360" w:lineRule="auto"/>
         <w:jc w:val="both"/>
       </w:pPr>
       <w:r>

</xml_diff>

<commit_message>
docs: añade índice de tablas, ejemplos de uso (web/API/Python) y amplía memoria
Co-Authored-By: Claude Fable 5 <noreply@anthropic.com>
</commit_message>
<xml_diff>
--- a/informes/TFM_Raul_Hernando_Viadero.docx
+++ b/informes/TFM_Raul_Hernando_Viadero.docx
@@ -489,6 +489,148 @@
     </w:p>
     <w:p>
       <w:pPr>
+        <w:pStyle w:val="Heading1"/>
+        <w:spacing w:after="180" w:before="240"/>
+      </w:pPr>
+      <w:r>
+        <w:rPr>
+          <w:rFonts w:ascii="Calibri" w:cs="Calibri" w:eastAsia="Calibri" w:hAnsi="Calibri"/>
+          <w:b/>
+          <w:bCs/>
+          <w:color w:val="BA0C2F"/>
+          <w:sz w:val="36"/>
+          <w:szCs w:val="36"/>
+        </w:rPr>
+        <w:t xml:space="preserve">Índice de tablas</w:t>
+      </w:r>
+    </w:p>
+    <w:p>
+      <w:pPr>
+        <w:spacing w:after="120" w:before="0" w:line="360" w:lineRule="auto"/>
+        <w:jc w:val="both"/>
+      </w:pPr>
+      <w:r>
+        <w:rPr>
+          <w:rFonts w:ascii="Calibri" w:cs="Calibri" w:eastAsia="Calibri" w:hAnsi="Calibri"/>
+          <w:color w:val="404040"/>
+          <w:sz w:val="22"/>
+          <w:szCs w:val="22"/>
+        </w:rPr>
+        <w:t xml:space="preserve">Tabla 1. Stack tecnológico del sistema de verificación documental.</w:t>
+      </w:r>
+    </w:p>
+    <w:p>
+      <w:pPr>
+        <w:spacing w:after="120" w:before="0" w:line="360" w:lineRule="auto"/>
+        <w:jc w:val="both"/>
+      </w:pPr>
+      <w:r>
+        <w:rPr>
+          <w:rFonts w:ascii="Calibri" w:cs="Calibri" w:eastAsia="Calibri" w:hAnsi="Calibri"/>
+          <w:color w:val="404040"/>
+          <w:sz w:val="22"/>
+          <w:szCs w:val="22"/>
+        </w:rPr>
+        <w:t xml:space="preserve">Tabla 2. Partición del dataset sintético (400 expedientes, 15% inconsistentes, seed=42).</w:t>
+      </w:r>
+    </w:p>
+    <w:p>
+      <w:pPr>
+        <w:spacing w:after="120" w:before="0" w:line="360" w:lineRule="auto"/>
+        <w:jc w:val="both"/>
+      </w:pPr>
+      <w:r>
+        <w:rPr>
+          <w:rFonts w:ascii="Calibri" w:cs="Calibri" w:eastAsia="Calibri" w:hAnsi="Calibri"/>
+          <w:color w:val="404040"/>
+          <w:sz w:val="22"/>
+          <w:szCs w:val="22"/>
+        </w:rPr>
+        <w:t xml:space="preserve">Tabla 3. Ejemplos de normalización aplicada por el postprocesador de texto.</w:t>
+      </w:r>
+    </w:p>
+    <w:p>
+      <w:pPr>
+        <w:spacing w:after="120" w:before="0" w:line="360" w:lineRule="auto"/>
+        <w:jc w:val="both"/>
+      </w:pPr>
+      <w:r>
+        <w:rPr>
+          <w:rFonts w:ascii="Calibri" w:cs="Calibri" w:eastAsia="Calibri" w:hAnsi="Calibri"/>
+          <w:color w:val="404040"/>
+          <w:sz w:val="22"/>
+          <w:szCs w:val="22"/>
+        </w:rPr>
+        <w:t xml:space="preserve">Tabla 4. Métricas de los modelos YOLOv8n en el split de test.</w:t>
+      </w:r>
+    </w:p>
+    <w:p>
+      <w:pPr>
+        <w:spacing w:after="120" w:before="0" w:line="360" w:lineRule="auto"/>
+        <w:jc w:val="both"/>
+      </w:pPr>
+      <w:r>
+        <w:rPr>
+          <w:rFonts w:ascii="Calibri" w:cs="Calibri" w:eastAsia="Calibri" w:hAnsi="Calibri"/>
+          <w:color w:val="404040"/>
+          <w:sz w:val="22"/>
+          <w:szCs w:val="22"/>
+        </w:rPr>
+        <w:t xml:space="preserve">Tabla 5. Métricas del clasificador ResNet-18 en el split de test.</w:t>
+      </w:r>
+    </w:p>
+    <w:p>
+      <w:pPr>
+        <w:spacing w:after="120" w:before="0" w:line="360" w:lineRule="auto"/>
+        <w:jc w:val="both"/>
+      </w:pPr>
+      <w:r>
+        <w:rPr>
+          <w:rFonts w:ascii="Calibri" w:cs="Calibri" w:eastAsia="Calibri" w:hAnsi="Calibri"/>
+          <w:color w:val="404040"/>
+          <w:sz w:val="22"/>
+          <w:szCs w:val="22"/>
+        </w:rPr>
+        <w:t xml:space="preserve">Tabla 6. Field Accuracy y confianza OCR media por campo en el split de test.</w:t>
+      </w:r>
+    </w:p>
+    <w:p>
+      <w:pPr>
+        <w:spacing w:after="120" w:before="0" w:line="360" w:lineRule="auto"/>
+        <w:jc w:val="both"/>
+      </w:pPr>
+      <w:r>
+        <w:rPr>
+          <w:rFonts w:ascii="Calibri" w:cs="Calibri" w:eastAsia="Calibri" w:hAnsi="Calibri"/>
+          <w:color w:val="404040"/>
+          <w:sz w:val="22"/>
+          <w:szCs w:val="22"/>
+        </w:rPr>
+        <w:t xml:space="preserve">Tabla 7. Métricas del sistema end-to-end en el split de test (50 expedientes).</w:t>
+      </w:r>
+    </w:p>
+    <w:p>
+      <w:pPr>
+        <w:spacing w:after="120" w:before="0" w:line="360" w:lineRule="auto"/>
+        <w:jc w:val="both"/>
+      </w:pPr>
+      <w:r>
+        <w:rPr>
+          <w:rFonts w:ascii="Calibri" w:cs="Calibri" w:eastAsia="Calibri" w:hAnsi="Calibri"/>
+          <w:color w:val="404040"/>
+          <w:sz w:val="22"/>
+          <w:szCs w:val="22"/>
+        </w:rPr>
+        <w:t xml:space="preserve">Tabla A1. Descripción de las nueve reglas de validación cruzada.</w:t>
+      </w:r>
+    </w:p>
+    <w:p>
+      <w:r>
+        <w:br w:type="page"/>
+      </w:r>
+    </w:p>
+    <w:p>
+      <w:pPr>
         <w:sectPr>
           <w:footerReference w:type="default" r:id="rId7"/>
           <w:pgSz w:w="11906" w:h="16838" w:orient="portrait"/>
@@ -575,7 +717,37 @@
           <w:sz w:val="22"/>
           <w:szCs w:val="22"/>
         </w:rPr>
+        <w:t xml:space="preserve">A estas limitaciones operativas se suma un contexto regulatorio cada vez más exigente. Los procesos de alta de clientes y concesión de crédito están sujetos a las obligaciones de diligencia debida conocidas como KYC (Know Your Customer) y a la normativa de prevención del blanqueo de capitales, que en España desarrolla la Ley 10/2010 y que obligan a las entidades a verificar de forma fehaciente la identidad de sus clientes. Al mismo tiempo, la banca compite por ofrecer procesos de contratación 100% digitales en los que el cliente fotografía sus documentos desde el móvil y espera una respuesta en minutos. Conciliar la exigencia regulatoria con la inmediatez que demanda el mercado es precisamente el hueco que ocupan los sistemas automáticos de verificación documental.</w:t>
+      </w:r>
+    </w:p>
+    <w:p>
+      <w:pPr>
+        <w:spacing w:after="120" w:before="0" w:line="360" w:lineRule="auto"/>
+        <w:jc w:val="both"/>
+      </w:pPr>
+      <w:r>
+        <w:rPr>
+          <w:rFonts w:ascii="Calibri" w:cs="Calibri" w:eastAsia="Calibri" w:hAnsi="Calibri"/>
+          <w:color w:val="404040"/>
+          <w:sz w:val="22"/>
+          <w:szCs w:val="22"/>
+        </w:rPr>
         <w:t xml:space="preserve">La visión artificial y el aprendizaje profundo ofrecen una solución a estas limitaciones mediante la automatización del proceso de verificación documental. Los detectores de objetos basados en redes neuronales convolucionales permiten localizar con precisión los campos de texto en documentos de alta resolución, los motores de reconocimiento óptico de caracteres (OCR) modernos alcanzan tasas de error muy bajas incluso en condiciones adversas de captura, y los clasificadores de imagen pueden detectar patrones de manipulación invisibles para el ojo humano. La combinación de estas tres tecnologías con un motor de reglas de negocio permite construir un sistema de cribado automático que procesa cada expediente en segundos, aplica siempre los mismos criterios y deja constancia trazable de cada decisión.</w:t>
+      </w:r>
+    </w:p>
+    <w:p>
+      <w:pPr>
+        <w:spacing w:after="120" w:before="0" w:line="360" w:lineRule="auto"/>
+        <w:jc w:val="both"/>
+      </w:pPr>
+      <w:r>
+        <w:rPr>
+          <w:rFonts w:ascii="Calibri" w:cs="Calibri" w:eastAsia="Calibri" w:hAnsi="Calibri"/>
+          <w:color w:val="404040"/>
+          <w:sz w:val="22"/>
+          <w:szCs w:val="22"/>
+        </w:rPr>
+        <w:t xml:space="preserve">Conviene subrayar el papel que juega cada tecnología en esa cadena y por qué ninguna es suficiente por sí sola. El detector de objetos aporta estructura: convierte una fotografía en un conjunto de regiones tipadas (esto es el nombre, esto es el NIF), pero no lee su contenido. El OCR aporta el contenido, pero no sabe qué significa ni si es coherente. El clasificador de autenticidad examina la integridad visual del soporte, pero es ciego al significado de los datos. Y el motor de reglas, que es donde reside el conocimiento del negocio, solo puede operar si las tres etapas anteriores le entregan datos fiables y estructurados. Esta complementariedad es la tesis arquitectónica central del trabajo: la fiabilidad del sistema no descansa en un único modelo, sino en el contraste sistemático entre fuentes de evidencia independientes.</w:t>
       </w:r>
     </w:p>
     <w:p>
@@ -3800,6 +3972,21 @@
           <w:szCs w:val="28"/>
         </w:rPr>
         <w:t xml:space="preserve">3.4.1. YOLOv8n — Detección de regiones de interés</w:t>
+      </w:r>
+    </w:p>
+    <w:p>
+      <w:pPr>
+        <w:spacing w:after="120" w:before="0" w:line="360" w:lineRule="auto"/>
+        <w:jc w:val="both"/>
+      </w:pPr>
+      <w:r>
+        <w:rPr>
+          <w:rFonts w:ascii="Calibri" w:cs="Calibri" w:eastAsia="Calibri" w:hAnsi="Calibri"/>
+          <w:color w:val="404040"/>
+          <w:sz w:val="22"/>
+          <w:szCs w:val="22"/>
+        </w:rPr>
+        <w:t xml:space="preserve">La familia YOLOv8 se distribuye en cinco variantes de tamaño creciente (n, s, m, l, x) que comparten arquitectura y se diferencian en anchura y profundidad de la red: la variante nano tiene 3,2 millones de parámetros, la small 11,2 y la medium 25,9. En un benchmark preliminar sobre un subconjunto de 50 imágenes, la variante small mejoraba el mAP@0.5:0.95 en menos de un punto porcentual respecto a la nano, a costa de triplicar el tiempo de entrenamiento e inferencia en CPU. Dado que la nano ya superaba con holgura los objetivos del proyecto, la relación coste-beneficio de las variantes mayores no se justificaba: se seleccionó YOLOv8n para ambos detectores.</w:t>
       </w:r>
     </w:p>
     <w:p>
@@ -9404,6 +9591,487 @@
     </w:p>
     <w:p>
       <w:pPr>
+        <w:pStyle w:val="Heading2"/>
+        <w:spacing w:after="120" w:before="200"/>
+      </w:pPr>
+      <w:r>
+        <w:rPr>
+          <w:rFonts w:ascii="Calibri" w:cs="Calibri" w:eastAsia="Calibri" w:hAnsi="Calibri"/>
+          <w:b/>
+          <w:bCs/>
+          <w:color w:val="404040"/>
+          <w:sz w:val="32"/>
+          <w:szCs w:val="32"/>
+        </w:rPr>
+        <w:t xml:space="preserve">4.8. Ejemplos de uso del sistema</w:t>
+      </w:r>
+    </w:p>
+    <w:p>
+      <w:pPr>
+        <w:spacing w:after="120" w:before="0" w:line="360" w:lineRule="auto"/>
+        <w:jc w:val="both"/>
+      </w:pPr>
+      <w:r>
+        <w:rPr>
+          <w:rFonts w:ascii="Calibri" w:cs="Calibri" w:eastAsia="Calibri" w:hAnsi="Calibri"/>
+          <w:color w:val="404040"/>
+          <w:sz w:val="22"/>
+          <w:szCs w:val="22"/>
+        </w:rPr>
+        <w:t xml:space="preserve">El sistema admite tres vías de uso complementarias, orientadas a perfiles de usuario distintos: la interfaz web para el analista de riesgos, la API REST para la integración con otros sistemas de la entidad, y el uso programático directo del pipeline para analistas de datos.</w:t>
+      </w:r>
+    </w:p>
+    <w:p>
+      <w:pPr>
+        <w:pStyle w:val="Heading3"/>
+        <w:spacing w:after="100" w:before="160"/>
+      </w:pPr>
+      <w:r>
+        <w:rPr>
+          <w:rFonts w:ascii="Calibri" w:cs="Calibri" w:eastAsia="Calibri" w:hAnsi="Calibri"/>
+          <w:b/>
+          <w:bCs/>
+          <w:color w:val="404040"/>
+          <w:sz w:val="28"/>
+          <w:szCs w:val="28"/>
+        </w:rPr>
+        <w:t xml:space="preserve">4.8.1. Uso desde la interfaz web (analista de riesgos)</w:t>
+      </w:r>
+    </w:p>
+    <w:p>
+      <w:pPr>
+        <w:spacing w:after="120" w:before="0" w:line="360" w:lineRule="auto"/>
+        <w:jc w:val="both"/>
+      </w:pPr>
+      <w:r>
+        <w:rPr>
+          <w:rFonts w:ascii="Calibri" w:cs="Calibri" w:eastAsia="Calibri" w:hAnsi="Calibri"/>
+          <w:color w:val="404040"/>
+          <w:sz w:val="22"/>
+          <w:szCs w:val="22"/>
+        </w:rPr>
+        <w:t xml:space="preserve">El flujo de trabajo de un analista es el siguiente: (1) accede a http://localhost:8501; la barra lateral confirma con un indicador verde que la API está conectada y los modelos cargados; (2) en la página Verificar Expediente arrastra las dos imágenes a las zonas de subida, que muestran la previsualización de cada documento; (3) opcionalmente introduce un identificador de expediente (si se omite, el sistema genera uno); (4) pulsa Verificar Expediente y en unos 9 segundos obtiene el veredicto con semáforo visual — verde para APTO, rojo para INCONSISTENTE — junto a la confianza y las reglas fallidas si las hay; (5) explora las pestañas de detalle: cada regla R01–R09 puede desplegarse para ver la comparación exacta que realizó, los campos OCR muestran el texto normalizado con su confianza, el perfil de riesgo presenta el ratio de endeudamiento sobre una barra de progreso con el límite del 35% marcado, y la pestaña de autenticidad muestra la clasificación de cada documento; (6) descarga el informe PDF del expediente con el botón Exportar PDF para adjuntarlo al expediente administrativo. Las páginas de Historial, Métricas y Dashboard permiten supervisar la actividad agregada de la sesión: distribución de veredictos, tiempo medio de proceso y frecuencia de fallo de cada regla.</w:t>
+      </w:r>
+    </w:p>
+    <w:p>
+      <w:pPr>
+        <w:pStyle w:val="Heading3"/>
+        <w:spacing w:after="100" w:before="160"/>
+      </w:pPr>
+      <w:r>
+        <w:rPr>
+          <w:rFonts w:ascii="Calibri" w:cs="Calibri" w:eastAsia="Calibri" w:hAnsi="Calibri"/>
+          <w:b/>
+          <w:bCs/>
+          <w:color w:val="404040"/>
+          <w:sz w:val="28"/>
+          <w:szCs w:val="28"/>
+        </w:rPr>
+        <w:t xml:space="preserve">4.8.2. Uso desde la API REST (integración de sistemas)</w:t>
+      </w:r>
+    </w:p>
+    <w:p>
+      <w:pPr>
+        <w:spacing w:after="120" w:before="0" w:line="360" w:lineRule="auto"/>
+        <w:jc w:val="both"/>
+      </w:pPr>
+      <w:r>
+        <w:rPr>
+          <w:rFonts w:ascii="Calibri" w:cs="Calibri" w:eastAsia="Calibri" w:hAnsi="Calibri"/>
+          <w:color w:val="404040"/>
+          <w:sz w:val="22"/>
+          <w:szCs w:val="22"/>
+        </w:rPr>
+        <w:t xml:space="preserve">Cualquier sistema corporativo (un gestor documental, un CRM bancario, un flujo BPM de concesión) puede invocar la verificación mediante una petición HTTP multipart. Ejemplo con la utilidad curl:</w:t>
+      </w:r>
+    </w:p>
+    <w:p>
+      <w:pPr>
+        <w:shd w:fill="F2F2F2" w:val="clear"/>
+        <w:spacing w:after="0" w:before="0" w:line="276"/>
+        <w:ind w:left="360" w:right="360"/>
+        <w:jc w:val="left"/>
+      </w:pPr>
+      <w:r>
+        <w:rPr>
+          <w:rFonts w:ascii="Consolas" w:cs="Consolas" w:eastAsia="Consolas" w:hAnsi="Consolas"/>
+          <w:color w:val="1A1A1A"/>
+          <w:sz w:val="18"/>
+          <w:szCs w:val="18"/>
+        </w:rPr>
+        <w:t xml:space="preserve">curl -X POST http://localhost:8000/api/v1/verify/ \</w:t>
+      </w:r>
+    </w:p>
+    <w:p>
+      <w:pPr>
+        <w:shd w:fill="F2F2F2" w:val="clear"/>
+        <w:spacing w:after="0" w:before="0" w:line="276"/>
+        <w:ind w:left="360" w:right="360"/>
+        <w:jc w:val="left"/>
+      </w:pPr>
+      <w:r>
+        <w:rPr>
+          <w:rFonts w:ascii="Consolas" w:cs="Consolas" w:eastAsia="Consolas" w:hAnsi="Consolas"/>
+          <w:color w:val="1A1A1A"/>
+          <w:sz w:val="18"/>
+          <w:szCs w:val="18"/>
+        </w:rPr>
+        <w:t xml:space="preserve">     -F "imagen_dni=@expediente_009/dni.png" \</w:t>
+      </w:r>
+    </w:p>
+    <w:p>
+      <w:pPr>
+        <w:shd w:fill="F2F2F2" w:val="clear"/>
+        <w:spacing w:after="0" w:before="0" w:line="276"/>
+        <w:ind w:left="360" w:right="360"/>
+        <w:jc w:val="left"/>
+      </w:pPr>
+      <w:r>
+        <w:rPr>
+          <w:rFonts w:ascii="Consolas" w:cs="Consolas" w:eastAsia="Consolas" w:hAnsi="Consolas"/>
+          <w:color w:val="1A1A1A"/>
+          <w:sz w:val="18"/>
+          <w:szCs w:val="18"/>
+        </w:rPr>
+        <w:t xml:space="preserve">     -F "imagen_formulario=@expediente_009/formulario.png" \</w:t>
+      </w:r>
+    </w:p>
+    <w:p>
+      <w:pPr>
+        <w:shd w:fill="F2F2F2" w:val="clear"/>
+        <w:spacing w:after="0" w:before="0" w:line="276"/>
+        <w:ind w:left="360" w:right="360"/>
+        <w:jc w:val="left"/>
+      </w:pPr>
+      <w:r>
+        <w:rPr>
+          <w:rFonts w:ascii="Consolas" w:cs="Consolas" w:eastAsia="Consolas" w:hAnsi="Consolas"/>
+          <w:color w:val="1A1A1A"/>
+          <w:sz w:val="18"/>
+          <w:szCs w:val="18"/>
+        </w:rPr>
+        <w:t xml:space="preserve">     -F "expediente_id=EXP00009"</w:t>
+      </w:r>
+    </w:p>
+    <w:p>
+      <w:pPr>
+        <w:shd w:fill="F2F2F2" w:val="clear"/>
+        <w:spacing w:after="0" w:before="0" w:line="276"/>
+        <w:ind w:left="360" w:right="360"/>
+        <w:jc w:val="left"/>
+      </w:pPr>
+      <w:r>
+        <w:rPr>
+          <w:rFonts w:ascii="Consolas" w:cs="Consolas" w:eastAsia="Consolas" w:hAnsi="Consolas"/>
+          <w:color w:val="1A1A1A"/>
+          <w:sz w:val="18"/>
+          <w:szCs w:val="18"/>
+        </w:rPr>
+        <w:t xml:space="preserve"> </w:t>
+      </w:r>
+    </w:p>
+    <w:p>
+      <w:pPr>
+        <w:shd w:fill="F2F2F2" w:val="clear"/>
+        <w:spacing w:after="0" w:before="0" w:line="276"/>
+        <w:ind w:left="360" w:right="360"/>
+        <w:jc w:val="left"/>
+      </w:pPr>
+      <w:r>
+        <w:rPr>
+          <w:rFonts w:ascii="Consolas" w:cs="Consolas" w:eastAsia="Consolas" w:hAnsi="Consolas"/>
+          <w:color w:val="1A1A1A"/>
+          <w:sz w:val="18"/>
+          <w:szCs w:val="18"/>
+        </w:rPr>
+        <w:t xml:space="preserve"># → HTTP 200: JSON con veredicto, confianza, reglas, campos OCR,</w:t>
+      </w:r>
+    </w:p>
+    <w:p>
+      <w:pPr>
+        <w:shd w:fill="F2F2F2" w:val="clear"/>
+        <w:spacing w:after="160" w:before="0" w:line="276"/>
+        <w:ind w:left="360" w:right="360"/>
+        <w:jc w:val="left"/>
+      </w:pPr>
+      <w:r>
+        <w:rPr>
+          <w:rFonts w:ascii="Consolas" w:cs="Consolas" w:eastAsia="Consolas" w:hAnsi="Consolas"/>
+          <w:color w:val="1A1A1A"/>
+          <w:sz w:val="18"/>
+          <w:szCs w:val="18"/>
+        </w:rPr>
+        <w:t xml:space="preserve">#   autenticidad y perfil de riesgo (véase el ejemplo del apartado 3.7)</w:t>
+      </w:r>
+    </w:p>
+    <w:p>
+      <w:pPr>
+        <w:spacing w:after="120" w:before="0" w:line="360" w:lineRule="auto"/>
+        <w:jc w:val="both"/>
+      </w:pPr>
+      <w:r>
+        <w:rPr>
+          <w:rFonts w:ascii="Calibri" w:cs="Calibri" w:eastAsia="Calibri" w:hAnsi="Calibri"/>
+          <w:color w:val="404040"/>
+          <w:sz w:val="22"/>
+          <w:szCs w:val="22"/>
+        </w:rPr>
+        <w:t xml:space="preserve">La documentación interactiva Swagger en http://localhost:8000/docs permite además probar todos los endpoints desde el navegador, con los esquemas de petición y respuesta autogenerados a partir de los modelos Pydantic. Los errores se devuelven con códigos HTTP semánticos y cuerpo estructurado: 422 si falta alguna imagen o el formato no es válido, 413 si el archivo supera los 20 MB y 500 con detalle si el pipeline falla internamente.</w:t>
+      </w:r>
+    </w:p>
+    <w:p>
+      <w:pPr>
+        <w:pStyle w:val="Heading3"/>
+        <w:spacing w:after="100" w:before="160"/>
+      </w:pPr>
+      <w:r>
+        <w:rPr>
+          <w:rFonts w:ascii="Calibri" w:cs="Calibri" w:eastAsia="Calibri" w:hAnsi="Calibri"/>
+          <w:b/>
+          <w:bCs/>
+          <w:color w:val="404040"/>
+          <w:sz w:val="28"/>
+          <w:szCs w:val="28"/>
+        </w:rPr>
+        <w:t xml:space="preserve">4.8.3. Uso programático (analista de datos)</w:t>
+      </w:r>
+    </w:p>
+    <w:p>
+      <w:pPr>
+        <w:spacing w:after="120" w:before="0" w:line="360" w:lineRule="auto"/>
+        <w:jc w:val="both"/>
+      </w:pPr>
+      <w:r>
+        <w:rPr>
+          <w:rFonts w:ascii="Calibri" w:cs="Calibri" w:eastAsia="Calibri" w:hAnsi="Calibri"/>
+          <w:color w:val="404040"/>
+          <w:sz w:val="22"/>
+          <w:szCs w:val="22"/>
+        </w:rPr>
+        <w:t xml:space="preserve">Para experimentación y análisis por lotes, el pipeline puede invocarse directamente desde Python sin levantar ningún servicio, tal y como ilustra el notebook 05_end_to_end_demo.ipynb:</w:t>
+      </w:r>
+    </w:p>
+    <w:p>
+      <w:pPr>
+        <w:shd w:fill="F2F2F2" w:val="clear"/>
+        <w:spacing w:after="0" w:before="0" w:line="276"/>
+        <w:ind w:left="360" w:right="360"/>
+        <w:jc w:val="left"/>
+      </w:pPr>
+      <w:r>
+        <w:rPr>
+          <w:rFonts w:ascii="Consolas" w:cs="Consolas" w:eastAsia="Consolas" w:hAnsi="Consolas"/>
+          <w:color w:val="1A1A1A"/>
+          <w:sz w:val="18"/>
+          <w:szCs w:val="18"/>
+        </w:rPr>
+        <w:t xml:space="preserve">from pathlib import Path</w:t>
+      </w:r>
+    </w:p>
+    <w:p>
+      <w:pPr>
+        <w:shd w:fill="F2F2F2" w:val="clear"/>
+        <w:spacing w:after="0" w:before="0" w:line="276"/>
+        <w:ind w:left="360" w:right="360"/>
+        <w:jc w:val="left"/>
+      </w:pPr>
+      <w:r>
+        <w:rPr>
+          <w:rFonts w:ascii="Consolas" w:cs="Consolas" w:eastAsia="Consolas" w:hAnsi="Consolas"/>
+          <w:color w:val="1A1A1A"/>
+          <w:sz w:val="18"/>
+          <w:szCs w:val="18"/>
+        </w:rPr>
+        <w:t xml:space="preserve">from PIL import Image</w:t>
+      </w:r>
+    </w:p>
+    <w:p>
+      <w:pPr>
+        <w:shd w:fill="F2F2F2" w:val="clear"/>
+        <w:spacing w:after="0" w:before="0" w:line="276"/>
+        <w:ind w:left="360" w:right="360"/>
+        <w:jc w:val="left"/>
+      </w:pPr>
+      <w:r>
+        <w:rPr>
+          <w:rFonts w:ascii="Consolas" w:cs="Consolas" w:eastAsia="Consolas" w:hAnsi="Consolas"/>
+          <w:color w:val="1A1A1A"/>
+          <w:sz w:val="18"/>
+          <w:szCs w:val="18"/>
+        </w:rPr>
+        <w:t xml:space="preserve">from src.pipeline.document_pipeline import DocumentPipeline</w:t>
+      </w:r>
+    </w:p>
+    <w:p>
+      <w:pPr>
+        <w:shd w:fill="F2F2F2" w:val="clear"/>
+        <w:spacing w:after="0" w:before="0" w:line="276"/>
+        <w:ind w:left="360" w:right="360"/>
+        <w:jc w:val="left"/>
+      </w:pPr>
+      <w:r>
+        <w:rPr>
+          <w:rFonts w:ascii="Consolas" w:cs="Consolas" w:eastAsia="Consolas" w:hAnsi="Consolas"/>
+          <w:color w:val="1A1A1A"/>
+          <w:sz w:val="18"/>
+          <w:szCs w:val="18"/>
+        </w:rPr>
+        <w:t xml:space="preserve"> </w:t>
+      </w:r>
+    </w:p>
+    <w:p>
+      <w:pPr>
+        <w:shd w:fill="F2F2F2" w:val="clear"/>
+        <w:spacing w:after="0" w:before="0" w:line="276"/>
+        <w:ind w:left="360" w:right="360"/>
+        <w:jc w:val="left"/>
+      </w:pPr>
+      <w:r>
+        <w:rPr>
+          <w:rFonts w:ascii="Consolas" w:cs="Consolas" w:eastAsia="Consolas" w:hAnsi="Consolas"/>
+          <w:color w:val="1A1A1A"/>
+          <w:sz w:val="18"/>
+          <w:szCs w:val="18"/>
+        </w:rPr>
+        <w:t xml:space="preserve">pipeline = DocumentPipeline()</w:t>
+      </w:r>
+    </w:p>
+    <w:p>
+      <w:pPr>
+        <w:shd w:fill="F2F2F2" w:val="clear"/>
+        <w:spacing w:after="0" w:before="0" w:line="276"/>
+        <w:ind w:left="360" w:right="360"/>
+        <w:jc w:val="left"/>
+      </w:pPr>
+      <w:r>
+        <w:rPr>
+          <w:rFonts w:ascii="Consolas" w:cs="Consolas" w:eastAsia="Consolas" w:hAnsi="Consolas"/>
+          <w:color w:val="1A1A1A"/>
+          <w:sz w:val="18"/>
+          <w:szCs w:val="18"/>
+        </w:rPr>
+        <w:t xml:space="preserve">resultado = pipeline.verificar(</w:t>
+      </w:r>
+    </w:p>
+    <w:p>
+      <w:pPr>
+        <w:shd w:fill="F2F2F2" w:val="clear"/>
+        <w:spacing w:after="0" w:before="0" w:line="276"/>
+        <w:ind w:left="360" w:right="360"/>
+        <w:jc w:val="left"/>
+      </w:pPr>
+      <w:r>
+        <w:rPr>
+          <w:rFonts w:ascii="Consolas" w:cs="Consolas" w:eastAsia="Consolas" w:hAnsi="Consolas"/>
+          <w:color w:val="1A1A1A"/>
+          <w:sz w:val="18"/>
+          <w:szCs w:val="18"/>
+        </w:rPr>
+        <w:t xml:space="preserve">    imagen_dni=Image.open("data/test/dni/EXP00009_dni.png"),</w:t>
+      </w:r>
+    </w:p>
+    <w:p>
+      <w:pPr>
+        <w:shd w:fill="F2F2F2" w:val="clear"/>
+        <w:spacing w:after="0" w:before="0" w:line="276"/>
+        <w:ind w:left="360" w:right="360"/>
+        <w:jc w:val="left"/>
+      </w:pPr>
+      <w:r>
+        <w:rPr>
+          <w:rFonts w:ascii="Consolas" w:cs="Consolas" w:eastAsia="Consolas" w:hAnsi="Consolas"/>
+          <w:color w:val="1A1A1A"/>
+          <w:sz w:val="18"/>
+          <w:szCs w:val="18"/>
+        </w:rPr>
+        <w:t xml:space="preserve">    imagen_form=Image.open("data/test/loan/EXP00009_loan.png"),</w:t>
+      </w:r>
+    </w:p>
+    <w:p>
+      <w:pPr>
+        <w:shd w:fill="F2F2F2" w:val="clear"/>
+        <w:spacing w:after="0" w:before="0" w:line="276"/>
+        <w:ind w:left="360" w:right="360"/>
+        <w:jc w:val="left"/>
+      </w:pPr>
+      <w:r>
+        <w:rPr>
+          <w:rFonts w:ascii="Consolas" w:cs="Consolas" w:eastAsia="Consolas" w:hAnsi="Consolas"/>
+          <w:color w:val="1A1A1A"/>
+          <w:sz w:val="18"/>
+          <w:szCs w:val="18"/>
+        </w:rPr>
+        <w:t xml:space="preserve">    expediente_id="EXP00009",</w:t>
+      </w:r>
+    </w:p>
+    <w:p>
+      <w:pPr>
+        <w:shd w:fill="F2F2F2" w:val="clear"/>
+        <w:spacing w:after="0" w:before="0" w:line="276"/>
+        <w:ind w:left="360" w:right="360"/>
+        <w:jc w:val="left"/>
+      </w:pPr>
+      <w:r>
+        <w:rPr>
+          <w:rFonts w:ascii="Consolas" w:cs="Consolas" w:eastAsia="Consolas" w:hAnsi="Consolas"/>
+          <w:color w:val="1A1A1A"/>
+          <w:sz w:val="18"/>
+          <w:szCs w:val="18"/>
+        </w:rPr>
+        <w:t xml:space="preserve">)</w:t>
+      </w:r>
+    </w:p>
+    <w:p>
+      <w:pPr>
+        <w:shd w:fill="F2F2F2" w:val="clear"/>
+        <w:spacing w:after="0" w:before="0" w:line="276"/>
+        <w:ind w:left="360" w:right="360"/>
+        <w:jc w:val="left"/>
+      </w:pPr>
+      <w:r>
+        <w:rPr>
+          <w:rFonts w:ascii="Consolas" w:cs="Consolas" w:eastAsia="Consolas" w:hAnsi="Consolas"/>
+          <w:color w:val="1A1A1A"/>
+          <w:sz w:val="18"/>
+          <w:szCs w:val="18"/>
+        </w:rPr>
+        <w:t xml:space="preserve">print(resultado.resultado, f"{resultado.confianza:.1%}")</w:t>
+      </w:r>
+    </w:p>
+    <w:p>
+      <w:pPr>
+        <w:shd w:fill="F2F2F2" w:val="clear"/>
+        <w:spacing w:after="160" w:before="0" w:line="276"/>
+        <w:ind w:left="360" w:right="360"/>
+        <w:jc w:val="left"/>
+      </w:pPr>
+      <w:r>
+        <w:rPr>
+          <w:rFonts w:ascii="Consolas" w:cs="Consolas" w:eastAsia="Consolas" w:hAnsi="Consolas"/>
+          <w:color w:val="1A1A1A"/>
+          <w:sz w:val="18"/>
+          <w:szCs w:val="18"/>
+        </w:rPr>
+        <w:t xml:space="preserve"># APTO PARA TRAMITE 96.1%</w:t>
+      </w:r>
+    </w:p>
+    <w:p>
+      <w:pPr>
+        <w:spacing w:after="120" w:before="0" w:line="360" w:lineRule="auto"/>
+        <w:jc w:val="both"/>
+      </w:pPr>
+      <w:r>
+        <w:rPr>
+          <w:rFonts w:ascii="Calibri" w:cs="Calibri" w:eastAsia="Calibri" w:hAnsi="Calibri"/>
+          <w:color w:val="404040"/>
+          <w:sz w:val="22"/>
+          <w:szCs w:val="22"/>
+        </w:rPr>
+        <w:t xml:space="preserve">Esta vía es la utilizada por la propia evaluación end-to-end del apartado 4.6: un bucle sobre los 50 expedientes de test que invoca el pipeline, recoge los veredictos y los compara con las etiquetas reales para calcular las métricas agregadas.</w:t>
+      </w:r>
+    </w:p>
+    <w:p>
+      <w:pPr>
         <w:pStyle w:val="Heading1"/>
         <w:pageBreakBefore/>
         <w:spacing w:after="180" w:before="240"/>
@@ -9584,6 +10252,35 @@
           <w:szCs w:val="22"/>
         </w:rPr>
         <w:t xml:space="preserve">La arquitectura de microservicios con Docker Compose (API REST FastAPI + frontend Streamlit), respaldada por 77 tests automatizados, garantiza un despliegue reproducible con un único comando en cualquier entorno con Docker.</w:t>
+      </w:r>
+    </w:p>
+    <w:p>
+      <w:pPr>
+        <w:spacing w:after="120" w:before="0"/>
+      </w:pPr>
+      <w:r>
+        <w:rPr>
+          <w:rFonts w:ascii="Calibri" w:cs="Calibri" w:eastAsia="Calibri" w:hAnsi="Calibri"/>
+          <w:color w:val="404040"/>
+          <w:sz w:val="22"/>
+          <w:szCs w:val="22"/>
+        </w:rPr>
+        <w:t xml:space="preserve"/>
+      </w:r>
+    </w:p>
+    <w:p>
+      <w:pPr>
+        <w:spacing w:after="120" w:before="0" w:line="360" w:lineRule="auto"/>
+        <w:jc w:val="both"/>
+      </w:pPr>
+      <w:r>
+        <w:rPr>
+          <w:rFonts w:ascii="Calibri" w:cs="Calibri" w:eastAsia="Calibri" w:hAnsi="Calibri"/>
+          <w:color w:val="404040"/>
+          <w:sz w:val="22"/>
+          <w:szCs w:val="22"/>
+        </w:rPr>
+        <w:t xml:space="preserve">Más allá de las métricas, el desarrollo dejó dos lecciones de ingeniería aplicada. La primera es que en un sistema encadenado la calidad global la fija el eslabón más débil, no el más fuerte: de poco sirve un detector con mAP del 99,5% si el OCR transcribe mal un importe; por eso el esfuerzo de mejora más rentable del proyecto no fue afinar los modelos, sino construir el postprocesador de texto y los mecanismos de reserva de lectura. La segunda es el valor de las validaciones aritméticas gratuitas: la letra del NIF, los dígitos de control de la MRZ y la fórmula de la cuota francesa aportan detección de errores con coste computacional despreciable y sin necesidad de entrenamiento, y actúan como red de seguridad independiente de los modelos neuronales.</w:t>
       </w:r>
     </w:p>
     <w:p>

</xml_diff>

<commit_message>
docs: informe final con enlaces de entrega, tutor y presentación PowerPoint
Co-Authored-By: Claude Fable 5 <noreply@anthropic.com>
</commit_message>
<xml_diff>
--- a/informes/TFM_Raul_Hernando_Viadero.docx
+++ b/informes/TFM_Raul_Hernando_Viadero.docx
@@ -143,7 +143,7 @@
           <w:sz w:val="32"/>
           <w:szCs w:val="32"/>
         </w:rPr>
-        <w:t xml:space="preserve">Tutor/a de TFM: [Nombre del tutor/a]</w:t>
+        <w:t xml:space="preserve">Tutor/a de TFM: Juan Manuel Moreno Lamparero</w:t>
       </w:r>
     </w:p>
     <w:p>
@@ -11002,22 +11002,113 @@
           <w:sz w:val="32"/>
           <w:szCs w:val="32"/>
         </w:rPr>
-        <w:t xml:space="preserve">Anexo A. Estructura del repositorio</w:t>
-      </w:r>
-    </w:p>
-    <w:p>
-      <w:pPr>
-        <w:spacing w:after="120" w:before="0" w:line="360" w:lineRule="auto"/>
-        <w:jc w:val="both"/>
-      </w:pPr>
-      <w:r>
-        <w:rPr>
-          <w:rFonts w:ascii="Calibri" w:cs="Calibri" w:eastAsia="Calibri" w:hAnsi="Calibri"/>
-          <w:color w:val="404040"/>
-          <w:sz w:val="22"/>
-          <w:szCs w:val="22"/>
-        </w:rPr>
-        <w:t xml:space="preserve">Código fuente disponible en: https://github.com/RaulHernandoViadero/validacion_prestamos.</w:t>
+        <w:t xml:space="preserve">Anexo A. Material entregado y estructura del repositorio</w:t>
+      </w:r>
+    </w:p>
+    <w:p>
+      <w:pPr>
+        <w:spacing w:after="120" w:before="0" w:line="360" w:lineRule="auto"/>
+        <w:jc w:val="both"/>
+      </w:pPr>
+      <w:r>
+        <w:rPr>
+          <w:rFonts w:ascii="Calibri" w:cs="Calibri" w:eastAsia="Calibri" w:hAnsi="Calibri"/>
+          <w:color w:val="404040"/>
+          <w:sz w:val="22"/>
+          <w:szCs w:val="22"/>
+        </w:rPr>
+        <w:t xml:space="preserve">Todo el material del proyecto está disponible públicamente en las dos ubicaciones siguientes:</w:t>
+      </w:r>
+    </w:p>
+    <w:p>
+      <w:pPr>
+        <w:pStyle w:val="ListParagraph"/>
+        <w:numPr>
+          <w:ilvl w:val="0"/>
+          <w:numId w:val="2"/>
+        </w:numPr>
+        <w:spacing w:after="120" w:before="0" w:line="360" w:lineRule="auto"/>
+        <w:jc w:val="both"/>
+      </w:pPr>
+      <w:r>
+        <w:rPr>
+          <w:rFonts w:ascii="Calibri" w:cs="Calibri" w:eastAsia="Calibri" w:hAnsi="Calibri"/>
+          <w:b/>
+          <w:bCs/>
+          <w:color w:val="404040"/>
+          <w:sz w:val="22"/>
+          <w:szCs w:val="22"/>
+        </w:rPr>
+        <w:t xml:space="preserve">Repositorio de código (GitHub, rama main): </w:t>
+      </w:r>
+      <w:r>
+        <w:rPr>
+          <w:rFonts w:ascii="Calibri" w:cs="Calibri" w:eastAsia="Calibri" w:hAnsi="Calibri"/>
+          <w:color w:val="404040"/>
+          <w:sz w:val="22"/>
+          <w:szCs w:val="22"/>
+        </w:rPr>
+        <w:t xml:space="preserve">https://github.com/RaulHernandoViadero/validacion_prestamos — contiene el código fuente completo, los tests, los notebooks y la configuración Docker. La rama main recoge la versión funcional y más reciente del sistema.</w:t>
+      </w:r>
+    </w:p>
+    <w:p>
+      <w:pPr>
+        <w:pStyle w:val="ListParagraph"/>
+        <w:numPr>
+          <w:ilvl w:val="0"/>
+          <w:numId w:val="2"/>
+        </w:numPr>
+        <w:spacing w:after="120" w:before="0" w:line="360" w:lineRule="auto"/>
+        <w:jc w:val="both"/>
+      </w:pPr>
+      <w:r>
+        <w:rPr>
+          <w:rFonts w:ascii="Calibri" w:cs="Calibri" w:eastAsia="Calibri" w:hAnsi="Calibri"/>
+          <w:b/>
+          <w:bCs/>
+          <w:color w:val="404040"/>
+          <w:sz w:val="22"/>
+          <w:szCs w:val="22"/>
+        </w:rPr>
+        <w:t xml:space="preserve">Carpeta de entregables (Google Drive): </w:t>
+      </w:r>
+      <w:r>
+        <w:rPr>
+          <w:rFonts w:ascii="Calibri" w:cs="Calibri" w:eastAsia="Calibri" w:hAnsi="Calibri"/>
+          <w:color w:val="404040"/>
+          <w:sz w:val="22"/>
+          <w:szCs w:val="22"/>
+        </w:rPr>
+        <w:t xml:space="preserve">https://drive.google.com/drive/folders/12o5FB6JG_kleyK3k2oIzZ6uFLf3RWBm6 — contiene esta memoria en Word, los pesos entrenados de los tres modelos (necesarios para ejecutar el sistema sin reentrenar), las imágenes sintéticas de prueba, los cinco notebooks y la presentación del proyecto.</w:t>
+      </w:r>
+    </w:p>
+    <w:p>
+      <w:pPr>
+        <w:spacing w:after="120" w:before="0"/>
+      </w:pPr>
+      <w:r>
+        <w:rPr>
+          <w:rFonts w:ascii="Calibri" w:cs="Calibri" w:eastAsia="Calibri" w:hAnsi="Calibri"/>
+          <w:color w:val="404040"/>
+          <w:sz w:val="22"/>
+          <w:szCs w:val="22"/>
+        </w:rPr>
+        <w:t xml:space="preserve"/>
+      </w:r>
+    </w:p>
+    <w:p>
+      <w:pPr>
+        <w:spacing w:after="120" w:before="0" w:line="360" w:lineRule="auto"/>
+        <w:jc w:val="both"/>
+      </w:pPr>
+      <w:r>
+        <w:rPr>
+          <w:rFonts w:ascii="Calibri" w:cs="Calibri" w:eastAsia="Calibri" w:hAnsi="Calibri"/>
+          <w:color w:val="404040"/>
+          <w:sz w:val="22"/>
+          <w:szCs w:val="22"/>
+        </w:rPr>
+        <w:t xml:space="preserve">La estructura de módulos del repositorio es la siguiente:</w:t>
       </w:r>
     </w:p>
     <w:p>
@@ -12650,7 +12741,7 @@
           <w:sz w:val="22"/>
           <w:szCs w:val="22"/>
         </w:rPr>
-        <w:t xml:space="preserve">Copiar los pesos entrenados (yolo_dni.pt, yolo_loan.pt y el clasificador de autenticidad) a la carpeta weights/ si no están incluidos.</w:t>
+        <w:t xml:space="preserve">Copiar los pesos entrenados (yolo_dni.pt, yolo_loan.pt y el clasificador de autenticidad) a la carpeta weights/. Los pesos están disponibles en la carpeta 03_Modelos_Entrenados de la unidad de Google Drive indicada en el Anexo A.</w:t>
       </w:r>
     </w:p>
     <w:p>

</xml_diff>